<commit_message>
finish task 1 answers
</commit_message>
<xml_diff>
--- a/churaa1_checkpoint1_s22026.docx
+++ b/churaa1_checkpoint1_s22026.docx
@@ -32,6 +32,19 @@
         <w:rPr>
           <w:rFonts w:ascii="Arial" w:hAnsi="Arial" w:cs="Arial"/>
         </w:rPr>
+        <w:t>Task 1:</w:t>
+      </w:r>
+    </w:p>
+    <w:p>
+      <w:pPr>
+        <w:rPr>
+          <w:rFonts w:ascii="Arial" w:hAnsi="Arial" w:cs="Arial"/>
+        </w:rPr>
+      </w:pPr>
+      <w:r>
+        <w:rPr>
+          <w:rFonts w:ascii="Arial" w:hAnsi="Arial" w:cs="Arial"/>
+        </w:rPr>
         <w:t>VM public IP address:</w:t>
       </w:r>
     </w:p>
@@ -44,6 +57,7 @@
       <w:r>
         <w:rPr>
           <w:rFonts w:ascii="Arial" w:hAnsi="Arial" w:cs="Arial"/>
+          <w:noProof/>
         </w:rPr>
         <w:drawing>
           <wp:inline distT="0" distB="0" distL="0" distR="0" wp14:anchorId="5BB05503" wp14:editId="16BA34D3">
@@ -81,6 +95,308 @@
           </wp:inline>
         </w:drawing>
       </w:r>
+    </w:p>
+    <w:p>
+      <w:pPr>
+        <w:rPr>
+          <w:rFonts w:ascii="Arial" w:hAnsi="Arial" w:cs="Arial"/>
+        </w:rPr>
+      </w:pPr>
+      <w:r>
+        <w:rPr>
+          <w:rFonts w:ascii="Arial" w:hAnsi="Arial" w:cs="Arial"/>
+        </w:rPr>
+        <w:t>Putty Login:</w:t>
+      </w:r>
+    </w:p>
+    <w:p>
+      <w:pPr>
+        <w:rPr>
+          <w:rFonts w:ascii="Arial" w:hAnsi="Arial" w:cs="Arial"/>
+        </w:rPr>
+      </w:pPr>
+      <w:r>
+        <w:rPr>
+          <w:rFonts w:ascii="Arial" w:hAnsi="Arial" w:cs="Arial"/>
+        </w:rPr>
+        <w:drawing>
+          <wp:inline distT="0" distB="0" distL="0" distR="0" wp14:anchorId="07FC6A64" wp14:editId="798A224A">
+            <wp:extent cx="5239481" cy="3124636"/>
+            <wp:effectExtent l="0" t="0" r="0" b="0"/>
+            <wp:docPr id="1256616915" name="Picture 1"/>
+            <wp:cNvGraphicFramePr>
+              <a:graphicFrameLocks xmlns:a="http://schemas.openxmlformats.org/drawingml/2006/main" noChangeAspect="1"/>
+            </wp:cNvGraphicFramePr>
+            <a:graphic xmlns:a="http://schemas.openxmlformats.org/drawingml/2006/main">
+              <a:graphicData uri="http://schemas.openxmlformats.org/drawingml/2006/picture">
+                <pic:pic xmlns:pic="http://schemas.openxmlformats.org/drawingml/2006/picture">
+                  <pic:nvPicPr>
+                    <pic:cNvPr id="1256616915" name=""/>
+                    <pic:cNvPicPr/>
+                  </pic:nvPicPr>
+                  <pic:blipFill>
+                    <a:blip r:embed="rId5"/>
+                    <a:stretch>
+                      <a:fillRect/>
+                    </a:stretch>
+                  </pic:blipFill>
+                  <pic:spPr>
+                    <a:xfrm>
+                      <a:off x="0" y="0"/>
+                      <a:ext cx="5239481" cy="3124636"/>
+                    </a:xfrm>
+                    <a:prstGeom prst="rect">
+                      <a:avLst/>
+                    </a:prstGeom>
+                  </pic:spPr>
+                </pic:pic>
+              </a:graphicData>
+            </a:graphic>
+          </wp:inline>
+        </w:drawing>
+      </w:r>
+    </w:p>
+    <w:p>
+      <w:pPr>
+        <w:rPr>
+          <w:rFonts w:ascii="Arial" w:hAnsi="Arial" w:cs="Arial"/>
+        </w:rPr>
+      </w:pPr>
+      <w:r>
+        <w:rPr>
+          <w:rFonts w:ascii="Arial" w:hAnsi="Arial" w:cs="Arial"/>
+        </w:rPr>
+        <w:t>Change Password:</w:t>
+      </w:r>
+    </w:p>
+    <w:p>
+      <w:pPr>
+        <w:rPr>
+          <w:rFonts w:ascii="Arial" w:hAnsi="Arial" w:cs="Arial"/>
+        </w:rPr>
+      </w:pPr>
+      <w:r>
+        <w:rPr>
+          <w:rFonts w:ascii="Arial" w:hAnsi="Arial" w:cs="Arial"/>
+        </w:rPr>
+        <w:drawing>
+          <wp:inline distT="0" distB="0" distL="0" distR="0" wp14:anchorId="3AF2DE87" wp14:editId="42C292E0">
+            <wp:extent cx="5731510" cy="1088390"/>
+            <wp:effectExtent l="0" t="0" r="2540" b="0"/>
+            <wp:docPr id="1153288516" name="Picture 1"/>
+            <wp:cNvGraphicFramePr>
+              <a:graphicFrameLocks xmlns:a="http://schemas.openxmlformats.org/drawingml/2006/main" noChangeAspect="1"/>
+            </wp:cNvGraphicFramePr>
+            <a:graphic xmlns:a="http://schemas.openxmlformats.org/drawingml/2006/main">
+              <a:graphicData uri="http://schemas.openxmlformats.org/drawingml/2006/picture">
+                <pic:pic xmlns:pic="http://schemas.openxmlformats.org/drawingml/2006/picture">
+                  <pic:nvPicPr>
+                    <pic:cNvPr id="1153288516" name=""/>
+                    <pic:cNvPicPr/>
+                  </pic:nvPicPr>
+                  <pic:blipFill>
+                    <a:blip r:embed="rId6"/>
+                    <a:stretch>
+                      <a:fillRect/>
+                    </a:stretch>
+                  </pic:blipFill>
+                  <pic:spPr>
+                    <a:xfrm>
+                      <a:off x="0" y="0"/>
+                      <a:ext cx="5731510" cy="1088390"/>
+                    </a:xfrm>
+                    <a:prstGeom prst="rect">
+                      <a:avLst/>
+                    </a:prstGeom>
+                  </pic:spPr>
+                </pic:pic>
+              </a:graphicData>
+            </a:graphic>
+          </wp:inline>
+        </w:drawing>
+      </w:r>
+    </w:p>
+    <w:p>
+      <w:pPr>
+        <w:rPr>
+          <w:rFonts w:ascii="Arial" w:hAnsi="Arial" w:cs="Arial"/>
+        </w:rPr>
+      </w:pPr>
+      <w:r>
+        <w:rPr>
+          <w:rFonts w:ascii="Arial" w:hAnsi="Arial" w:cs="Arial"/>
+        </w:rPr>
+        <w:t>System information:</w:t>
+      </w:r>
+    </w:p>
+    <w:p>
+      <w:pPr>
+        <w:rPr>
+          <w:rFonts w:ascii="Arial" w:hAnsi="Arial" w:cs="Arial"/>
+        </w:rPr>
+      </w:pPr>
+      <w:r>
+        <w:rPr>
+          <w:rFonts w:ascii="Arial" w:hAnsi="Arial" w:cs="Arial"/>
+        </w:rPr>
+        <w:lastRenderedPageBreak/>
+        <w:drawing>
+          <wp:inline distT="0" distB="0" distL="0" distR="0" wp14:anchorId="3E2F875B" wp14:editId="733C67D7">
+            <wp:extent cx="5731510" cy="1428115"/>
+            <wp:effectExtent l="0" t="0" r="2540" b="635"/>
+            <wp:docPr id="250298563" name="Picture 1"/>
+            <wp:cNvGraphicFramePr>
+              <a:graphicFrameLocks xmlns:a="http://schemas.openxmlformats.org/drawingml/2006/main" noChangeAspect="1"/>
+            </wp:cNvGraphicFramePr>
+            <a:graphic xmlns:a="http://schemas.openxmlformats.org/drawingml/2006/main">
+              <a:graphicData uri="http://schemas.openxmlformats.org/drawingml/2006/picture">
+                <pic:pic xmlns:pic="http://schemas.openxmlformats.org/drawingml/2006/picture">
+                  <pic:nvPicPr>
+                    <pic:cNvPr id="250298563" name=""/>
+                    <pic:cNvPicPr/>
+                  </pic:nvPicPr>
+                  <pic:blipFill>
+                    <a:blip r:embed="rId7"/>
+                    <a:stretch>
+                      <a:fillRect/>
+                    </a:stretch>
+                  </pic:blipFill>
+                  <pic:spPr>
+                    <a:xfrm>
+                      <a:off x="0" y="0"/>
+                      <a:ext cx="5731510" cy="1428115"/>
+                    </a:xfrm>
+                    <a:prstGeom prst="rect">
+                      <a:avLst/>
+                    </a:prstGeom>
+                  </pic:spPr>
+                </pic:pic>
+              </a:graphicData>
+            </a:graphic>
+          </wp:inline>
+        </w:drawing>
+      </w:r>
+    </w:p>
+    <w:p>
+      <w:pPr>
+        <w:rPr>
+          <w:rFonts w:ascii="Arial" w:hAnsi="Arial" w:cs="Arial"/>
+        </w:rPr>
+      </w:pPr>
+      <w:r>
+        <w:rPr>
+          <w:rFonts w:ascii="Arial" w:hAnsi="Arial" w:cs="Arial"/>
+        </w:rPr>
+        <w:t>Successful git clone:</w:t>
+      </w:r>
+    </w:p>
+    <w:p>
+      <w:pPr>
+        <w:rPr>
+          <w:rFonts w:ascii="Arial" w:hAnsi="Arial" w:cs="Arial"/>
+        </w:rPr>
+      </w:pPr>
+      <w:r>
+        <w:rPr>
+          <w:rFonts w:ascii="Arial" w:hAnsi="Arial" w:cs="Arial"/>
+        </w:rPr>
+        <w:drawing>
+          <wp:inline distT="0" distB="0" distL="0" distR="0" wp14:anchorId="31882382" wp14:editId="5747C749">
+            <wp:extent cx="5731510" cy="1407160"/>
+            <wp:effectExtent l="0" t="0" r="2540" b="2540"/>
+            <wp:docPr id="179339500" name="Picture 1"/>
+            <wp:cNvGraphicFramePr>
+              <a:graphicFrameLocks xmlns:a="http://schemas.openxmlformats.org/drawingml/2006/main" noChangeAspect="1"/>
+            </wp:cNvGraphicFramePr>
+            <a:graphic xmlns:a="http://schemas.openxmlformats.org/drawingml/2006/main">
+              <a:graphicData uri="http://schemas.openxmlformats.org/drawingml/2006/picture">
+                <pic:pic xmlns:pic="http://schemas.openxmlformats.org/drawingml/2006/picture">
+                  <pic:nvPicPr>
+                    <pic:cNvPr id="179339500" name=""/>
+                    <pic:cNvPicPr/>
+                  </pic:nvPicPr>
+                  <pic:blipFill>
+                    <a:blip r:embed="rId8"/>
+                    <a:stretch>
+                      <a:fillRect/>
+                    </a:stretch>
+                  </pic:blipFill>
+                  <pic:spPr>
+                    <a:xfrm>
+                      <a:off x="0" y="0"/>
+                      <a:ext cx="5731510" cy="1407160"/>
+                    </a:xfrm>
+                    <a:prstGeom prst="rect">
+                      <a:avLst/>
+                    </a:prstGeom>
+                  </pic:spPr>
+                </pic:pic>
+              </a:graphicData>
+            </a:graphic>
+          </wp:inline>
+        </w:drawing>
+      </w:r>
+    </w:p>
+    <w:p>
+      <w:pPr>
+        <w:rPr>
+          <w:rFonts w:ascii="Arial" w:hAnsi="Arial" w:cs="Arial"/>
+        </w:rPr>
+      </w:pPr>
+      <w:r>
+        <w:rPr>
+          <w:rFonts w:ascii="Arial" w:hAnsi="Arial" w:cs="Arial"/>
+        </w:rPr>
+        <w:t>The password was changed**</w:t>
+      </w:r>
+    </w:p>
+    <w:p>
+      <w:pPr>
+        <w:rPr>
+          <w:rFonts w:ascii="Arial" w:hAnsi="Arial" w:cs="Arial"/>
+        </w:rPr>
+      </w:pPr>
+    </w:p>
+    <w:p>
+      <w:pPr>
+        <w:rPr>
+          <w:rFonts w:ascii="Arial" w:hAnsi="Arial" w:cs="Arial"/>
+        </w:rPr>
+      </w:pPr>
+      <w:r>
+        <w:rPr>
+          <w:rFonts w:ascii="Arial" w:hAnsi="Arial" w:cs="Arial"/>
+        </w:rPr>
+        <w:t>Task 2:</w:t>
+      </w:r>
+    </w:p>
+    <w:p>
+      <w:pPr>
+        <w:rPr>
+          <w:rFonts w:ascii="Arial" w:hAnsi="Arial" w:cs="Arial"/>
+        </w:rPr>
+      </w:pPr>
+    </w:p>
+    <w:p>
+      <w:pPr>
+        <w:rPr>
+          <w:rFonts w:ascii="Arial" w:hAnsi="Arial" w:cs="Arial"/>
+        </w:rPr>
+      </w:pPr>
+    </w:p>
+    <w:p>
+      <w:pPr>
+        <w:rPr>
+          <w:rFonts w:ascii="Arial" w:hAnsi="Arial" w:cs="Arial"/>
+        </w:rPr>
+      </w:pPr>
+    </w:p>
+    <w:p>
+      <w:pPr>
+        <w:rPr>
+          <w:rFonts w:ascii="Arial" w:hAnsi="Arial" w:cs="Arial"/>
+        </w:rPr>
+      </w:pPr>
     </w:p>
     <w:sectPr>
       <w:pgSz w:w="11906" w:h="16838"/>

</xml_diff>

<commit_message>
add script and csv
</commit_message>
<xml_diff>
--- a/churaa1_checkpoint1_s22026.docx
+++ b/churaa1_checkpoint1_s22026.docx
@@ -214,6 +214,20 @@
             </a:graphic>
           </wp:inline>
         </w:drawing>
+      </w:r>
+    </w:p>
+    <w:p>
+      <w:pPr>
+        <w:ind w:firstLine="720"/>
+        <w:rPr>
+          <w:rFonts w:ascii="Arial" w:hAnsi="Arial" w:cs="Arial"/>
+        </w:rPr>
+      </w:pPr>
+      <w:r>
+        <w:rPr>
+          <w:rFonts w:ascii="Arial" w:hAnsi="Arial" w:cs="Arial"/>
+        </w:rPr>
+        <w:t>The password has been changed**</w:t>
       </w:r>
     </w:p>
     <w:p>
@@ -301,10 +315,10 @@
           <w:rFonts w:ascii="Arial" w:hAnsi="Arial" w:cs="Arial"/>
         </w:rPr>
         <w:drawing>
-          <wp:inline distT="0" distB="0" distL="0" distR="0" wp14:anchorId="31882382" wp14:editId="5747C749">
-            <wp:extent cx="5731510" cy="1407160"/>
-            <wp:effectExtent l="0" t="0" r="2540" b="2540"/>
-            <wp:docPr id="179339500" name="Picture 1"/>
+          <wp:inline distT="0" distB="0" distL="0" distR="0" wp14:anchorId="140A823F" wp14:editId="0CD1F9A9">
+            <wp:extent cx="5731510" cy="1852930"/>
+            <wp:effectExtent l="0" t="0" r="2540" b="0"/>
+            <wp:docPr id="1120461524" name="Picture 1"/>
             <wp:cNvGraphicFramePr>
               <a:graphicFrameLocks xmlns:a="http://schemas.openxmlformats.org/drawingml/2006/main" noChangeAspect="1"/>
             </wp:cNvGraphicFramePr>
@@ -312,7 +326,7 @@
               <a:graphicData uri="http://schemas.openxmlformats.org/drawingml/2006/picture">
                 <pic:pic xmlns:pic="http://schemas.openxmlformats.org/drawingml/2006/picture">
                   <pic:nvPicPr>
-                    <pic:cNvPr id="179339500" name=""/>
+                    <pic:cNvPr id="1120461524" name=""/>
                     <pic:cNvPicPr/>
                   </pic:nvPicPr>
                   <pic:blipFill>
@@ -324,7 +338,7 @@
                   <pic:spPr>
                     <a:xfrm>
                       <a:off x="0" y="0"/>
-                      <a:ext cx="5731510" cy="1407160"/>
+                      <a:ext cx="5731510" cy="1852930"/>
                     </a:xfrm>
                     <a:prstGeom prst="rect">
                       <a:avLst/>
@@ -335,19 +349,6 @@
             </a:graphic>
           </wp:inline>
         </w:drawing>
-      </w:r>
-    </w:p>
-    <w:p>
-      <w:pPr>
-        <w:rPr>
-          <w:rFonts w:ascii="Arial" w:hAnsi="Arial" w:cs="Arial"/>
-        </w:rPr>
-      </w:pPr>
-      <w:r>
-        <w:rPr>
-          <w:rFonts w:ascii="Arial" w:hAnsi="Arial" w:cs="Arial"/>
-        </w:rPr>
-        <w:t>The password was changed**</w:t>
       </w:r>
     </w:p>
     <w:p>

</xml_diff>

<commit_message>
add checkpoint progress to doc
</commit_message>
<xml_diff>
--- a/churaa1_checkpoint1_s22026.docx
+++ b/churaa1_checkpoint1_s22026.docx
@@ -17,21 +17,6 @@
         </w:rPr>
         <w:t xml:space="preserve">CHURAA1 Checkpoint 1 – Operating System Concepts</w:t>
       </w:r>
-      <w:r>
-        <w:rPr>
-          <w:rFonts w:ascii="Arial" w:hAnsi="Arial" w:cs="Arial"/>
-        </w:rPr>
-      </w:r>
-    </w:p>
-    <w:p>
-      <w:pPr>
-        <w:pBdr/>
-        <w:spacing/>
-        <w:ind/>
-        <w:rPr>
-          <w:rFonts w:ascii="Arial" w:hAnsi="Arial" w:cs="Arial"/>
-        </w:rPr>
-      </w:pPr>
       <w:r>
         <w:rPr>
           <w:rFonts w:ascii="Arial" w:hAnsi="Arial" w:cs="Arial"/>
@@ -56,7 +41,11 @@
         <w:rPr>
           <w:rFonts w:ascii="Arial" w:hAnsi="Arial" w:cs="Arial"/>
         </w:rPr>
-        <w:t xml:space="preserve">Task 1:</w:t>
+      </w:r>
+      <w:r>
+        <w:rPr>
+          <w:rFonts w:ascii="Arial" w:hAnsi="Arial" w:cs="Arial"/>
+        </w:rPr>
       </w:r>
       <w:r>
         <w:rPr>
@@ -77,7 +66,38 @@
         <w:rPr>
           <w:rFonts w:ascii="Arial" w:hAnsi="Arial" w:cs="Arial"/>
         </w:rPr>
+        <w:t xml:space="preserve">Task 1:</w:t>
+      </w:r>
+      <w:r>
+        <w:rPr>
+          <w:rFonts w:ascii="Arial" w:hAnsi="Arial" w:cs="Arial"/>
+        </w:rPr>
+      </w:r>
+      <w:r>
+        <w:rPr>
+          <w:rFonts w:ascii="Arial" w:hAnsi="Arial" w:cs="Arial"/>
+        </w:rPr>
+      </w:r>
+    </w:p>
+    <w:p>
+      <w:pPr>
+        <w:pBdr/>
+        <w:spacing/>
+        <w:ind/>
+        <w:rPr>
+          <w:rFonts w:ascii="Arial" w:hAnsi="Arial" w:cs="Arial"/>
+        </w:rPr>
+      </w:pPr>
+      <w:r>
+        <w:rPr>
+          <w:rFonts w:ascii="Arial" w:hAnsi="Arial" w:cs="Arial"/>
+        </w:rPr>
         <w:t xml:space="preserve">VM public IP address:</w:t>
+      </w:r>
+      <w:r>
+        <w:rPr>
+          <w:rFonts w:ascii="Arial" w:hAnsi="Arial" w:cs="Arial"/>
+        </w:rPr>
       </w:r>
       <w:r>
         <w:rPr>
@@ -171,6 +191,11 @@
           <w:rFonts w:ascii="Arial" w:hAnsi="Arial" w:cs="Arial"/>
         </w:rPr>
       </w:r>
+      <w:r>
+        <w:rPr>
+          <w:rFonts w:ascii="Arial" w:hAnsi="Arial" w:cs="Arial"/>
+        </w:rPr>
+      </w:r>
     </w:p>
     <w:p>
       <w:pPr>
@@ -186,6 +211,11 @@
           <w:rFonts w:ascii="Arial" w:hAnsi="Arial" w:cs="Arial"/>
         </w:rPr>
         <w:t xml:space="preserve">Putty Login:</w:t>
+      </w:r>
+      <w:r>
+        <w:rPr>
+          <w:rFonts w:ascii="Arial" w:hAnsi="Arial" w:cs="Arial"/>
+        </w:rPr>
       </w:r>
       <w:r>
         <w:rPr>
@@ -279,6 +309,11 @@
           <w:rFonts w:ascii="Arial" w:hAnsi="Arial" w:cs="Arial"/>
         </w:rPr>
       </w:r>
+      <w:r>
+        <w:rPr>
+          <w:rFonts w:ascii="Arial" w:hAnsi="Arial" w:cs="Arial"/>
+        </w:rPr>
+      </w:r>
     </w:p>
     <w:p>
       <w:pPr>
@@ -294,6 +329,11 @@
           <w:rFonts w:ascii="Arial" w:hAnsi="Arial" w:cs="Arial"/>
         </w:rPr>
         <w:t xml:space="preserve">Change Password:</w:t>
+      </w:r>
+      <w:r>
+        <w:rPr>
+          <w:rFonts w:ascii="Arial" w:hAnsi="Arial" w:cs="Arial"/>
+        </w:rPr>
       </w:r>
       <w:r>
         <w:rPr>
@@ -387,6 +427,11 @@
           <w:rFonts w:ascii="Arial" w:hAnsi="Arial" w:cs="Arial"/>
         </w:rPr>
       </w:r>
+      <w:r>
+        <w:rPr>
+          <w:rFonts w:ascii="Arial" w:hAnsi="Arial" w:cs="Arial"/>
+        </w:rPr>
+      </w:r>
     </w:p>
     <w:p>
       <w:pPr>
@@ -408,6 +453,11 @@
           <w:rFonts w:ascii="Arial" w:hAnsi="Arial" w:cs="Arial"/>
         </w:rPr>
       </w:r>
+      <w:r>
+        <w:rPr>
+          <w:rFonts w:ascii="Arial" w:hAnsi="Arial" w:cs="Arial"/>
+        </w:rPr>
+      </w:r>
     </w:p>
     <w:p>
       <w:pPr>
@@ -423,6 +473,11 @@
           <w:rFonts w:ascii="Arial" w:hAnsi="Arial" w:cs="Arial"/>
         </w:rPr>
         <w:t xml:space="preserve">System information:</w:t>
+      </w:r>
+      <w:r>
+        <w:rPr>
+          <w:rFonts w:ascii="Arial" w:hAnsi="Arial" w:cs="Arial"/>
+        </w:rPr>
       </w:r>
       <w:r>
         <w:rPr>
@@ -516,6 +571,11 @@
           <w:rFonts w:ascii="Arial" w:hAnsi="Arial" w:cs="Arial"/>
         </w:rPr>
       </w:r>
+      <w:r>
+        <w:rPr>
+          <w:rFonts w:ascii="Arial" w:hAnsi="Arial" w:cs="Arial"/>
+        </w:rPr>
+      </w:r>
     </w:p>
     <w:p>
       <w:pPr>
@@ -531,6 +591,11 @@
           <w:rFonts w:ascii="Arial" w:hAnsi="Arial" w:cs="Arial"/>
         </w:rPr>
         <w:t xml:space="preserve">Successful git clone:</w:t>
+      </w:r>
+      <w:r>
+        <w:rPr>
+          <w:rFonts w:ascii="Arial" w:hAnsi="Arial" w:cs="Arial"/>
+        </w:rPr>
       </w:r>
       <w:r>
         <w:rPr>
@@ -624,16 +689,26 @@
           <w:rFonts w:ascii="Arial" w:hAnsi="Arial" w:cs="Arial"/>
         </w:rPr>
       </w:r>
-    </w:p>
-    <w:p>
-      <w:pPr>
-        <w:pBdr/>
-        <w:spacing/>
-        <w:ind/>
+      <w:r>
         <w:rPr>
           <w:rFonts w:ascii="Arial" w:hAnsi="Arial" w:cs="Arial"/>
         </w:rPr>
-      </w:pPr>
+      </w:r>
+    </w:p>
+    <w:p>
+      <w:pPr>
+        <w:pBdr/>
+        <w:spacing/>
+        <w:ind/>
+        <w:rPr>
+          <w:rFonts w:ascii="Arial" w:hAnsi="Arial" w:cs="Arial"/>
+        </w:rPr>
+      </w:pPr>
+      <w:r>
+        <w:rPr>
+          <w:rFonts w:ascii="Arial" w:hAnsi="Arial" w:cs="Arial"/>
+        </w:rPr>
+      </w:r>
       <w:r>
         <w:rPr>
           <w:rFonts w:ascii="Arial" w:hAnsi="Arial" w:cs="Arial"/>
@@ -665,6 +740,11 @@
           <w:rFonts w:ascii="Arial" w:hAnsi="Arial" w:cs="Arial"/>
         </w:rPr>
       </w:r>
+      <w:r>
+        <w:rPr>
+          <w:rFonts w:ascii="Arial" w:hAnsi="Arial" w:cs="Arial"/>
+        </w:rPr>
+      </w:r>
     </w:p>
     <w:p>
       <w:pPr>
@@ -687,6 +767,13 @@
       <w:r>
         <w:rPr>
           <w:rFonts w:ascii="Arial" w:hAnsi="Arial" w:cs="Arial"/>
+        </w:rPr>
+      </w:r>
+      <w:r>
+        <w:rPr>
+          <w:rFonts w:ascii="Arial" w:hAnsi="Arial" w:cs="Arial"/>
+          <w:highlight w:val="none"/>
+          <w:lang w:val="en-US"/>
         </w:rPr>
       </w:r>
     </w:p>
@@ -785,15 +872,132 @@
       <w:r>
         <w:rPr>
           <w:rFonts w:ascii="Arial" w:hAnsi="Arial" w:cs="Arial"/>
-          <w:highlight w:val="none"/>
-          <w:lang w:val="en-US"/>
+        </w:rPr>
+      </w:r>
+    </w:p>
+    <w:p>
+      <w:pPr>
+        <w:pBdr/>
+        <w:spacing/>
+        <w:ind/>
+        <w:rPr>
+          <w:rFonts w:ascii="Arial" w:hAnsi="Arial" w:cs="Arial"/>
+        </w:rPr>
+      </w:pPr>
+      <w:r>
+        <w:rPr>
+          <w:rFonts w:ascii="Arial" w:hAnsi="Arial" w:cs="Arial"/>
         </w:rPr>
       </w:r>
       <w:r>
         <w:rPr>
           <w:rFonts w:ascii="Arial" w:hAnsi="Arial" w:cs="Arial"/>
-          <w:highlight w:val="none"/>
           <w:lang w:val="en-US"/>
+        </w:rPr>
+        <w:t xml:space="preserve">Deliberate breakage and fix run:</w:t>
+      </w:r>
+      <w:r>
+        <w:rPr>
+          <w:rFonts w:ascii="Arial" w:hAnsi="Arial" w:cs="Arial"/>
+        </w:rPr>
+      </w:r>
+    </w:p>
+    <w:p>
+      <w:pPr>
+        <w:pBdr/>
+        <w:spacing/>
+        <w:ind/>
+        <w:rPr>
+          <w:rFonts w:ascii="Arial" w:hAnsi="Arial" w:cs="Arial"/>
+        </w:rPr>
+      </w:pPr>
+      <w:r>
+        <w:rPr>
+          <w:rFonts w:ascii="Arial" w:hAnsi="Arial" w:cs="Arial"/>
+        </w:rPr>
+      </w:r>
+      <w:r>
+        <w:rPr>
+          <w:rFonts w:ascii="Arial" w:hAnsi="Arial" w:cs="Arial"/>
+        </w:rPr>
+      </w:r>
+      <w:r>
+        <mc:AlternateContent>
+          <mc:Choice Requires="wpg">
+            <w:drawing>
+              <wp:inline xmlns:wp="http://schemas.openxmlformats.org/drawingml/2006/wordprocessingDrawing" distT="0" distB="0" distL="0" distR="0">
+                <wp:extent cx="5731510" cy="1391601"/>
+                <wp:effectExtent l="0" t="0" r="0" b="0"/>
+                <wp:docPr id="7" name=""/>
+                <wp:cNvGraphicFramePr>
+                  <a:graphicFrameLocks xmlns:a="http://schemas.openxmlformats.org/drawingml/2006/main" noChangeAspect="1"/>
+                </wp:cNvGraphicFramePr>
+                <a:graphic xmlns:a="http://schemas.openxmlformats.org/drawingml/2006/main">
+                  <a:graphicData uri="http://schemas.openxmlformats.org/drawingml/2006/picture">
+                    <pic:pic xmlns:pic="http://schemas.openxmlformats.org/drawingml/2006/picture">
+                      <pic:nvPicPr>
+                        <pic:cNvPr id="1674246120" name=""/>
+                        <pic:cNvPicPr>
+                          <a:picLocks noChangeAspect="1"/>
+                        </pic:cNvPicPr>
+                        <pic:nvPr/>
+                      </pic:nvPicPr>
+                      <pic:blipFill rotWithShape="1">
+                        <a:blip r:embed="rId14"/>
+                        <a:stretch/>
+                      </pic:blipFill>
+                      <pic:spPr bwMode="auto">
+                        <a:xfrm>
+                          <a:off x="0" y="0"/>
+                          <a:ext cx="5731509" cy="1391600"/>
+                        </a:xfrm>
+                        <a:prstGeom prst="rect">
+                          <a:avLst/>
+                        </a:prstGeom>
+                      </pic:spPr>
+                    </pic:pic>
+                  </a:graphicData>
+                </a:graphic>
+              </wp:inline>
+            </w:drawing>
+          </mc:Choice>
+          <mc:Fallback>
+            <w:pict>
+              <v:shapetype id="_x0000_t75" coordsize="21600,21600" o:spt="75" o:preferrelative="t" path="m@4@5l@4@11@9@11@9@5xe" filled="f" stroked="f">
+                <v:stroke joinstyle="miter"/>
+                <v:formulas>
+                  <v:f eqn="if lineDrawn pixelLineWidth 0"/>
+                  <v:f eqn="sum @0 1 0"/>
+                  <v:f eqn="sum 0 0 @1"/>
+                  <v:f eqn="prod @2 1 2"/>
+                  <v:f eqn="prod @3 21600 pixelWidth"/>
+                  <v:f eqn="prod @3 21600 pixelHeight"/>
+                  <v:f eqn="sum @0 0 1"/>
+                  <v:f eqn="prod @6 1 2"/>
+                  <v:f eqn="prod @7 21600 pixelWidth"/>
+                  <v:f eqn="sum @8 21600 0"/>
+                  <v:f eqn="prod @7 21600 pixelHeight"/>
+                  <v:f eqn="sum @10 21600 0"/>
+                </v:formulas>
+                <v:path o:extrusionok="f" gradientshapeok="t" o:connecttype="rect"/>
+                <o:lock v:ext="edit" aspectratio="t"/>
+              </v:shapetype>
+              <v:shape id="_x0000_i6" o:spid="_x0000_s6" type="#_x0000_t75" style="width:451.30pt;height:109.57pt;mso-wrap-distance-left:0.00pt;mso-wrap-distance-top:0.00pt;mso-wrap-distance-right:0.00pt;mso-wrap-distance-bottom:0.00pt;z-index:1;" stroked="false">
+                <v:imagedata r:id="rId14" o:title=""/>
+                <o:lock v:ext="edit" rotation="t"/>
+              </v:shape>
+            </w:pict>
+          </mc:Fallback>
+        </mc:AlternateContent>
+      </w:r>
+      <w:r>
+        <w:rPr>
+          <w:rFonts w:ascii="Arial" w:hAnsi="Arial" w:cs="Arial"/>
+        </w:rPr>
+      </w:r>
+      <w:r>
+        <w:rPr>
+          <w:rFonts w:ascii="Arial" w:hAnsi="Arial" w:cs="Arial"/>
         </w:rPr>
       </w:r>
     </w:p>
@@ -836,41 +1040,6 @@
           <w:rFonts w:ascii="Arial" w:hAnsi="Arial" w:cs="Arial"/>
         </w:rPr>
       </w:r>
-      <w:r>
-        <w:rPr>
-          <w:rFonts w:ascii="Arial" w:hAnsi="Arial" w:cs="Arial"/>
-        </w:rPr>
-      </w:r>
-    </w:p>
-    <w:p>
-      <w:pPr>
-        <w:pBdr/>
-        <w:spacing/>
-        <w:ind/>
-        <w:rPr>
-          <w:rFonts w:ascii="Arial" w:hAnsi="Arial" w:cs="Arial"/>
-        </w:rPr>
-      </w:pPr>
-      <w:r>
-        <w:rPr>
-          <w:rFonts w:ascii="Arial" w:hAnsi="Arial" w:cs="Arial"/>
-        </w:rPr>
-      </w:r>
-      <w:r>
-        <w:rPr>
-          <w:rFonts w:ascii="Arial" w:hAnsi="Arial" w:cs="Arial"/>
-        </w:rPr>
-      </w:r>
-    </w:p>
-    <w:p>
-      <w:pPr>
-        <w:pBdr/>
-        <w:spacing/>
-        <w:ind/>
-        <w:rPr>
-          <w:rFonts w:ascii="Arial" w:hAnsi="Arial" w:cs="Arial"/>
-        </w:rPr>
-      </w:pPr>
       <w:r>
         <w:rPr>
           <w:rFonts w:ascii="Arial" w:hAnsi="Arial" w:cs="Arial"/>
@@ -904,7 +1073,6 @@
         <w:ind/>
         <w:rPr/>
       </w:pPr>
-      <w:r/>
       <w:r>
         <w:separator/>
       </w:r>
@@ -919,7 +1087,6 @@
         <w:ind/>
         <w:rPr/>
       </w:pPr>
-      <w:r/>
       <w:r>
         <w:continuationSeparator/>
       </w:r>
@@ -939,7 +1106,6 @@
         <w:ind/>
         <w:rPr/>
       </w:pPr>
-      <w:r/>
       <w:r>
         <w:separator/>
       </w:r>
@@ -954,7 +1120,6 @@
         <w:ind/>
         <w:rPr/>
       </w:pPr>
-      <w:r/>
       <w:r>
         <w:continuationSeparator/>
       </w:r>
@@ -1123,9 +1288,9 @@
     <w:lsdException w:name="Bibliography" w:uiPriority="37"/>
     <w:lsdException w:name="TOC Heading" w:uiPriority="39" w:qFormat="1"/>
   </w:latentStyles>
-  <w:style w:type="table" w:styleId="12">
+  <w:style w:type="table" w:styleId="701">
     <w:name w:val="Table Grid"/>
-    <w:basedOn w:val="675"/>
+    <w:basedOn w:val="869"/>
     <w:uiPriority w:val="59"/>
     <w:pPr>
       <w:pBdr/>
@@ -1322,9 +1487,9 @@
       </w:tcPr>
     </w:tblStylePr>
   </w:style>
-  <w:style w:type="table" w:styleId="13">
+  <w:style w:type="table" w:styleId="702">
     <w:name w:val="Table Grid Light"/>
-    <w:basedOn w:val="675"/>
+    <w:basedOn w:val="869"/>
     <w:uiPriority w:val="59"/>
     <w:pPr>
       <w:pBdr/>
@@ -1521,9 +1686,9 @@
       </w:tcPr>
     </w:tblStylePr>
   </w:style>
-  <w:style w:type="table" w:styleId="14">
+  <w:style w:type="table" w:styleId="703">
     <w:name w:val="Plain Table 1"/>
-    <w:basedOn w:val="675"/>
+    <w:basedOn w:val="869"/>
     <w:uiPriority w:val="59"/>
     <w:pPr>
       <w:pBdr/>
@@ -1746,9 +1911,9 @@
       </w:tcPr>
     </w:tblStylePr>
   </w:style>
-  <w:style w:type="table" w:styleId="15">
+  <w:style w:type="table" w:styleId="704">
     <w:name w:val="Plain Table 2"/>
-    <w:basedOn w:val="675"/>
+    <w:basedOn w:val="869"/>
     <w:uiPriority w:val="59"/>
     <w:pPr>
       <w:pBdr/>
@@ -1979,9 +2144,9 @@
       </w:tcPr>
     </w:tblStylePr>
   </w:style>
-  <w:style w:type="table" w:styleId="16">
+  <w:style w:type="table" w:styleId="705">
     <w:name w:val="Plain Table 3"/>
-    <w:basedOn w:val="675"/>
+    <w:basedOn w:val="869"/>
     <w:uiPriority w:val="99"/>
     <w:pPr>
       <w:pBdr/>
@@ -2209,9 +2374,9 @@
       </w:tcPr>
     </w:tblStylePr>
   </w:style>
-  <w:style w:type="table" w:styleId="17">
+  <w:style w:type="table" w:styleId="706">
     <w:name w:val="Plain Table 4"/>
-    <w:basedOn w:val="675"/>
+    <w:basedOn w:val="869"/>
     <w:uiPriority w:val="99"/>
     <w:pPr>
       <w:pBdr/>
@@ -2425,9 +2590,9 @@
       </w:tcPr>
     </w:tblStylePr>
   </w:style>
-  <w:style w:type="table" w:styleId="18">
+  <w:style w:type="table" w:styleId="707">
     <w:name w:val="Plain Table 5"/>
-    <w:basedOn w:val="675"/>
+    <w:basedOn w:val="869"/>
     <w:uiPriority w:val="99"/>
     <w:pPr>
       <w:pBdr/>
@@ -2658,9 +2823,9 @@
       </w:tcPr>
     </w:tblStylePr>
   </w:style>
-  <w:style w:type="table" w:styleId="19">
+  <w:style w:type="table" w:styleId="708">
     <w:name w:val="Grid Table 1 Light"/>
-    <w:basedOn w:val="675"/>
+    <w:basedOn w:val="869"/>
     <w:uiPriority w:val="99"/>
     <w:pPr>
       <w:pBdr/>
@@ -2881,9 +3046,9 @@
       </w:tcPr>
     </w:tblStylePr>
   </w:style>
-  <w:style w:type="table" w:styleId="20">
+  <w:style w:type="table" w:styleId="709">
     <w:name w:val="Grid Table 1 Light - Accent 1"/>
-    <w:basedOn w:val="675"/>
+    <w:basedOn w:val="869"/>
     <w:uiPriority w:val="99"/>
     <w:pPr>
       <w:pBdr/>
@@ -3104,9 +3269,9 @@
       </w:tcPr>
     </w:tblStylePr>
   </w:style>
-  <w:style w:type="table" w:styleId="21">
+  <w:style w:type="table" w:styleId="710">
     <w:name w:val="Grid Table 1 Light - Accent 2"/>
-    <w:basedOn w:val="675"/>
+    <w:basedOn w:val="869"/>
     <w:uiPriority w:val="99"/>
     <w:pPr>
       <w:pBdr/>
@@ -3327,9 +3492,9 @@
       </w:tcPr>
     </w:tblStylePr>
   </w:style>
-  <w:style w:type="table" w:styleId="22">
+  <w:style w:type="table" w:styleId="711">
     <w:name w:val="Grid Table 1 Light - Accent 3"/>
-    <w:basedOn w:val="675"/>
+    <w:basedOn w:val="869"/>
     <w:uiPriority w:val="99"/>
     <w:pPr>
       <w:pBdr/>
@@ -3550,9 +3715,9 @@
       </w:tcPr>
     </w:tblStylePr>
   </w:style>
-  <w:style w:type="table" w:styleId="23">
+  <w:style w:type="table" w:styleId="712">
     <w:name w:val="Grid Table 1 Light - Accent 4"/>
-    <w:basedOn w:val="675"/>
+    <w:basedOn w:val="869"/>
     <w:uiPriority w:val="99"/>
     <w:pPr>
       <w:pBdr/>
@@ -3773,9 +3938,9 @@
       </w:tcPr>
     </w:tblStylePr>
   </w:style>
-  <w:style w:type="table" w:styleId="24">
+  <w:style w:type="table" w:styleId="713">
     <w:name w:val="Grid Table 1 Light - Accent 5"/>
-    <w:basedOn w:val="675"/>
+    <w:basedOn w:val="869"/>
     <w:uiPriority w:val="99"/>
     <w:pPr>
       <w:pBdr/>
@@ -3996,9 +4161,9 @@
       </w:tcPr>
     </w:tblStylePr>
   </w:style>
-  <w:style w:type="table" w:styleId="25">
+  <w:style w:type="table" w:styleId="714">
     <w:name w:val="Grid Table 1 Light - Accent 6"/>
-    <w:basedOn w:val="675"/>
+    <w:basedOn w:val="869"/>
     <w:uiPriority w:val="99"/>
     <w:pPr>
       <w:pBdr/>
@@ -4219,9 +4384,9 @@
       </w:tcPr>
     </w:tblStylePr>
   </w:style>
-  <w:style w:type="table" w:styleId="26">
+  <w:style w:type="table" w:styleId="715">
     <w:name w:val="Grid Table 2"/>
-    <w:basedOn w:val="675"/>
+    <w:basedOn w:val="869"/>
     <w:uiPriority w:val="99"/>
     <w:pPr>
       <w:pBdr/>
@@ -4451,9 +4616,9 @@
       </w:tcPr>
     </w:tblStylePr>
   </w:style>
-  <w:style w:type="table" w:styleId="27">
+  <w:style w:type="table" w:styleId="716">
     <w:name w:val="Grid Table 2 - Accent 1"/>
-    <w:basedOn w:val="675"/>
+    <w:basedOn w:val="869"/>
     <w:uiPriority w:val="99"/>
     <w:pPr>
       <w:pBdr/>
@@ -4683,9 +4848,9 @@
       </w:tcPr>
     </w:tblStylePr>
   </w:style>
-  <w:style w:type="table" w:styleId="28">
+  <w:style w:type="table" w:styleId="717">
     <w:name w:val="Grid Table 2 - Accent 2"/>
-    <w:basedOn w:val="675"/>
+    <w:basedOn w:val="869"/>
     <w:uiPriority w:val="99"/>
     <w:pPr>
       <w:pBdr/>
@@ -4915,9 +5080,9 @@
       </w:tcPr>
     </w:tblStylePr>
   </w:style>
-  <w:style w:type="table" w:styleId="29">
+  <w:style w:type="table" w:styleId="718">
     <w:name w:val="Grid Table 2 - Accent 3"/>
-    <w:basedOn w:val="675"/>
+    <w:basedOn w:val="869"/>
     <w:uiPriority w:val="99"/>
     <w:pPr>
       <w:pBdr/>
@@ -5147,9 +5312,9 @@
       </w:tcPr>
     </w:tblStylePr>
   </w:style>
-  <w:style w:type="table" w:styleId="30">
+  <w:style w:type="table" w:styleId="719">
     <w:name w:val="Grid Table 2 - Accent 4"/>
-    <w:basedOn w:val="675"/>
+    <w:basedOn w:val="869"/>
     <w:uiPriority w:val="99"/>
     <w:pPr>
       <w:pBdr/>
@@ -5379,9 +5544,9 @@
       </w:tcPr>
     </w:tblStylePr>
   </w:style>
-  <w:style w:type="table" w:styleId="31">
+  <w:style w:type="table" w:styleId="720">
     <w:name w:val="Grid Table 2 - Accent 5"/>
-    <w:basedOn w:val="675"/>
+    <w:basedOn w:val="869"/>
     <w:uiPriority w:val="99"/>
     <w:pPr>
       <w:pBdr/>
@@ -5611,9 +5776,9 @@
       </w:tcPr>
     </w:tblStylePr>
   </w:style>
-  <w:style w:type="table" w:styleId="32">
+  <w:style w:type="table" w:styleId="721">
     <w:name w:val="Grid Table 2 - Accent 6"/>
-    <w:basedOn w:val="675"/>
+    <w:basedOn w:val="869"/>
     <w:uiPriority w:val="99"/>
     <w:pPr>
       <w:pBdr/>
@@ -5843,9 +6008,9 @@
       </w:tcPr>
     </w:tblStylePr>
   </w:style>
-  <w:style w:type="table" w:styleId="33">
+  <w:style w:type="table" w:styleId="722">
     <w:name w:val="Grid Table 3"/>
-    <w:basedOn w:val="675"/>
+    <w:basedOn w:val="869"/>
     <w:uiPriority w:val="99"/>
     <w:pPr>
       <w:pBdr/>
@@ -5944,29 +6109,6 @@
         <w:tblBorders/>
       </w:tblPr>
       <w:tcPr>
-        <w:shd w:color="ffffff"/>
-        <w:tcBorders>
-          <w:top w:val="none" w:color="000000" w:sz="4" w:space="0"/>
-          <w:left w:val="none" w:color="000000" w:sz="4" w:space="0"/>
-          <w:bottom w:val="none" w:color="000000" w:sz="4" w:space="0"/>
-          <w:right w:val="none" w:color="000000" w:sz="4" w:space="0"/>
-        </w:tcBorders>
-      </w:tcPr>
-    </w:tblStylePr>
-    <w:tblStylePr w:type="firstRow">
-      <w:rPr>
-        <w:b/>
-        <w:color w:val="404040"/>
-      </w:rPr>
-      <w:pPr>
-        <w:pBdr/>
-        <w:spacing/>
-        <w:ind/>
-      </w:pPr>
-      <w:tblPr>
-        <w:tblBorders/>
-      </w:tblPr>
-      <w:tcPr>
         <w:shd w:val="clear" w:color="ffffff"/>
         <w:tcBorders>
           <w:top w:val="none" w:color="000000" w:sz="4" w:space="0"/>
@@ -5976,30 +6118,7 @@
         </w:tcBorders>
       </w:tcPr>
     </w:tblStylePr>
-    <w:tblStylePr w:type="lastCol">
-      <w:rPr>
-        <w:i/>
-        <w:color w:val="404040"/>
-      </w:rPr>
-      <w:pPr>
-        <w:pBdr/>
-        <w:spacing/>
-        <w:ind/>
-      </w:pPr>
-      <w:tblPr>
-        <w:tblBorders/>
-      </w:tblPr>
-      <w:tcPr>
-        <w:shd w:color="ffffff"/>
-        <w:tcBorders>
-          <w:top w:val="none" w:color="000000" w:sz="4" w:space="0"/>
-          <w:left w:val="none" w:color="000000" w:sz="4" w:space="0"/>
-          <w:bottom w:val="none" w:color="000000" w:sz="4" w:space="0"/>
-          <w:right w:val="none" w:color="000000" w:sz="4" w:space="0"/>
-        </w:tcBorders>
-      </w:tcPr>
-    </w:tblStylePr>
-    <w:tblStylePr w:type="lastRow">
+    <w:tblStylePr w:type="firstRow">
       <w:rPr>
         <w:b/>
         <w:color w:val="404040"/>
@@ -6022,6 +6141,52 @@
         </w:tcBorders>
       </w:tcPr>
     </w:tblStylePr>
+    <w:tblStylePr w:type="lastCol">
+      <w:rPr>
+        <w:i/>
+        <w:color w:val="404040"/>
+      </w:rPr>
+      <w:pPr>
+        <w:pBdr/>
+        <w:spacing/>
+        <w:ind/>
+      </w:pPr>
+      <w:tblPr>
+        <w:tblBorders/>
+      </w:tblPr>
+      <w:tcPr>
+        <w:shd w:val="clear" w:color="ffffff"/>
+        <w:tcBorders>
+          <w:top w:val="none" w:color="000000" w:sz="4" w:space="0"/>
+          <w:left w:val="none" w:color="000000" w:sz="4" w:space="0"/>
+          <w:bottom w:val="none" w:color="000000" w:sz="4" w:space="0"/>
+          <w:right w:val="none" w:color="000000" w:sz="4" w:space="0"/>
+        </w:tcBorders>
+      </w:tcPr>
+    </w:tblStylePr>
+    <w:tblStylePr w:type="lastRow">
+      <w:rPr>
+        <w:b/>
+        <w:color w:val="404040"/>
+      </w:rPr>
+      <w:pPr>
+        <w:pBdr/>
+        <w:spacing/>
+        <w:ind/>
+      </w:pPr>
+      <w:tblPr>
+        <w:tblBorders/>
+      </w:tblPr>
+      <w:tcPr>
+        <w:shd w:val="clear" w:color="ffffff"/>
+        <w:tcBorders>
+          <w:top w:val="none" w:color="000000" w:sz="4" w:space="0"/>
+          <w:left w:val="none" w:color="000000" w:sz="4" w:space="0"/>
+          <w:bottom w:val="none" w:color="000000" w:sz="4" w:space="0"/>
+          <w:right w:val="none" w:color="000000" w:sz="4" w:space="0"/>
+        </w:tcBorders>
+      </w:tcPr>
+    </w:tblStylePr>
     <w:tblStylePr w:type="nwCell">
       <w:pPr>
         <w:pBdr/>
@@ -6088,9 +6253,9 @@
       </w:tcPr>
     </w:tblStylePr>
   </w:style>
-  <w:style w:type="table" w:styleId="34">
+  <w:style w:type="table" w:styleId="723">
     <w:name w:val="Grid Table 3 - Accent 1"/>
-    <w:basedOn w:val="675"/>
+    <w:basedOn w:val="869"/>
     <w:uiPriority w:val="99"/>
     <w:pPr>
       <w:pBdr/>
@@ -6189,29 +6354,6 @@
         <w:tblBorders/>
       </w:tblPr>
       <w:tcPr>
-        <w:shd w:color="ffffff"/>
-        <w:tcBorders>
-          <w:top w:val="none" w:color="000000" w:sz="4" w:space="0"/>
-          <w:left w:val="none" w:color="000000" w:sz="4" w:space="0"/>
-          <w:bottom w:val="none" w:color="000000" w:sz="4" w:space="0"/>
-          <w:right w:val="none" w:color="000000" w:sz="4" w:space="0"/>
-        </w:tcBorders>
-      </w:tcPr>
-    </w:tblStylePr>
-    <w:tblStylePr w:type="firstRow">
-      <w:rPr>
-        <w:b/>
-        <w:color w:val="404040"/>
-      </w:rPr>
-      <w:pPr>
-        <w:pBdr/>
-        <w:spacing/>
-        <w:ind/>
-      </w:pPr>
-      <w:tblPr>
-        <w:tblBorders/>
-      </w:tblPr>
-      <w:tcPr>
         <w:shd w:val="clear" w:color="ffffff"/>
         <w:tcBorders>
           <w:top w:val="none" w:color="000000" w:sz="4" w:space="0"/>
@@ -6221,30 +6363,7 @@
         </w:tcBorders>
       </w:tcPr>
     </w:tblStylePr>
-    <w:tblStylePr w:type="lastCol">
-      <w:rPr>
-        <w:i/>
-        <w:color w:val="404040"/>
-      </w:rPr>
-      <w:pPr>
-        <w:pBdr/>
-        <w:spacing/>
-        <w:ind/>
-      </w:pPr>
-      <w:tblPr>
-        <w:tblBorders/>
-      </w:tblPr>
-      <w:tcPr>
-        <w:shd w:color="ffffff"/>
-        <w:tcBorders>
-          <w:top w:val="none" w:color="000000" w:sz="4" w:space="0"/>
-          <w:left w:val="none" w:color="000000" w:sz="4" w:space="0"/>
-          <w:bottom w:val="none" w:color="000000" w:sz="4" w:space="0"/>
-          <w:right w:val="none" w:color="000000" w:sz="4" w:space="0"/>
-        </w:tcBorders>
-      </w:tcPr>
-    </w:tblStylePr>
-    <w:tblStylePr w:type="lastRow">
+    <w:tblStylePr w:type="firstRow">
       <w:rPr>
         <w:b/>
         <w:color w:val="404040"/>
@@ -6267,6 +6386,52 @@
         </w:tcBorders>
       </w:tcPr>
     </w:tblStylePr>
+    <w:tblStylePr w:type="lastCol">
+      <w:rPr>
+        <w:i/>
+        <w:color w:val="404040"/>
+      </w:rPr>
+      <w:pPr>
+        <w:pBdr/>
+        <w:spacing/>
+        <w:ind/>
+      </w:pPr>
+      <w:tblPr>
+        <w:tblBorders/>
+      </w:tblPr>
+      <w:tcPr>
+        <w:shd w:val="clear" w:color="ffffff"/>
+        <w:tcBorders>
+          <w:top w:val="none" w:color="000000" w:sz="4" w:space="0"/>
+          <w:left w:val="none" w:color="000000" w:sz="4" w:space="0"/>
+          <w:bottom w:val="none" w:color="000000" w:sz="4" w:space="0"/>
+          <w:right w:val="none" w:color="000000" w:sz="4" w:space="0"/>
+        </w:tcBorders>
+      </w:tcPr>
+    </w:tblStylePr>
+    <w:tblStylePr w:type="lastRow">
+      <w:rPr>
+        <w:b/>
+        <w:color w:val="404040"/>
+      </w:rPr>
+      <w:pPr>
+        <w:pBdr/>
+        <w:spacing/>
+        <w:ind/>
+      </w:pPr>
+      <w:tblPr>
+        <w:tblBorders/>
+      </w:tblPr>
+      <w:tcPr>
+        <w:shd w:val="clear" w:color="ffffff"/>
+        <w:tcBorders>
+          <w:top w:val="none" w:color="000000" w:sz="4" w:space="0"/>
+          <w:left w:val="none" w:color="000000" w:sz="4" w:space="0"/>
+          <w:bottom w:val="none" w:color="000000" w:sz="4" w:space="0"/>
+          <w:right w:val="none" w:color="000000" w:sz="4" w:space="0"/>
+        </w:tcBorders>
+      </w:tcPr>
+    </w:tblStylePr>
     <w:tblStylePr w:type="nwCell">
       <w:pPr>
         <w:pBdr/>
@@ -6333,9 +6498,9 @@
       </w:tcPr>
     </w:tblStylePr>
   </w:style>
-  <w:style w:type="table" w:styleId="35">
+  <w:style w:type="table" w:styleId="724">
     <w:name w:val="Grid Table 3 - Accent 2"/>
-    <w:basedOn w:val="675"/>
+    <w:basedOn w:val="869"/>
     <w:uiPriority w:val="99"/>
     <w:pPr>
       <w:pBdr/>
@@ -6434,29 +6599,6 @@
         <w:tblBorders/>
       </w:tblPr>
       <w:tcPr>
-        <w:shd w:color="ffffff"/>
-        <w:tcBorders>
-          <w:top w:val="none" w:color="000000" w:sz="4" w:space="0"/>
-          <w:left w:val="none" w:color="000000" w:sz="4" w:space="0"/>
-          <w:bottom w:val="none" w:color="000000" w:sz="4" w:space="0"/>
-          <w:right w:val="none" w:color="000000" w:sz="4" w:space="0"/>
-        </w:tcBorders>
-      </w:tcPr>
-    </w:tblStylePr>
-    <w:tblStylePr w:type="firstRow">
-      <w:rPr>
-        <w:b/>
-        <w:color w:val="404040"/>
-      </w:rPr>
-      <w:pPr>
-        <w:pBdr/>
-        <w:spacing/>
-        <w:ind/>
-      </w:pPr>
-      <w:tblPr>
-        <w:tblBorders/>
-      </w:tblPr>
-      <w:tcPr>
         <w:shd w:val="clear" w:color="ffffff"/>
         <w:tcBorders>
           <w:top w:val="none" w:color="000000" w:sz="4" w:space="0"/>
@@ -6466,30 +6608,7 @@
         </w:tcBorders>
       </w:tcPr>
     </w:tblStylePr>
-    <w:tblStylePr w:type="lastCol">
-      <w:rPr>
-        <w:i/>
-        <w:color w:val="404040"/>
-      </w:rPr>
-      <w:pPr>
-        <w:pBdr/>
-        <w:spacing/>
-        <w:ind/>
-      </w:pPr>
-      <w:tblPr>
-        <w:tblBorders/>
-      </w:tblPr>
-      <w:tcPr>
-        <w:shd w:color="ffffff"/>
-        <w:tcBorders>
-          <w:top w:val="none" w:color="000000" w:sz="4" w:space="0"/>
-          <w:left w:val="none" w:color="000000" w:sz="4" w:space="0"/>
-          <w:bottom w:val="none" w:color="000000" w:sz="4" w:space="0"/>
-          <w:right w:val="none" w:color="000000" w:sz="4" w:space="0"/>
-        </w:tcBorders>
-      </w:tcPr>
-    </w:tblStylePr>
-    <w:tblStylePr w:type="lastRow">
+    <w:tblStylePr w:type="firstRow">
       <w:rPr>
         <w:b/>
         <w:color w:val="404040"/>
@@ -6512,6 +6631,52 @@
         </w:tcBorders>
       </w:tcPr>
     </w:tblStylePr>
+    <w:tblStylePr w:type="lastCol">
+      <w:rPr>
+        <w:i/>
+        <w:color w:val="404040"/>
+      </w:rPr>
+      <w:pPr>
+        <w:pBdr/>
+        <w:spacing/>
+        <w:ind/>
+      </w:pPr>
+      <w:tblPr>
+        <w:tblBorders/>
+      </w:tblPr>
+      <w:tcPr>
+        <w:shd w:val="clear" w:color="ffffff"/>
+        <w:tcBorders>
+          <w:top w:val="none" w:color="000000" w:sz="4" w:space="0"/>
+          <w:left w:val="none" w:color="000000" w:sz="4" w:space="0"/>
+          <w:bottom w:val="none" w:color="000000" w:sz="4" w:space="0"/>
+          <w:right w:val="none" w:color="000000" w:sz="4" w:space="0"/>
+        </w:tcBorders>
+      </w:tcPr>
+    </w:tblStylePr>
+    <w:tblStylePr w:type="lastRow">
+      <w:rPr>
+        <w:b/>
+        <w:color w:val="404040"/>
+      </w:rPr>
+      <w:pPr>
+        <w:pBdr/>
+        <w:spacing/>
+        <w:ind/>
+      </w:pPr>
+      <w:tblPr>
+        <w:tblBorders/>
+      </w:tblPr>
+      <w:tcPr>
+        <w:shd w:val="clear" w:color="ffffff"/>
+        <w:tcBorders>
+          <w:top w:val="none" w:color="000000" w:sz="4" w:space="0"/>
+          <w:left w:val="none" w:color="000000" w:sz="4" w:space="0"/>
+          <w:bottom w:val="none" w:color="000000" w:sz="4" w:space="0"/>
+          <w:right w:val="none" w:color="000000" w:sz="4" w:space="0"/>
+        </w:tcBorders>
+      </w:tcPr>
+    </w:tblStylePr>
     <w:tblStylePr w:type="nwCell">
       <w:pPr>
         <w:pBdr/>
@@ -6578,9 +6743,9 @@
       </w:tcPr>
     </w:tblStylePr>
   </w:style>
-  <w:style w:type="table" w:styleId="36">
+  <w:style w:type="table" w:styleId="725">
     <w:name w:val="Grid Table 3 - Accent 3"/>
-    <w:basedOn w:val="675"/>
+    <w:basedOn w:val="869"/>
     <w:uiPriority w:val="99"/>
     <w:pPr>
       <w:pBdr/>
@@ -6679,29 +6844,6 @@
         <w:tblBorders/>
       </w:tblPr>
       <w:tcPr>
-        <w:shd w:color="ffffff"/>
-        <w:tcBorders>
-          <w:top w:val="none" w:color="000000" w:sz="4" w:space="0"/>
-          <w:left w:val="none" w:color="000000" w:sz="4" w:space="0"/>
-          <w:bottom w:val="none" w:color="000000" w:sz="4" w:space="0"/>
-          <w:right w:val="none" w:color="000000" w:sz="4" w:space="0"/>
-        </w:tcBorders>
-      </w:tcPr>
-    </w:tblStylePr>
-    <w:tblStylePr w:type="firstRow">
-      <w:rPr>
-        <w:b/>
-        <w:color w:val="404040"/>
-      </w:rPr>
-      <w:pPr>
-        <w:pBdr/>
-        <w:spacing/>
-        <w:ind/>
-      </w:pPr>
-      <w:tblPr>
-        <w:tblBorders/>
-      </w:tblPr>
-      <w:tcPr>
         <w:shd w:val="clear" w:color="ffffff"/>
         <w:tcBorders>
           <w:top w:val="none" w:color="000000" w:sz="4" w:space="0"/>
@@ -6711,30 +6853,7 @@
         </w:tcBorders>
       </w:tcPr>
     </w:tblStylePr>
-    <w:tblStylePr w:type="lastCol">
-      <w:rPr>
-        <w:i/>
-        <w:color w:val="404040"/>
-      </w:rPr>
-      <w:pPr>
-        <w:pBdr/>
-        <w:spacing/>
-        <w:ind/>
-      </w:pPr>
-      <w:tblPr>
-        <w:tblBorders/>
-      </w:tblPr>
-      <w:tcPr>
-        <w:shd w:color="ffffff"/>
-        <w:tcBorders>
-          <w:top w:val="none" w:color="000000" w:sz="4" w:space="0"/>
-          <w:left w:val="none" w:color="000000" w:sz="4" w:space="0"/>
-          <w:bottom w:val="none" w:color="000000" w:sz="4" w:space="0"/>
-          <w:right w:val="none" w:color="000000" w:sz="4" w:space="0"/>
-        </w:tcBorders>
-      </w:tcPr>
-    </w:tblStylePr>
-    <w:tblStylePr w:type="lastRow">
+    <w:tblStylePr w:type="firstRow">
       <w:rPr>
         <w:b/>
         <w:color w:val="404040"/>
@@ -6757,6 +6876,52 @@
         </w:tcBorders>
       </w:tcPr>
     </w:tblStylePr>
+    <w:tblStylePr w:type="lastCol">
+      <w:rPr>
+        <w:i/>
+        <w:color w:val="404040"/>
+      </w:rPr>
+      <w:pPr>
+        <w:pBdr/>
+        <w:spacing/>
+        <w:ind/>
+      </w:pPr>
+      <w:tblPr>
+        <w:tblBorders/>
+      </w:tblPr>
+      <w:tcPr>
+        <w:shd w:val="clear" w:color="ffffff"/>
+        <w:tcBorders>
+          <w:top w:val="none" w:color="000000" w:sz="4" w:space="0"/>
+          <w:left w:val="none" w:color="000000" w:sz="4" w:space="0"/>
+          <w:bottom w:val="none" w:color="000000" w:sz="4" w:space="0"/>
+          <w:right w:val="none" w:color="000000" w:sz="4" w:space="0"/>
+        </w:tcBorders>
+      </w:tcPr>
+    </w:tblStylePr>
+    <w:tblStylePr w:type="lastRow">
+      <w:rPr>
+        <w:b/>
+        <w:color w:val="404040"/>
+      </w:rPr>
+      <w:pPr>
+        <w:pBdr/>
+        <w:spacing/>
+        <w:ind/>
+      </w:pPr>
+      <w:tblPr>
+        <w:tblBorders/>
+      </w:tblPr>
+      <w:tcPr>
+        <w:shd w:val="clear" w:color="ffffff"/>
+        <w:tcBorders>
+          <w:top w:val="none" w:color="000000" w:sz="4" w:space="0"/>
+          <w:left w:val="none" w:color="000000" w:sz="4" w:space="0"/>
+          <w:bottom w:val="none" w:color="000000" w:sz="4" w:space="0"/>
+          <w:right w:val="none" w:color="000000" w:sz="4" w:space="0"/>
+        </w:tcBorders>
+      </w:tcPr>
+    </w:tblStylePr>
     <w:tblStylePr w:type="nwCell">
       <w:pPr>
         <w:pBdr/>
@@ -6823,9 +6988,9 @@
       </w:tcPr>
     </w:tblStylePr>
   </w:style>
-  <w:style w:type="table" w:styleId="37">
+  <w:style w:type="table" w:styleId="726">
     <w:name w:val="Grid Table 3 - Accent 4"/>
-    <w:basedOn w:val="675"/>
+    <w:basedOn w:val="869"/>
     <w:uiPriority w:val="99"/>
     <w:pPr>
       <w:pBdr/>
@@ -6924,29 +7089,6 @@
         <w:tblBorders/>
       </w:tblPr>
       <w:tcPr>
-        <w:shd w:color="ffffff"/>
-        <w:tcBorders>
-          <w:top w:val="none" w:color="000000" w:sz="4" w:space="0"/>
-          <w:left w:val="none" w:color="000000" w:sz="4" w:space="0"/>
-          <w:bottom w:val="none" w:color="000000" w:sz="4" w:space="0"/>
-          <w:right w:val="none" w:color="000000" w:sz="4" w:space="0"/>
-        </w:tcBorders>
-      </w:tcPr>
-    </w:tblStylePr>
-    <w:tblStylePr w:type="firstRow">
-      <w:rPr>
-        <w:b/>
-        <w:color w:val="404040"/>
-      </w:rPr>
-      <w:pPr>
-        <w:pBdr/>
-        <w:spacing/>
-        <w:ind/>
-      </w:pPr>
-      <w:tblPr>
-        <w:tblBorders/>
-      </w:tblPr>
-      <w:tcPr>
         <w:shd w:val="clear" w:color="ffffff"/>
         <w:tcBorders>
           <w:top w:val="none" w:color="000000" w:sz="4" w:space="0"/>
@@ -6956,30 +7098,7 @@
         </w:tcBorders>
       </w:tcPr>
     </w:tblStylePr>
-    <w:tblStylePr w:type="lastCol">
-      <w:rPr>
-        <w:i/>
-        <w:color w:val="404040"/>
-      </w:rPr>
-      <w:pPr>
-        <w:pBdr/>
-        <w:spacing/>
-        <w:ind/>
-      </w:pPr>
-      <w:tblPr>
-        <w:tblBorders/>
-      </w:tblPr>
-      <w:tcPr>
-        <w:shd w:color="ffffff"/>
-        <w:tcBorders>
-          <w:top w:val="none" w:color="000000" w:sz="4" w:space="0"/>
-          <w:left w:val="none" w:color="000000" w:sz="4" w:space="0"/>
-          <w:bottom w:val="none" w:color="000000" w:sz="4" w:space="0"/>
-          <w:right w:val="none" w:color="000000" w:sz="4" w:space="0"/>
-        </w:tcBorders>
-      </w:tcPr>
-    </w:tblStylePr>
-    <w:tblStylePr w:type="lastRow">
+    <w:tblStylePr w:type="firstRow">
       <w:rPr>
         <w:b/>
         <w:color w:val="404040"/>
@@ -7002,6 +7121,52 @@
         </w:tcBorders>
       </w:tcPr>
     </w:tblStylePr>
+    <w:tblStylePr w:type="lastCol">
+      <w:rPr>
+        <w:i/>
+        <w:color w:val="404040"/>
+      </w:rPr>
+      <w:pPr>
+        <w:pBdr/>
+        <w:spacing/>
+        <w:ind/>
+      </w:pPr>
+      <w:tblPr>
+        <w:tblBorders/>
+      </w:tblPr>
+      <w:tcPr>
+        <w:shd w:val="clear" w:color="ffffff"/>
+        <w:tcBorders>
+          <w:top w:val="none" w:color="000000" w:sz="4" w:space="0"/>
+          <w:left w:val="none" w:color="000000" w:sz="4" w:space="0"/>
+          <w:bottom w:val="none" w:color="000000" w:sz="4" w:space="0"/>
+          <w:right w:val="none" w:color="000000" w:sz="4" w:space="0"/>
+        </w:tcBorders>
+      </w:tcPr>
+    </w:tblStylePr>
+    <w:tblStylePr w:type="lastRow">
+      <w:rPr>
+        <w:b/>
+        <w:color w:val="404040"/>
+      </w:rPr>
+      <w:pPr>
+        <w:pBdr/>
+        <w:spacing/>
+        <w:ind/>
+      </w:pPr>
+      <w:tblPr>
+        <w:tblBorders/>
+      </w:tblPr>
+      <w:tcPr>
+        <w:shd w:val="clear" w:color="ffffff"/>
+        <w:tcBorders>
+          <w:top w:val="none" w:color="000000" w:sz="4" w:space="0"/>
+          <w:left w:val="none" w:color="000000" w:sz="4" w:space="0"/>
+          <w:bottom w:val="none" w:color="000000" w:sz="4" w:space="0"/>
+          <w:right w:val="none" w:color="000000" w:sz="4" w:space="0"/>
+        </w:tcBorders>
+      </w:tcPr>
+    </w:tblStylePr>
     <w:tblStylePr w:type="nwCell">
       <w:pPr>
         <w:pBdr/>
@@ -7068,9 +7233,9 @@
       </w:tcPr>
     </w:tblStylePr>
   </w:style>
-  <w:style w:type="table" w:styleId="38">
+  <w:style w:type="table" w:styleId="727">
     <w:name w:val="Grid Table 3 - Accent 5"/>
-    <w:basedOn w:val="675"/>
+    <w:basedOn w:val="869"/>
     <w:uiPriority w:val="99"/>
     <w:pPr>
       <w:pBdr/>
@@ -7169,29 +7334,6 @@
         <w:tblBorders/>
       </w:tblPr>
       <w:tcPr>
-        <w:shd w:color="ffffff"/>
-        <w:tcBorders>
-          <w:top w:val="none" w:color="000000" w:sz="4" w:space="0"/>
-          <w:left w:val="none" w:color="000000" w:sz="4" w:space="0"/>
-          <w:bottom w:val="none" w:color="000000" w:sz="4" w:space="0"/>
-          <w:right w:val="none" w:color="000000" w:sz="4" w:space="0"/>
-        </w:tcBorders>
-      </w:tcPr>
-    </w:tblStylePr>
-    <w:tblStylePr w:type="firstRow">
-      <w:rPr>
-        <w:b/>
-        <w:color w:val="404040"/>
-      </w:rPr>
-      <w:pPr>
-        <w:pBdr/>
-        <w:spacing/>
-        <w:ind/>
-      </w:pPr>
-      <w:tblPr>
-        <w:tblBorders/>
-      </w:tblPr>
-      <w:tcPr>
         <w:shd w:val="clear" w:color="ffffff"/>
         <w:tcBorders>
           <w:top w:val="none" w:color="000000" w:sz="4" w:space="0"/>
@@ -7201,30 +7343,7 @@
         </w:tcBorders>
       </w:tcPr>
     </w:tblStylePr>
-    <w:tblStylePr w:type="lastCol">
-      <w:rPr>
-        <w:i/>
-        <w:color w:val="404040"/>
-      </w:rPr>
-      <w:pPr>
-        <w:pBdr/>
-        <w:spacing/>
-        <w:ind/>
-      </w:pPr>
-      <w:tblPr>
-        <w:tblBorders/>
-      </w:tblPr>
-      <w:tcPr>
-        <w:shd w:color="ffffff"/>
-        <w:tcBorders>
-          <w:top w:val="none" w:color="000000" w:sz="4" w:space="0"/>
-          <w:left w:val="none" w:color="000000" w:sz="4" w:space="0"/>
-          <w:bottom w:val="none" w:color="000000" w:sz="4" w:space="0"/>
-          <w:right w:val="none" w:color="000000" w:sz="4" w:space="0"/>
-        </w:tcBorders>
-      </w:tcPr>
-    </w:tblStylePr>
-    <w:tblStylePr w:type="lastRow">
+    <w:tblStylePr w:type="firstRow">
       <w:rPr>
         <w:b/>
         <w:color w:val="404040"/>
@@ -7247,6 +7366,52 @@
         </w:tcBorders>
       </w:tcPr>
     </w:tblStylePr>
+    <w:tblStylePr w:type="lastCol">
+      <w:rPr>
+        <w:i/>
+        <w:color w:val="404040"/>
+      </w:rPr>
+      <w:pPr>
+        <w:pBdr/>
+        <w:spacing/>
+        <w:ind/>
+      </w:pPr>
+      <w:tblPr>
+        <w:tblBorders/>
+      </w:tblPr>
+      <w:tcPr>
+        <w:shd w:val="clear" w:color="ffffff"/>
+        <w:tcBorders>
+          <w:top w:val="none" w:color="000000" w:sz="4" w:space="0"/>
+          <w:left w:val="none" w:color="000000" w:sz="4" w:space="0"/>
+          <w:bottom w:val="none" w:color="000000" w:sz="4" w:space="0"/>
+          <w:right w:val="none" w:color="000000" w:sz="4" w:space="0"/>
+        </w:tcBorders>
+      </w:tcPr>
+    </w:tblStylePr>
+    <w:tblStylePr w:type="lastRow">
+      <w:rPr>
+        <w:b/>
+        <w:color w:val="404040"/>
+      </w:rPr>
+      <w:pPr>
+        <w:pBdr/>
+        <w:spacing/>
+        <w:ind/>
+      </w:pPr>
+      <w:tblPr>
+        <w:tblBorders/>
+      </w:tblPr>
+      <w:tcPr>
+        <w:shd w:val="clear" w:color="ffffff"/>
+        <w:tcBorders>
+          <w:top w:val="none" w:color="000000" w:sz="4" w:space="0"/>
+          <w:left w:val="none" w:color="000000" w:sz="4" w:space="0"/>
+          <w:bottom w:val="none" w:color="000000" w:sz="4" w:space="0"/>
+          <w:right w:val="none" w:color="000000" w:sz="4" w:space="0"/>
+        </w:tcBorders>
+      </w:tcPr>
+    </w:tblStylePr>
     <w:tblStylePr w:type="nwCell">
       <w:pPr>
         <w:pBdr/>
@@ -7313,9 +7478,9 @@
       </w:tcPr>
     </w:tblStylePr>
   </w:style>
-  <w:style w:type="table" w:styleId="39">
+  <w:style w:type="table" w:styleId="728">
     <w:name w:val="Grid Table 3 - Accent 6"/>
-    <w:basedOn w:val="675"/>
+    <w:basedOn w:val="869"/>
     <w:uiPriority w:val="99"/>
     <w:pPr>
       <w:pBdr/>
@@ -7414,29 +7579,6 @@
         <w:tblBorders/>
       </w:tblPr>
       <w:tcPr>
-        <w:shd w:color="ffffff"/>
-        <w:tcBorders>
-          <w:top w:val="none" w:color="000000" w:sz="4" w:space="0"/>
-          <w:left w:val="none" w:color="000000" w:sz="4" w:space="0"/>
-          <w:bottom w:val="none" w:color="000000" w:sz="4" w:space="0"/>
-          <w:right w:val="none" w:color="000000" w:sz="4" w:space="0"/>
-        </w:tcBorders>
-      </w:tcPr>
-    </w:tblStylePr>
-    <w:tblStylePr w:type="firstRow">
-      <w:rPr>
-        <w:b/>
-        <w:color w:val="404040"/>
-      </w:rPr>
-      <w:pPr>
-        <w:pBdr/>
-        <w:spacing/>
-        <w:ind/>
-      </w:pPr>
-      <w:tblPr>
-        <w:tblBorders/>
-      </w:tblPr>
-      <w:tcPr>
         <w:shd w:val="clear" w:color="ffffff"/>
         <w:tcBorders>
           <w:top w:val="none" w:color="000000" w:sz="4" w:space="0"/>
@@ -7446,30 +7588,7 @@
         </w:tcBorders>
       </w:tcPr>
     </w:tblStylePr>
-    <w:tblStylePr w:type="lastCol">
-      <w:rPr>
-        <w:i/>
-        <w:color w:val="404040"/>
-      </w:rPr>
-      <w:pPr>
-        <w:pBdr/>
-        <w:spacing/>
-        <w:ind/>
-      </w:pPr>
-      <w:tblPr>
-        <w:tblBorders/>
-      </w:tblPr>
-      <w:tcPr>
-        <w:shd w:color="ffffff"/>
-        <w:tcBorders>
-          <w:top w:val="none" w:color="000000" w:sz="4" w:space="0"/>
-          <w:left w:val="none" w:color="000000" w:sz="4" w:space="0"/>
-          <w:bottom w:val="none" w:color="000000" w:sz="4" w:space="0"/>
-          <w:right w:val="none" w:color="000000" w:sz="4" w:space="0"/>
-        </w:tcBorders>
-      </w:tcPr>
-    </w:tblStylePr>
-    <w:tblStylePr w:type="lastRow">
+    <w:tblStylePr w:type="firstRow">
       <w:rPr>
         <w:b/>
         <w:color w:val="404040"/>
@@ -7492,6 +7611,52 @@
         </w:tcBorders>
       </w:tcPr>
     </w:tblStylePr>
+    <w:tblStylePr w:type="lastCol">
+      <w:rPr>
+        <w:i/>
+        <w:color w:val="404040"/>
+      </w:rPr>
+      <w:pPr>
+        <w:pBdr/>
+        <w:spacing/>
+        <w:ind/>
+      </w:pPr>
+      <w:tblPr>
+        <w:tblBorders/>
+      </w:tblPr>
+      <w:tcPr>
+        <w:shd w:val="clear" w:color="ffffff"/>
+        <w:tcBorders>
+          <w:top w:val="none" w:color="000000" w:sz="4" w:space="0"/>
+          <w:left w:val="none" w:color="000000" w:sz="4" w:space="0"/>
+          <w:bottom w:val="none" w:color="000000" w:sz="4" w:space="0"/>
+          <w:right w:val="none" w:color="000000" w:sz="4" w:space="0"/>
+        </w:tcBorders>
+      </w:tcPr>
+    </w:tblStylePr>
+    <w:tblStylePr w:type="lastRow">
+      <w:rPr>
+        <w:b/>
+        <w:color w:val="404040"/>
+      </w:rPr>
+      <w:pPr>
+        <w:pBdr/>
+        <w:spacing/>
+        <w:ind/>
+      </w:pPr>
+      <w:tblPr>
+        <w:tblBorders/>
+      </w:tblPr>
+      <w:tcPr>
+        <w:shd w:val="clear" w:color="ffffff"/>
+        <w:tcBorders>
+          <w:top w:val="none" w:color="000000" w:sz="4" w:space="0"/>
+          <w:left w:val="none" w:color="000000" w:sz="4" w:space="0"/>
+          <w:bottom w:val="none" w:color="000000" w:sz="4" w:space="0"/>
+          <w:right w:val="none" w:color="000000" w:sz="4" w:space="0"/>
+        </w:tcBorders>
+      </w:tcPr>
+    </w:tblStylePr>
     <w:tblStylePr w:type="nwCell">
       <w:pPr>
         <w:pBdr/>
@@ -7558,9 +7723,9 @@
       </w:tcPr>
     </w:tblStylePr>
   </w:style>
-  <w:style w:type="table" w:styleId="40">
+  <w:style w:type="table" w:styleId="729">
     <w:name w:val="Grid Table 4"/>
-    <w:basedOn w:val="675"/>
+    <w:basedOn w:val="869"/>
     <w:uiPriority w:val="59"/>
     <w:pPr>
       <w:pBdr/>
@@ -7791,9 +7956,9 @@
       </w:tcPr>
     </w:tblStylePr>
   </w:style>
-  <w:style w:type="table" w:styleId="41">
+  <w:style w:type="table" w:styleId="730">
     <w:name w:val="Grid Table 4 - Accent 1"/>
-    <w:basedOn w:val="675"/>
+    <w:basedOn w:val="869"/>
     <w:uiPriority w:val="59"/>
     <w:pPr>
       <w:pBdr/>
@@ -8024,9 +8189,9 @@
       </w:tcPr>
     </w:tblStylePr>
   </w:style>
-  <w:style w:type="table" w:styleId="42">
+  <w:style w:type="table" w:styleId="731">
     <w:name w:val="Grid Table 4 - Accent 2"/>
-    <w:basedOn w:val="675"/>
+    <w:basedOn w:val="869"/>
     <w:uiPriority w:val="59"/>
     <w:pPr>
       <w:pBdr/>
@@ -8257,9 +8422,9 @@
       </w:tcPr>
     </w:tblStylePr>
   </w:style>
-  <w:style w:type="table" w:styleId="43">
+  <w:style w:type="table" w:styleId="732">
     <w:name w:val="Grid Table 4 - Accent 3"/>
-    <w:basedOn w:val="675"/>
+    <w:basedOn w:val="869"/>
     <w:uiPriority w:val="59"/>
     <w:pPr>
       <w:pBdr/>
@@ -8490,9 +8655,9 @@
       </w:tcPr>
     </w:tblStylePr>
   </w:style>
-  <w:style w:type="table" w:styleId="44">
+  <w:style w:type="table" w:styleId="733">
     <w:name w:val="Grid Table 4 - Accent 4"/>
-    <w:basedOn w:val="675"/>
+    <w:basedOn w:val="869"/>
     <w:uiPriority w:val="59"/>
     <w:pPr>
       <w:pBdr/>
@@ -8723,9 +8888,9 @@
       </w:tcPr>
     </w:tblStylePr>
   </w:style>
-  <w:style w:type="table" w:styleId="45">
+  <w:style w:type="table" w:styleId="734">
     <w:name w:val="Grid Table 4 - Accent 5"/>
-    <w:basedOn w:val="675"/>
+    <w:basedOn w:val="869"/>
     <w:uiPriority w:val="59"/>
     <w:pPr>
       <w:pBdr/>
@@ -8956,9 +9121,9 @@
       </w:tcPr>
     </w:tblStylePr>
   </w:style>
-  <w:style w:type="table" w:styleId="46">
+  <w:style w:type="table" w:styleId="735">
     <w:name w:val="Grid Table 4 - Accent 6"/>
-    <w:basedOn w:val="675"/>
+    <w:basedOn w:val="869"/>
     <w:uiPriority w:val="59"/>
     <w:pPr>
       <w:pBdr/>
@@ -9189,9 +9354,9 @@
       </w:tcPr>
     </w:tblStylePr>
   </w:style>
-  <w:style w:type="table" w:styleId="47">
+  <w:style w:type="table" w:styleId="736">
     <w:name w:val="Grid Table 5 Dark"/>
-    <w:basedOn w:val="675"/>
+    <w:basedOn w:val="869"/>
     <w:uiPriority w:val="99"/>
     <w:pPr>
       <w:pBdr/>
@@ -9417,9 +9582,9 @@
       </w:tcPr>
     </w:tblStylePr>
   </w:style>
-  <w:style w:type="table" w:styleId="48">
+  <w:style w:type="table" w:styleId="737">
     <w:name w:val="Grid Table 5 Dark- Accent 1"/>
-    <w:basedOn w:val="675"/>
+    <w:basedOn w:val="869"/>
     <w:uiPriority w:val="99"/>
     <w:pPr>
       <w:pBdr/>
@@ -9645,9 +9810,9 @@
       </w:tcPr>
     </w:tblStylePr>
   </w:style>
-  <w:style w:type="table" w:styleId="49">
+  <w:style w:type="table" w:styleId="738">
     <w:name w:val="Grid Table 5 Dark - Accent 2"/>
-    <w:basedOn w:val="675"/>
+    <w:basedOn w:val="869"/>
     <w:uiPriority w:val="99"/>
     <w:pPr>
       <w:pBdr/>
@@ -9873,9 +10038,9 @@
       </w:tcPr>
     </w:tblStylePr>
   </w:style>
-  <w:style w:type="table" w:styleId="50">
+  <w:style w:type="table" w:styleId="739">
     <w:name w:val="Grid Table 5 Dark - Accent 3"/>
-    <w:basedOn w:val="675"/>
+    <w:basedOn w:val="869"/>
     <w:uiPriority w:val="99"/>
     <w:pPr>
       <w:pBdr/>
@@ -10101,9 +10266,9 @@
       </w:tcPr>
     </w:tblStylePr>
   </w:style>
-  <w:style w:type="table" w:styleId="51">
+  <w:style w:type="table" w:styleId="740">
     <w:name w:val="Grid Table 5 Dark- Accent 4"/>
-    <w:basedOn w:val="675"/>
+    <w:basedOn w:val="869"/>
     <w:uiPriority w:val="99"/>
     <w:pPr>
       <w:pBdr/>
@@ -10329,9 +10494,9 @@
       </w:tcPr>
     </w:tblStylePr>
   </w:style>
-  <w:style w:type="table" w:styleId="52">
+  <w:style w:type="table" w:styleId="741">
     <w:name w:val="Grid Table 5 Dark - Accent 5"/>
-    <w:basedOn w:val="675"/>
+    <w:basedOn w:val="869"/>
     <w:uiPriority w:val="99"/>
     <w:pPr>
       <w:pBdr/>
@@ -10557,9 +10722,9 @@
       </w:tcPr>
     </w:tblStylePr>
   </w:style>
-  <w:style w:type="table" w:styleId="53">
+  <w:style w:type="table" w:styleId="742">
     <w:name w:val="Grid Table 5 Dark - Accent 6"/>
-    <w:basedOn w:val="675"/>
+    <w:basedOn w:val="869"/>
     <w:uiPriority w:val="99"/>
     <w:pPr>
       <w:pBdr/>
@@ -10785,9 +10950,9 @@
       </w:tcPr>
     </w:tblStylePr>
   </w:style>
-  <w:style w:type="table" w:styleId="54">
+  <w:style w:type="table" w:styleId="743">
     <w:name w:val="Grid Table 6 Colorful"/>
-    <w:basedOn w:val="675"/>
+    <w:basedOn w:val="869"/>
     <w:uiPriority w:val="99"/>
     <w:pPr>
       <w:pBdr/>
@@ -11015,9 +11180,9 @@
       </w:tcPr>
     </w:tblStylePr>
   </w:style>
-  <w:style w:type="table" w:styleId="55">
+  <w:style w:type="table" w:styleId="744">
     <w:name w:val="Grid Table 6 Colorful - Accent 1"/>
-    <w:basedOn w:val="675"/>
+    <w:basedOn w:val="869"/>
     <w:uiPriority w:val="99"/>
     <w:pPr>
       <w:pBdr/>
@@ -11245,9 +11410,9 @@
       </w:tcPr>
     </w:tblStylePr>
   </w:style>
-  <w:style w:type="table" w:styleId="56">
+  <w:style w:type="table" w:styleId="745">
     <w:name w:val="Grid Table 6 Colorful - Accent 2"/>
-    <w:basedOn w:val="675"/>
+    <w:basedOn w:val="869"/>
     <w:uiPriority w:val="99"/>
     <w:pPr>
       <w:pBdr/>
@@ -11475,9 +11640,9 @@
       </w:tcPr>
     </w:tblStylePr>
   </w:style>
-  <w:style w:type="table" w:styleId="57">
+  <w:style w:type="table" w:styleId="746">
     <w:name w:val="Grid Table 6 Colorful - Accent 3"/>
-    <w:basedOn w:val="675"/>
+    <w:basedOn w:val="869"/>
     <w:uiPriority w:val="99"/>
     <w:pPr>
       <w:pBdr/>
@@ -11705,9 +11870,9 @@
       </w:tcPr>
     </w:tblStylePr>
   </w:style>
-  <w:style w:type="table" w:styleId="58">
+  <w:style w:type="table" w:styleId="747">
     <w:name w:val="Grid Table 6 Colorful - Accent 4"/>
-    <w:basedOn w:val="675"/>
+    <w:basedOn w:val="869"/>
     <w:uiPriority w:val="99"/>
     <w:pPr>
       <w:pBdr/>
@@ -11935,9 +12100,9 @@
       </w:tcPr>
     </w:tblStylePr>
   </w:style>
-  <w:style w:type="table" w:styleId="59">
+  <w:style w:type="table" w:styleId="748">
     <w:name w:val="Grid Table 6 Colorful - Accent 5"/>
-    <w:basedOn w:val="675"/>
+    <w:basedOn w:val="869"/>
     <w:uiPriority w:val="99"/>
     <w:pPr>
       <w:pBdr/>
@@ -12165,9 +12330,9 @@
       </w:tcPr>
     </w:tblStylePr>
   </w:style>
-  <w:style w:type="table" w:styleId="60">
+  <w:style w:type="table" w:styleId="749">
     <w:name w:val="Grid Table 6 Colorful - Accent 6"/>
-    <w:basedOn w:val="675"/>
+    <w:basedOn w:val="869"/>
     <w:uiPriority w:val="99"/>
     <w:pPr>
       <w:pBdr/>
@@ -12395,9 +12560,9 @@
       </w:tcPr>
     </w:tblStylePr>
   </w:style>
-  <w:style w:type="table" w:styleId="61">
+  <w:style w:type="table" w:styleId="750">
     <w:name w:val="Grid Table 7 Colorful"/>
-    <w:basedOn w:val="675"/>
+    <w:basedOn w:val="869"/>
     <w:uiPriority w:val="99"/>
     <w:pPr>
       <w:pBdr/>
@@ -12499,11 +12664,11 @@
         <w:tblBorders/>
       </w:tblPr>
       <w:tcPr>
-        <w:shd w:color="ffffff"/>
+        <w:shd w:val="clear" w:color="ffffff"/>
         <w:tcBorders>
-          <w:top w:val="none"/>
-          <w:left w:val="none"/>
-          <w:bottom w:val="none"/>
+          <w:top w:val="none" w:color="000000" w:sz="4" w:space="0"/>
+          <w:left w:val="none" w:color="000000" w:sz="4" w:space="0"/>
+          <w:bottom w:val="none" w:color="000000" w:sz="4" w:space="0"/>
           <w:right w:val="single" w:color="000000" w:themeColor="text1" w:themeTint="80" w:sz="4" w:space="0"/>
         </w:tcBorders>
       </w:tcPr>
@@ -12526,10 +12691,10 @@
       <w:tcPr>
         <w:shd w:val="clear" w:color="ffffff" w:themeColor="light1" w:fill="ffffff" w:themeFill="light1"/>
         <w:tcBorders>
-          <w:top w:val="none"/>
-          <w:left w:val="none"/>
+          <w:top w:val="none" w:color="000000" w:sz="4" w:space="0"/>
+          <w:left w:val="none" w:color="000000" w:sz="4" w:space="0"/>
           <w:bottom w:val="single" w:color="000000" w:themeColor="text1" w:themeTint="80" w:sz="4" w:space="0"/>
-          <w:right w:val="none"/>
+          <w:right w:val="none" w:color="000000" w:sz="4" w:space="0"/>
         </w:tcBorders>
       </w:tcPr>
     </w:tblStylePr>
@@ -12549,12 +12714,12 @@
         <w:tblBorders/>
       </w:tblPr>
       <w:tcPr>
-        <w:shd w:color="ffffff"/>
+        <w:shd w:val="clear" w:color="ffffff"/>
         <w:tcBorders>
-          <w:top w:val="none"/>
+          <w:top w:val="none" w:color="000000" w:sz="4" w:space="0"/>
           <w:left w:val="single" w:color="000000" w:themeColor="text1" w:themeTint="80" w:sz="4" w:space="0"/>
-          <w:bottom w:val="none"/>
-          <w:right w:val="none"/>
+          <w:bottom w:val="none" w:color="000000" w:sz="4" w:space="0"/>
+          <w:right w:val="none" w:color="000000" w:sz="4" w:space="0"/>
         </w:tcBorders>
       </w:tcPr>
     </w:tblStylePr>
@@ -12577,9 +12742,9 @@
         <w:shd w:val="clear" w:color="ffffff" w:themeColor="light1" w:fill="ffffff" w:themeFill="light1"/>
         <w:tcBorders>
           <w:top w:val="single" w:color="000000" w:themeColor="text1" w:themeTint="80" w:sz="4" w:space="0"/>
-          <w:left w:val="none"/>
-          <w:bottom w:val="none"/>
-          <w:right w:val="none"/>
+          <w:left w:val="none" w:color="000000" w:sz="4" w:space="0"/>
+          <w:bottom w:val="none" w:color="000000" w:sz="4" w:space="0"/>
+          <w:right w:val="none" w:color="000000" w:sz="4" w:space="0"/>
         </w:tcBorders>
       </w:tcPr>
     </w:tblStylePr>
@@ -12649,9 +12814,9 @@
       </w:tcPr>
     </w:tblStylePr>
   </w:style>
-  <w:style w:type="table" w:styleId="62">
+  <w:style w:type="table" w:styleId="751">
     <w:name w:val="Grid Table 7 Colorful - Accent 1"/>
-    <w:basedOn w:val="675"/>
+    <w:basedOn w:val="869"/>
     <w:uiPriority w:val="99"/>
     <w:pPr>
       <w:pBdr/>
@@ -12753,11 +12918,11 @@
         <w:tblBorders/>
       </w:tblPr>
       <w:tcPr>
-        <w:shd w:color="ffffff"/>
+        <w:shd w:val="clear" w:color="ffffff"/>
         <w:tcBorders>
-          <w:top w:val="none"/>
-          <w:left w:val="none"/>
-          <w:bottom w:val="none"/>
+          <w:top w:val="none" w:color="000000" w:sz="4" w:space="0"/>
+          <w:left w:val="none" w:color="000000" w:sz="4" w:space="0"/>
+          <w:bottom w:val="none" w:color="000000" w:sz="4" w:space="0"/>
           <w:right w:val="single" w:color="000000" w:themeColor="accent1" w:themeTint="80" w:sz="4" w:space="0"/>
         </w:tcBorders>
       </w:tcPr>
@@ -12780,10 +12945,10 @@
       <w:tcPr>
         <w:shd w:val="clear" w:color="ffffff" w:themeColor="light1" w:fill="ffffff" w:themeFill="light1"/>
         <w:tcBorders>
-          <w:top w:val="none"/>
-          <w:left w:val="none"/>
+          <w:top w:val="none" w:color="000000" w:sz="4" w:space="0"/>
+          <w:left w:val="none" w:color="000000" w:sz="4" w:space="0"/>
           <w:bottom w:val="single" w:color="000000" w:themeColor="accent1" w:themeTint="80" w:sz="4" w:space="0"/>
-          <w:right w:val="none"/>
+          <w:right w:val="none" w:color="000000" w:sz="4" w:space="0"/>
         </w:tcBorders>
       </w:tcPr>
     </w:tblStylePr>
@@ -12803,12 +12968,12 @@
         <w:tblBorders/>
       </w:tblPr>
       <w:tcPr>
-        <w:shd w:color="ffffff"/>
+        <w:shd w:val="clear" w:color="ffffff"/>
         <w:tcBorders>
-          <w:top w:val="none"/>
+          <w:top w:val="none" w:color="000000" w:sz="4" w:space="0"/>
           <w:left w:val="single" w:color="000000" w:themeColor="accent1" w:themeTint="80" w:sz="4" w:space="0"/>
-          <w:bottom w:val="none"/>
-          <w:right w:val="none"/>
+          <w:bottom w:val="none" w:color="000000" w:sz="4" w:space="0"/>
+          <w:right w:val="none" w:color="000000" w:sz="4" w:space="0"/>
         </w:tcBorders>
       </w:tcPr>
     </w:tblStylePr>
@@ -12831,9 +12996,9 @@
         <w:shd w:val="clear" w:color="ffffff" w:themeColor="light1" w:fill="ffffff" w:themeFill="light1"/>
         <w:tcBorders>
           <w:top w:val="single" w:color="000000" w:themeColor="accent1" w:themeTint="80" w:sz="4" w:space="0"/>
-          <w:left w:val="none"/>
-          <w:bottom w:val="none"/>
-          <w:right w:val="none"/>
+          <w:left w:val="none" w:color="000000" w:sz="4" w:space="0"/>
+          <w:bottom w:val="none" w:color="000000" w:sz="4" w:space="0"/>
+          <w:right w:val="none" w:color="000000" w:sz="4" w:space="0"/>
         </w:tcBorders>
       </w:tcPr>
     </w:tblStylePr>
@@ -12903,9 +13068,9 @@
       </w:tcPr>
     </w:tblStylePr>
   </w:style>
-  <w:style w:type="table" w:styleId="63">
+  <w:style w:type="table" w:styleId="752">
     <w:name w:val="Grid Table 7 Colorful - Accent 2"/>
-    <w:basedOn w:val="675"/>
+    <w:basedOn w:val="869"/>
     <w:uiPriority w:val="99"/>
     <w:pPr>
       <w:pBdr/>
@@ -13007,11 +13172,11 @@
         <w:tblBorders/>
       </w:tblPr>
       <w:tcPr>
-        <w:shd w:color="ffffff"/>
+        <w:shd w:val="clear" w:color="ffffff"/>
         <w:tcBorders>
-          <w:top w:val="none"/>
-          <w:left w:val="none"/>
-          <w:bottom w:val="none"/>
+          <w:top w:val="none" w:color="000000" w:sz="4" w:space="0"/>
+          <w:left w:val="none" w:color="000000" w:sz="4" w:space="0"/>
+          <w:bottom w:val="none" w:color="000000" w:sz="4" w:space="0"/>
           <w:right w:val="single" w:color="000000" w:themeColor="accent2" w:themeTint="97" w:sz="4" w:space="0"/>
         </w:tcBorders>
       </w:tcPr>
@@ -13034,10 +13199,10 @@
       <w:tcPr>
         <w:shd w:val="clear" w:color="ffffff" w:themeColor="light1" w:fill="ffffff" w:themeFill="light1"/>
         <w:tcBorders>
-          <w:top w:val="none"/>
-          <w:left w:val="none"/>
+          <w:top w:val="none" w:color="000000" w:sz="4" w:space="0"/>
+          <w:left w:val="none" w:color="000000" w:sz="4" w:space="0"/>
           <w:bottom w:val="single" w:color="000000" w:themeColor="accent2" w:themeTint="97" w:sz="4" w:space="0"/>
-          <w:right w:val="none"/>
+          <w:right w:val="none" w:color="000000" w:sz="4" w:space="0"/>
         </w:tcBorders>
       </w:tcPr>
     </w:tblStylePr>
@@ -13057,12 +13222,12 @@
         <w:tblBorders/>
       </w:tblPr>
       <w:tcPr>
-        <w:shd w:color="ffffff"/>
+        <w:shd w:val="clear" w:color="ffffff"/>
         <w:tcBorders>
-          <w:top w:val="none"/>
+          <w:top w:val="none" w:color="000000" w:sz="4" w:space="0"/>
           <w:left w:val="single" w:color="000000" w:themeColor="accent2" w:themeTint="97" w:sz="4" w:space="0"/>
-          <w:bottom w:val="none"/>
-          <w:right w:val="none"/>
+          <w:bottom w:val="none" w:color="000000" w:sz="4" w:space="0"/>
+          <w:right w:val="none" w:color="000000" w:sz="4" w:space="0"/>
         </w:tcBorders>
       </w:tcPr>
     </w:tblStylePr>
@@ -13085,9 +13250,9 @@
         <w:shd w:val="clear" w:color="ffffff" w:themeColor="light1" w:fill="ffffff" w:themeFill="light1"/>
         <w:tcBorders>
           <w:top w:val="single" w:color="000000" w:themeColor="accent2" w:themeTint="97" w:sz="4" w:space="0"/>
-          <w:left w:val="none"/>
-          <w:bottom w:val="none"/>
-          <w:right w:val="none"/>
+          <w:left w:val="none" w:color="000000" w:sz="4" w:space="0"/>
+          <w:bottom w:val="none" w:color="000000" w:sz="4" w:space="0"/>
+          <w:right w:val="none" w:color="000000" w:sz="4" w:space="0"/>
         </w:tcBorders>
       </w:tcPr>
     </w:tblStylePr>
@@ -13157,9 +13322,9 @@
       </w:tcPr>
     </w:tblStylePr>
   </w:style>
-  <w:style w:type="table" w:styleId="64">
+  <w:style w:type="table" w:styleId="753">
     <w:name w:val="Grid Table 7 Colorful - Accent 3"/>
-    <w:basedOn w:val="675"/>
+    <w:basedOn w:val="869"/>
     <w:uiPriority w:val="99"/>
     <w:pPr>
       <w:pBdr/>
@@ -13261,11 +13426,11 @@
         <w:tblBorders/>
       </w:tblPr>
       <w:tcPr>
-        <w:shd w:color="ffffff"/>
+        <w:shd w:val="clear" w:color="ffffff"/>
         <w:tcBorders>
-          <w:top w:val="none"/>
-          <w:left w:val="none"/>
-          <w:bottom w:val="none"/>
+          <w:top w:val="none" w:color="000000" w:sz="4" w:space="0"/>
+          <w:left w:val="none" w:color="000000" w:sz="4" w:space="0"/>
+          <w:bottom w:val="none" w:color="000000" w:sz="4" w:space="0"/>
           <w:right w:val="single" w:color="000000" w:themeColor="accent3" w:themeTint="FE" w:sz="4" w:space="0"/>
         </w:tcBorders>
       </w:tcPr>
@@ -13288,10 +13453,10 @@
       <w:tcPr>
         <w:shd w:val="clear" w:color="ffffff" w:themeColor="light1" w:fill="ffffff" w:themeFill="light1"/>
         <w:tcBorders>
-          <w:top w:val="none"/>
-          <w:left w:val="none"/>
+          <w:top w:val="none" w:color="000000" w:sz="4" w:space="0"/>
+          <w:left w:val="none" w:color="000000" w:sz="4" w:space="0"/>
           <w:bottom w:val="single" w:color="000000" w:themeColor="accent3" w:themeTint="FE" w:sz="4" w:space="0"/>
-          <w:right w:val="none"/>
+          <w:right w:val="none" w:color="000000" w:sz="4" w:space="0"/>
         </w:tcBorders>
       </w:tcPr>
     </w:tblStylePr>
@@ -13311,12 +13476,12 @@
         <w:tblBorders/>
       </w:tblPr>
       <w:tcPr>
-        <w:shd w:color="ffffff"/>
+        <w:shd w:val="clear" w:color="ffffff"/>
         <w:tcBorders>
-          <w:top w:val="none"/>
+          <w:top w:val="none" w:color="000000" w:sz="4" w:space="0"/>
           <w:left w:val="single" w:color="000000" w:themeColor="accent3" w:themeTint="FE" w:sz="4" w:space="0"/>
-          <w:bottom w:val="none"/>
-          <w:right w:val="none"/>
+          <w:bottom w:val="none" w:color="000000" w:sz="4" w:space="0"/>
+          <w:right w:val="none" w:color="000000" w:sz="4" w:space="0"/>
         </w:tcBorders>
       </w:tcPr>
     </w:tblStylePr>
@@ -13339,9 +13504,9 @@
         <w:shd w:val="clear" w:color="ffffff" w:themeColor="light1" w:fill="ffffff" w:themeFill="light1"/>
         <w:tcBorders>
           <w:top w:val="single" w:color="000000" w:themeColor="accent3" w:themeTint="FE" w:sz="4" w:space="0"/>
-          <w:left w:val="none"/>
-          <w:bottom w:val="none"/>
-          <w:right w:val="none"/>
+          <w:left w:val="none" w:color="000000" w:sz="4" w:space="0"/>
+          <w:bottom w:val="none" w:color="000000" w:sz="4" w:space="0"/>
+          <w:right w:val="none" w:color="000000" w:sz="4" w:space="0"/>
         </w:tcBorders>
       </w:tcPr>
     </w:tblStylePr>
@@ -13411,9 +13576,9 @@
       </w:tcPr>
     </w:tblStylePr>
   </w:style>
-  <w:style w:type="table" w:styleId="65">
+  <w:style w:type="table" w:styleId="754">
     <w:name w:val="Grid Table 7 Colorful - Accent 4"/>
-    <w:basedOn w:val="675"/>
+    <w:basedOn w:val="869"/>
     <w:uiPriority w:val="99"/>
     <w:pPr>
       <w:pBdr/>
@@ -13515,11 +13680,11 @@
         <w:tblBorders/>
       </w:tblPr>
       <w:tcPr>
-        <w:shd w:color="ffffff"/>
+        <w:shd w:val="clear" w:color="ffffff"/>
         <w:tcBorders>
-          <w:top w:val="none"/>
-          <w:left w:val="none"/>
-          <w:bottom w:val="none"/>
+          <w:top w:val="none" w:color="000000" w:sz="4" w:space="0"/>
+          <w:left w:val="none" w:color="000000" w:sz="4" w:space="0"/>
+          <w:bottom w:val="none" w:color="000000" w:sz="4" w:space="0"/>
           <w:right w:val="single" w:color="000000" w:themeColor="accent4" w:themeTint="9A" w:sz="4" w:space="0"/>
         </w:tcBorders>
       </w:tcPr>
@@ -13542,10 +13707,10 @@
       <w:tcPr>
         <w:shd w:val="clear" w:color="ffffff" w:themeColor="light1" w:fill="ffffff" w:themeFill="light1"/>
         <w:tcBorders>
-          <w:top w:val="none"/>
-          <w:left w:val="none"/>
+          <w:top w:val="none" w:color="000000" w:sz="4" w:space="0"/>
+          <w:left w:val="none" w:color="000000" w:sz="4" w:space="0"/>
           <w:bottom w:val="single" w:color="000000" w:themeColor="accent4" w:themeTint="9A" w:sz="4" w:space="0"/>
-          <w:right w:val="none"/>
+          <w:right w:val="none" w:color="000000" w:sz="4" w:space="0"/>
         </w:tcBorders>
       </w:tcPr>
     </w:tblStylePr>
@@ -13565,12 +13730,12 @@
         <w:tblBorders/>
       </w:tblPr>
       <w:tcPr>
-        <w:shd w:color="ffffff"/>
+        <w:shd w:val="clear" w:color="ffffff"/>
         <w:tcBorders>
-          <w:top w:val="none"/>
+          <w:top w:val="none" w:color="000000" w:sz="4" w:space="0"/>
           <w:left w:val="single" w:color="000000" w:themeColor="accent4" w:themeTint="9A" w:sz="4" w:space="0"/>
-          <w:bottom w:val="none"/>
-          <w:right w:val="none"/>
+          <w:bottom w:val="none" w:color="000000" w:sz="4" w:space="0"/>
+          <w:right w:val="none" w:color="000000" w:sz="4" w:space="0"/>
         </w:tcBorders>
       </w:tcPr>
     </w:tblStylePr>
@@ -13593,9 +13758,9 @@
         <w:shd w:val="clear" w:color="ffffff" w:themeColor="light1" w:fill="ffffff" w:themeFill="light1"/>
         <w:tcBorders>
           <w:top w:val="single" w:color="000000" w:themeColor="accent4" w:themeTint="9A" w:sz="4" w:space="0"/>
-          <w:left w:val="none"/>
-          <w:bottom w:val="none"/>
-          <w:right w:val="none"/>
+          <w:left w:val="none" w:color="000000" w:sz="4" w:space="0"/>
+          <w:bottom w:val="none" w:color="000000" w:sz="4" w:space="0"/>
+          <w:right w:val="none" w:color="000000" w:sz="4" w:space="0"/>
         </w:tcBorders>
       </w:tcPr>
     </w:tblStylePr>
@@ -13665,9 +13830,9 @@
       </w:tcPr>
     </w:tblStylePr>
   </w:style>
-  <w:style w:type="table" w:styleId="66">
+  <w:style w:type="table" w:styleId="755">
     <w:name w:val="Grid Table 7 Colorful - Accent 5"/>
-    <w:basedOn w:val="675"/>
+    <w:basedOn w:val="869"/>
     <w:uiPriority w:val="99"/>
     <w:pPr>
       <w:pBdr/>
@@ -13769,11 +13934,11 @@
         <w:tblBorders/>
       </w:tblPr>
       <w:tcPr>
-        <w:shd w:color="ffffff"/>
+        <w:shd w:val="clear" w:color="ffffff"/>
         <w:tcBorders>
-          <w:top w:val="none"/>
-          <w:left w:val="none"/>
-          <w:bottom w:val="none"/>
+          <w:top w:val="none" w:color="000000" w:sz="4" w:space="0"/>
+          <w:left w:val="none" w:color="000000" w:sz="4" w:space="0"/>
+          <w:bottom w:val="none" w:color="000000" w:sz="4" w:space="0"/>
           <w:right w:val="single" w:color="000000" w:themeColor="accent5" w:themeTint="90" w:sz="4" w:space="0"/>
         </w:tcBorders>
       </w:tcPr>
@@ -13796,10 +13961,10 @@
       <w:tcPr>
         <w:shd w:val="clear" w:color="ffffff" w:themeColor="light1" w:fill="ffffff" w:themeFill="light1"/>
         <w:tcBorders>
-          <w:top w:val="none"/>
-          <w:left w:val="none"/>
+          <w:top w:val="none" w:color="000000" w:sz="4" w:space="0"/>
+          <w:left w:val="none" w:color="000000" w:sz="4" w:space="0"/>
           <w:bottom w:val="single" w:color="000000" w:themeColor="accent5" w:themeTint="90" w:sz="4" w:space="0"/>
-          <w:right w:val="none"/>
+          <w:right w:val="none" w:color="000000" w:sz="4" w:space="0"/>
         </w:tcBorders>
       </w:tcPr>
     </w:tblStylePr>
@@ -13819,12 +13984,12 @@
         <w:tblBorders/>
       </w:tblPr>
       <w:tcPr>
-        <w:shd w:color="ffffff"/>
+        <w:shd w:val="clear" w:color="ffffff"/>
         <w:tcBorders>
-          <w:top w:val="none"/>
+          <w:top w:val="none" w:color="000000" w:sz="4" w:space="0"/>
           <w:left w:val="single" w:color="000000" w:themeColor="accent5" w:themeTint="90" w:sz="4" w:space="0"/>
-          <w:bottom w:val="none"/>
-          <w:right w:val="none"/>
+          <w:bottom w:val="none" w:color="000000" w:sz="4" w:space="0"/>
+          <w:right w:val="none" w:color="000000" w:sz="4" w:space="0"/>
         </w:tcBorders>
       </w:tcPr>
     </w:tblStylePr>
@@ -13847,9 +14012,9 @@
         <w:shd w:val="clear" w:color="ffffff" w:themeColor="light1" w:fill="ffffff" w:themeFill="light1"/>
         <w:tcBorders>
           <w:top w:val="single" w:color="000000" w:themeColor="accent5" w:themeTint="90" w:sz="4" w:space="0"/>
-          <w:left w:val="none"/>
-          <w:bottom w:val="none"/>
-          <w:right w:val="none"/>
+          <w:left w:val="none" w:color="000000" w:sz="4" w:space="0"/>
+          <w:bottom w:val="none" w:color="000000" w:sz="4" w:space="0"/>
+          <w:right w:val="none" w:color="000000" w:sz="4" w:space="0"/>
         </w:tcBorders>
       </w:tcPr>
     </w:tblStylePr>
@@ -13919,9 +14084,9 @@
       </w:tcPr>
     </w:tblStylePr>
   </w:style>
-  <w:style w:type="table" w:styleId="67">
+  <w:style w:type="table" w:styleId="756">
     <w:name w:val="Grid Table 7 Colorful - Accent 6"/>
-    <w:basedOn w:val="675"/>
+    <w:basedOn w:val="869"/>
     <w:uiPriority w:val="99"/>
     <w:pPr>
       <w:pBdr/>
@@ -14023,11 +14188,11 @@
         <w:tblBorders/>
       </w:tblPr>
       <w:tcPr>
-        <w:shd w:color="ffffff"/>
+        <w:shd w:val="clear" w:color="ffffff"/>
         <w:tcBorders>
-          <w:top w:val="none"/>
-          <w:left w:val="none"/>
-          <w:bottom w:val="none"/>
+          <w:top w:val="none" w:color="000000" w:sz="4" w:space="0"/>
+          <w:left w:val="none" w:color="000000" w:sz="4" w:space="0"/>
+          <w:bottom w:val="none" w:color="000000" w:sz="4" w:space="0"/>
           <w:right w:val="single" w:color="000000" w:themeColor="accent6" w:themeTint="90" w:sz="4" w:space="0"/>
         </w:tcBorders>
       </w:tcPr>
@@ -14050,10 +14215,10 @@
       <w:tcPr>
         <w:shd w:val="clear" w:color="ffffff" w:themeColor="light1" w:fill="ffffff" w:themeFill="light1"/>
         <w:tcBorders>
-          <w:top w:val="none"/>
-          <w:left w:val="none"/>
+          <w:top w:val="none" w:color="000000" w:sz="4" w:space="0"/>
+          <w:left w:val="none" w:color="000000" w:sz="4" w:space="0"/>
           <w:bottom w:val="single" w:color="000000" w:themeColor="accent6" w:themeTint="90" w:sz="4" w:space="0"/>
-          <w:right w:val="none"/>
+          <w:right w:val="none" w:color="000000" w:sz="4" w:space="0"/>
         </w:tcBorders>
       </w:tcPr>
     </w:tblStylePr>
@@ -14073,12 +14238,12 @@
         <w:tblBorders/>
       </w:tblPr>
       <w:tcPr>
-        <w:shd w:color="ffffff"/>
+        <w:shd w:val="clear" w:color="ffffff"/>
         <w:tcBorders>
-          <w:top w:val="none"/>
+          <w:top w:val="none" w:color="000000" w:sz="4" w:space="0"/>
           <w:left w:val="single" w:color="000000" w:themeColor="accent6" w:themeTint="90" w:sz="4" w:space="0"/>
-          <w:bottom w:val="none"/>
-          <w:right w:val="none"/>
+          <w:bottom w:val="none" w:color="000000" w:sz="4" w:space="0"/>
+          <w:right w:val="none" w:color="000000" w:sz="4" w:space="0"/>
         </w:tcBorders>
       </w:tcPr>
     </w:tblStylePr>
@@ -14101,9 +14266,9 @@
         <w:shd w:val="clear" w:color="ffffff" w:themeColor="light1" w:fill="ffffff" w:themeFill="light1"/>
         <w:tcBorders>
           <w:top w:val="single" w:color="000000" w:themeColor="accent6" w:themeTint="90" w:sz="4" w:space="0"/>
-          <w:left w:val="none"/>
-          <w:bottom w:val="none"/>
-          <w:right w:val="none"/>
+          <w:left w:val="none" w:color="000000" w:sz="4" w:space="0"/>
+          <w:bottom w:val="none" w:color="000000" w:sz="4" w:space="0"/>
+          <w:right w:val="none" w:color="000000" w:sz="4" w:space="0"/>
         </w:tcBorders>
       </w:tcPr>
     </w:tblStylePr>
@@ -14173,9 +14338,9 @@
       </w:tcPr>
     </w:tblStylePr>
   </w:style>
-  <w:style w:type="table" w:styleId="68">
+  <w:style w:type="table" w:styleId="757">
     <w:name w:val="List Table 1 Light"/>
-    <w:basedOn w:val="675"/>
+    <w:basedOn w:val="869"/>
     <w:uiPriority w:val="99"/>
     <w:pPr>
       <w:pBdr/>
@@ -14389,9 +14554,9 @@
       </w:tcPr>
     </w:tblStylePr>
   </w:style>
-  <w:style w:type="table" w:styleId="69">
+  <w:style w:type="table" w:styleId="758">
     <w:name w:val="List Table 1 Light - Accent 1"/>
-    <w:basedOn w:val="675"/>
+    <w:basedOn w:val="869"/>
     <w:uiPriority w:val="99"/>
     <w:pPr>
       <w:pBdr/>
@@ -14605,9 +14770,9 @@
       </w:tcPr>
     </w:tblStylePr>
   </w:style>
-  <w:style w:type="table" w:styleId="70">
+  <w:style w:type="table" w:styleId="759">
     <w:name w:val="List Table 1 Light - Accent 2"/>
-    <w:basedOn w:val="675"/>
+    <w:basedOn w:val="869"/>
     <w:uiPriority w:val="99"/>
     <w:pPr>
       <w:pBdr/>
@@ -14821,9 +14986,9 @@
       </w:tcPr>
     </w:tblStylePr>
   </w:style>
-  <w:style w:type="table" w:styleId="71">
+  <w:style w:type="table" w:styleId="760">
     <w:name w:val="List Table 1 Light - Accent 3"/>
-    <w:basedOn w:val="675"/>
+    <w:basedOn w:val="869"/>
     <w:uiPriority w:val="99"/>
     <w:pPr>
       <w:pBdr/>
@@ -15037,9 +15202,9 @@
       </w:tcPr>
     </w:tblStylePr>
   </w:style>
-  <w:style w:type="table" w:styleId="72">
+  <w:style w:type="table" w:styleId="761">
     <w:name w:val="List Table 1 Light - Accent 4"/>
-    <w:basedOn w:val="675"/>
+    <w:basedOn w:val="869"/>
     <w:uiPriority w:val="99"/>
     <w:pPr>
       <w:pBdr/>
@@ -15253,9 +15418,9 @@
       </w:tcPr>
     </w:tblStylePr>
   </w:style>
-  <w:style w:type="table" w:styleId="73">
+  <w:style w:type="table" w:styleId="762">
     <w:name w:val="List Table 1 Light - Accent 5"/>
-    <w:basedOn w:val="675"/>
+    <w:basedOn w:val="869"/>
     <w:uiPriority w:val="99"/>
     <w:pPr>
       <w:pBdr/>
@@ -15469,9 +15634,9 @@
       </w:tcPr>
     </w:tblStylePr>
   </w:style>
-  <w:style w:type="table" w:styleId="74">
+  <w:style w:type="table" w:styleId="763">
     <w:name w:val="List Table 1 Light - Accent 6"/>
-    <w:basedOn w:val="675"/>
+    <w:basedOn w:val="869"/>
     <w:uiPriority w:val="99"/>
     <w:pPr>
       <w:pBdr/>
@@ -15685,9 +15850,9 @@
       </w:tcPr>
     </w:tblStylePr>
   </w:style>
-  <w:style w:type="table" w:styleId="75">
+  <w:style w:type="table" w:styleId="764">
     <w:name w:val="List Table 2"/>
-    <w:basedOn w:val="675"/>
+    <w:basedOn w:val="869"/>
     <w:uiPriority w:val="99"/>
     <w:pPr>
       <w:pBdr/>
@@ -15923,9 +16088,9 @@
       </w:tcPr>
     </w:tblStylePr>
   </w:style>
-  <w:style w:type="table" w:styleId="76">
+  <w:style w:type="table" w:styleId="765">
     <w:name w:val="List Table 2 - Accent 1"/>
-    <w:basedOn w:val="675"/>
+    <w:basedOn w:val="869"/>
     <w:uiPriority w:val="99"/>
     <w:pPr>
       <w:pBdr/>
@@ -16161,9 +16326,9 @@
       </w:tcPr>
     </w:tblStylePr>
   </w:style>
-  <w:style w:type="table" w:styleId="77">
+  <w:style w:type="table" w:styleId="766">
     <w:name w:val="List Table 2 - Accent 2"/>
-    <w:basedOn w:val="675"/>
+    <w:basedOn w:val="869"/>
     <w:uiPriority w:val="99"/>
     <w:pPr>
       <w:pBdr/>
@@ -16399,9 +16564,9 @@
       </w:tcPr>
     </w:tblStylePr>
   </w:style>
-  <w:style w:type="table" w:styleId="78">
+  <w:style w:type="table" w:styleId="767">
     <w:name w:val="List Table 2 - Accent 3"/>
-    <w:basedOn w:val="675"/>
+    <w:basedOn w:val="869"/>
     <w:uiPriority w:val="99"/>
     <w:pPr>
       <w:pBdr/>
@@ -16637,9 +16802,9 @@
       </w:tcPr>
     </w:tblStylePr>
   </w:style>
-  <w:style w:type="table" w:styleId="79">
+  <w:style w:type="table" w:styleId="768">
     <w:name w:val="List Table 2 - Accent 4"/>
-    <w:basedOn w:val="675"/>
+    <w:basedOn w:val="869"/>
     <w:uiPriority w:val="99"/>
     <w:pPr>
       <w:pBdr/>
@@ -16875,9 +17040,9 @@
       </w:tcPr>
     </w:tblStylePr>
   </w:style>
-  <w:style w:type="table" w:styleId="80">
+  <w:style w:type="table" w:styleId="769">
     <w:name w:val="List Table 2 - Accent 5"/>
-    <w:basedOn w:val="675"/>
+    <w:basedOn w:val="869"/>
     <w:uiPriority w:val="99"/>
     <w:pPr>
       <w:pBdr/>
@@ -17113,9 +17278,9 @@
       </w:tcPr>
     </w:tblStylePr>
   </w:style>
-  <w:style w:type="table" w:styleId="81">
+  <w:style w:type="table" w:styleId="770">
     <w:name w:val="List Table 2 - Accent 6"/>
-    <w:basedOn w:val="675"/>
+    <w:basedOn w:val="869"/>
     <w:uiPriority w:val="99"/>
     <w:pPr>
       <w:pBdr/>
@@ -17351,9 +17516,9 @@
       </w:tcPr>
     </w:tblStylePr>
   </w:style>
-  <w:style w:type="table" w:styleId="82">
+  <w:style w:type="table" w:styleId="771">
     <w:name w:val="List Table 3"/>
-    <w:basedOn w:val="675"/>
+    <w:basedOn w:val="869"/>
     <w:uiPriority w:val="99"/>
     <w:pPr>
       <w:pBdr/>
@@ -17579,9 +17744,9 @@
       </w:tcPr>
     </w:tblStylePr>
   </w:style>
-  <w:style w:type="table" w:styleId="83">
+  <w:style w:type="table" w:styleId="772">
     <w:name w:val="List Table 3 - Accent 1"/>
-    <w:basedOn w:val="675"/>
+    <w:basedOn w:val="869"/>
     <w:uiPriority w:val="99"/>
     <w:pPr>
       <w:pBdr/>
@@ -17807,9 +17972,9 @@
       </w:tcPr>
     </w:tblStylePr>
   </w:style>
-  <w:style w:type="table" w:styleId="84">
+  <w:style w:type="table" w:styleId="773">
     <w:name w:val="List Table 3 - Accent 2"/>
-    <w:basedOn w:val="675"/>
+    <w:basedOn w:val="869"/>
     <w:uiPriority w:val="99"/>
     <w:pPr>
       <w:pBdr/>
@@ -18035,9 +18200,9 @@
       </w:tcPr>
     </w:tblStylePr>
   </w:style>
-  <w:style w:type="table" w:styleId="85">
+  <w:style w:type="table" w:styleId="774">
     <w:name w:val="List Table 3 - Accent 3"/>
-    <w:basedOn w:val="675"/>
+    <w:basedOn w:val="869"/>
     <w:uiPriority w:val="99"/>
     <w:pPr>
       <w:pBdr/>
@@ -18263,9 +18428,9 @@
       </w:tcPr>
     </w:tblStylePr>
   </w:style>
-  <w:style w:type="table" w:styleId="86">
+  <w:style w:type="table" w:styleId="775">
     <w:name w:val="List Table 3 - Accent 4"/>
-    <w:basedOn w:val="675"/>
+    <w:basedOn w:val="869"/>
     <w:uiPriority w:val="99"/>
     <w:pPr>
       <w:pBdr/>
@@ -18491,9 +18656,9 @@
       </w:tcPr>
     </w:tblStylePr>
   </w:style>
-  <w:style w:type="table" w:styleId="87">
+  <w:style w:type="table" w:styleId="776">
     <w:name w:val="List Table 3 - Accent 5"/>
-    <w:basedOn w:val="675"/>
+    <w:basedOn w:val="869"/>
     <w:uiPriority w:val="99"/>
     <w:pPr>
       <w:pBdr/>
@@ -18719,9 +18884,9 @@
       </w:tcPr>
     </w:tblStylePr>
   </w:style>
-  <w:style w:type="table" w:styleId="88">
+  <w:style w:type="table" w:styleId="777">
     <w:name w:val="List Table 3 - Accent 6"/>
-    <w:basedOn w:val="675"/>
+    <w:basedOn w:val="869"/>
     <w:uiPriority w:val="99"/>
     <w:pPr>
       <w:pBdr/>
@@ -18947,9 +19112,9 @@
       </w:tcPr>
     </w:tblStylePr>
   </w:style>
-  <w:style w:type="table" w:styleId="89">
+  <w:style w:type="table" w:styleId="778">
     <w:name w:val="List Table 4"/>
-    <w:basedOn w:val="675"/>
+    <w:basedOn w:val="869"/>
     <w:uiPriority w:val="99"/>
     <w:pPr>
       <w:pBdr/>
@@ -19172,9 +19337,9 @@
       </w:tcPr>
     </w:tblStylePr>
   </w:style>
-  <w:style w:type="table" w:styleId="90">
+  <w:style w:type="table" w:styleId="779">
     <w:name w:val="List Table 4 - Accent 1"/>
-    <w:basedOn w:val="675"/>
+    <w:basedOn w:val="869"/>
     <w:uiPriority w:val="99"/>
     <w:pPr>
       <w:pBdr/>
@@ -19397,9 +19562,9 @@
       </w:tcPr>
     </w:tblStylePr>
   </w:style>
-  <w:style w:type="table" w:styleId="91">
+  <w:style w:type="table" w:styleId="780">
     <w:name w:val="List Table 4 - Accent 2"/>
-    <w:basedOn w:val="675"/>
+    <w:basedOn w:val="869"/>
     <w:uiPriority w:val="99"/>
     <w:pPr>
       <w:pBdr/>
@@ -19622,9 +19787,9 @@
       </w:tcPr>
     </w:tblStylePr>
   </w:style>
-  <w:style w:type="table" w:styleId="92">
+  <w:style w:type="table" w:styleId="781">
     <w:name w:val="List Table 4 - Accent 3"/>
-    <w:basedOn w:val="675"/>
+    <w:basedOn w:val="869"/>
     <w:uiPriority w:val="99"/>
     <w:pPr>
       <w:pBdr/>
@@ -19847,9 +20012,9 @@
       </w:tcPr>
     </w:tblStylePr>
   </w:style>
-  <w:style w:type="table" w:styleId="93">
+  <w:style w:type="table" w:styleId="782">
     <w:name w:val="List Table 4 - Accent 4"/>
-    <w:basedOn w:val="675"/>
+    <w:basedOn w:val="869"/>
     <w:uiPriority w:val="99"/>
     <w:pPr>
       <w:pBdr/>
@@ -20072,9 +20237,9 @@
       </w:tcPr>
     </w:tblStylePr>
   </w:style>
-  <w:style w:type="table" w:styleId="94">
+  <w:style w:type="table" w:styleId="783">
     <w:name w:val="List Table 4 - Accent 5"/>
-    <w:basedOn w:val="675"/>
+    <w:basedOn w:val="869"/>
     <w:uiPriority w:val="99"/>
     <w:pPr>
       <w:pBdr/>
@@ -20297,9 +20462,9 @@
       </w:tcPr>
     </w:tblStylePr>
   </w:style>
-  <w:style w:type="table" w:styleId="95">
+  <w:style w:type="table" w:styleId="784">
     <w:name w:val="List Table 4 - Accent 6"/>
-    <w:basedOn w:val="675"/>
+    <w:basedOn w:val="869"/>
     <w:uiPriority w:val="99"/>
     <w:pPr>
       <w:pBdr/>
@@ -20522,9 +20687,9 @@
       </w:tcPr>
     </w:tblStylePr>
   </w:style>
-  <w:style w:type="table" w:styleId="96">
+  <w:style w:type="table" w:styleId="785">
     <w:name w:val="List Table 5 Dark"/>
-    <w:basedOn w:val="675"/>
+    <w:basedOn w:val="869"/>
     <w:uiPriority w:val="99"/>
     <w:pPr>
       <w:pBdr/>
@@ -20764,9 +20929,9 @@
       </w:tcPr>
     </w:tblStylePr>
   </w:style>
-  <w:style w:type="table" w:styleId="97">
+  <w:style w:type="table" w:styleId="786">
     <w:name w:val="List Table 5 Dark - Accent 1"/>
-    <w:basedOn w:val="675"/>
+    <w:basedOn w:val="869"/>
     <w:uiPriority w:val="99"/>
     <w:pPr>
       <w:pBdr/>
@@ -21006,9 +21171,9 @@
       </w:tcPr>
     </w:tblStylePr>
   </w:style>
-  <w:style w:type="table" w:styleId="98">
+  <w:style w:type="table" w:styleId="787">
     <w:name w:val="List Table 5 Dark - Accent 2"/>
-    <w:basedOn w:val="675"/>
+    <w:basedOn w:val="869"/>
     <w:uiPriority w:val="99"/>
     <w:pPr>
       <w:pBdr/>
@@ -21248,9 +21413,9 @@
       </w:tcPr>
     </w:tblStylePr>
   </w:style>
-  <w:style w:type="table" w:styleId="99">
+  <w:style w:type="table" w:styleId="788">
     <w:name w:val="List Table 5 Dark - Accent 3"/>
-    <w:basedOn w:val="675"/>
+    <w:basedOn w:val="869"/>
     <w:uiPriority w:val="99"/>
     <w:pPr>
       <w:pBdr/>
@@ -21490,9 +21655,9 @@
       </w:tcPr>
     </w:tblStylePr>
   </w:style>
-  <w:style w:type="table" w:styleId="100">
+  <w:style w:type="table" w:styleId="789">
     <w:name w:val="List Table 5 Dark - Accent 4"/>
-    <w:basedOn w:val="675"/>
+    <w:basedOn w:val="869"/>
     <w:uiPriority w:val="99"/>
     <w:pPr>
       <w:pBdr/>
@@ -21732,9 +21897,9 @@
       </w:tcPr>
     </w:tblStylePr>
   </w:style>
-  <w:style w:type="table" w:styleId="101">
+  <w:style w:type="table" w:styleId="790">
     <w:name w:val="List Table 5 Dark - Accent 5"/>
-    <w:basedOn w:val="675"/>
+    <w:basedOn w:val="869"/>
     <w:uiPriority w:val="99"/>
     <w:pPr>
       <w:pBdr/>
@@ -21974,9 +22139,9 @@
       </w:tcPr>
     </w:tblStylePr>
   </w:style>
-  <w:style w:type="table" w:styleId="102">
+  <w:style w:type="table" w:styleId="791">
     <w:name w:val="List Table 5 Dark - Accent 6"/>
-    <w:basedOn w:val="675"/>
+    <w:basedOn w:val="869"/>
     <w:uiPriority w:val="99"/>
     <w:pPr>
       <w:pBdr/>
@@ -22216,9 +22381,9 @@
       </w:tcPr>
     </w:tblStylePr>
   </w:style>
-  <w:style w:type="table" w:styleId="103">
+  <w:style w:type="table" w:styleId="792">
     <w:name w:val="List Table 6 Colorful"/>
-    <w:basedOn w:val="675"/>
+    <w:basedOn w:val="869"/>
     <w:uiPriority w:val="99"/>
     <w:pPr>
       <w:pBdr/>
@@ -22439,9 +22604,9 @@
       </w:tcPr>
     </w:tblStylePr>
   </w:style>
-  <w:style w:type="table" w:styleId="104">
+  <w:style w:type="table" w:styleId="793">
     <w:name w:val="List Table 6 Colorful - Accent 1"/>
-    <w:basedOn w:val="675"/>
+    <w:basedOn w:val="869"/>
     <w:uiPriority w:val="99"/>
     <w:pPr>
       <w:pBdr/>
@@ -22662,9 +22827,9 @@
       </w:tcPr>
     </w:tblStylePr>
   </w:style>
-  <w:style w:type="table" w:styleId="105">
+  <w:style w:type="table" w:styleId="794">
     <w:name w:val="List Table 6 Colorful - Accent 2"/>
-    <w:basedOn w:val="675"/>
+    <w:basedOn w:val="869"/>
     <w:uiPriority w:val="99"/>
     <w:pPr>
       <w:pBdr/>
@@ -22885,9 +23050,9 @@
       </w:tcPr>
     </w:tblStylePr>
   </w:style>
-  <w:style w:type="table" w:styleId="106">
+  <w:style w:type="table" w:styleId="795">
     <w:name w:val="List Table 6 Colorful - Accent 3"/>
-    <w:basedOn w:val="675"/>
+    <w:basedOn w:val="869"/>
     <w:uiPriority w:val="99"/>
     <w:pPr>
       <w:pBdr/>
@@ -23108,9 +23273,9 @@
       </w:tcPr>
     </w:tblStylePr>
   </w:style>
-  <w:style w:type="table" w:styleId="107">
+  <w:style w:type="table" w:styleId="796">
     <w:name w:val="List Table 6 Colorful - Accent 4"/>
-    <w:basedOn w:val="675"/>
+    <w:basedOn w:val="869"/>
     <w:uiPriority w:val="99"/>
     <w:pPr>
       <w:pBdr/>
@@ -23331,9 +23496,9 @@
       </w:tcPr>
     </w:tblStylePr>
   </w:style>
-  <w:style w:type="table" w:styleId="108">
+  <w:style w:type="table" w:styleId="797">
     <w:name w:val="List Table 6 Colorful - Accent 5"/>
-    <w:basedOn w:val="675"/>
+    <w:basedOn w:val="869"/>
     <w:uiPriority w:val="99"/>
     <w:pPr>
       <w:pBdr/>
@@ -23554,9 +23719,9 @@
       </w:tcPr>
     </w:tblStylePr>
   </w:style>
-  <w:style w:type="table" w:styleId="109">
+  <w:style w:type="table" w:styleId="798">
     <w:name w:val="List Table 6 Colorful - Accent 6"/>
-    <w:basedOn w:val="675"/>
+    <w:basedOn w:val="869"/>
     <w:uiPriority w:val="99"/>
     <w:pPr>
       <w:pBdr/>
@@ -23777,9 +23942,9 @@
       </w:tcPr>
     </w:tblStylePr>
   </w:style>
-  <w:style w:type="table" w:styleId="110">
+  <w:style w:type="table" w:styleId="799">
     <w:name w:val="List Table 7 Colorful"/>
-    <w:basedOn w:val="675"/>
+    <w:basedOn w:val="869"/>
     <w:uiPriority w:val="99"/>
     <w:pPr>
       <w:pBdr/>
@@ -23878,11 +24043,11 @@
         <w:tblBorders/>
       </w:tblPr>
       <w:tcPr>
-        <w:shd w:color="ffffff"/>
+        <w:shd w:val="clear" w:color="ffffff"/>
         <w:tcBorders>
-          <w:top w:val="none"/>
-          <w:left w:val="none"/>
-          <w:bottom w:val="none"/>
+          <w:top w:val="none" w:color="000000" w:sz="4" w:space="0"/>
+          <w:left w:val="none" w:color="000000" w:sz="4" w:space="0"/>
+          <w:bottom w:val="none" w:color="000000" w:sz="4" w:space="0"/>
           <w:right w:val="single" w:color="000000" w:themeColor="text1" w:themeTint="80" w:sz="4" w:space="0"/>
         </w:tcBorders>
       </w:tcPr>
@@ -23905,10 +24070,10 @@
       <w:tcPr>
         <w:shd w:val="clear" w:color="ffffff" w:themeColor="light1" w:fill="ffffff" w:themeFill="light1"/>
         <w:tcBorders>
-          <w:top w:val="none"/>
-          <w:left w:val="none"/>
+          <w:top w:val="none" w:color="000000" w:sz="4" w:space="0"/>
+          <w:left w:val="none" w:color="000000" w:sz="4" w:space="0"/>
           <w:bottom w:val="single" w:color="000000" w:themeColor="text1" w:themeTint="80" w:sz="4" w:space="0"/>
-          <w:right w:val="none"/>
+          <w:right w:val="none" w:color="000000" w:sz="4" w:space="0"/>
         </w:tcBorders>
       </w:tcPr>
     </w:tblStylePr>
@@ -23928,12 +24093,12 @@
         <w:tblBorders/>
       </w:tblPr>
       <w:tcPr>
-        <w:shd w:color="ffffff"/>
+        <w:shd w:val="clear" w:color="ffffff"/>
         <w:tcBorders>
-          <w:top w:val="none"/>
+          <w:top w:val="none" w:color="000000" w:sz="4" w:space="0"/>
           <w:left w:val="single" w:color="000000" w:themeColor="text1" w:themeTint="80" w:sz="4" w:space="0"/>
-          <w:bottom w:val="none"/>
-          <w:right w:val="none"/>
+          <w:bottom w:val="none" w:color="000000" w:sz="4" w:space="0"/>
+          <w:right w:val="none" w:color="000000" w:sz="4" w:space="0"/>
         </w:tcBorders>
       </w:tcPr>
     </w:tblStylePr>
@@ -23956,9 +24121,9 @@
         <w:shd w:val="clear" w:color="ffffff" w:themeColor="light1" w:fill="ffffff" w:themeFill="light1"/>
         <w:tcBorders>
           <w:top w:val="single" w:color="000000" w:themeColor="text1" w:themeTint="80" w:sz="4" w:space="0"/>
-          <w:left w:val="none"/>
-          <w:bottom w:val="none"/>
-          <w:right w:val="none"/>
+          <w:left w:val="none" w:color="000000" w:sz="4" w:space="0"/>
+          <w:bottom w:val="none" w:color="000000" w:sz="4" w:space="0"/>
+          <w:right w:val="none" w:color="000000" w:sz="4" w:space="0"/>
         </w:tcBorders>
       </w:tcPr>
     </w:tblStylePr>
@@ -24033,9 +24198,9 @@
       </w:tcPr>
     </w:tblStylePr>
   </w:style>
-  <w:style w:type="table" w:styleId="111">
+  <w:style w:type="table" w:styleId="800">
     <w:name w:val="List Table 7 Colorful - Accent 1"/>
-    <w:basedOn w:val="675"/>
+    <w:basedOn w:val="869"/>
     <w:uiPriority w:val="99"/>
     <w:pPr>
       <w:pBdr/>
@@ -24134,11 +24299,11 @@
         <w:tblBorders/>
       </w:tblPr>
       <w:tcPr>
-        <w:shd w:color="ffffff"/>
+        <w:shd w:val="clear" w:color="ffffff"/>
         <w:tcBorders>
-          <w:top w:val="none"/>
-          <w:left w:val="none"/>
-          <w:bottom w:val="none"/>
+          <w:top w:val="none" w:color="000000" w:sz="4" w:space="0"/>
+          <w:left w:val="none" w:color="000000" w:sz="4" w:space="0"/>
+          <w:bottom w:val="none" w:color="000000" w:sz="4" w:space="0"/>
           <w:right w:val="single" w:color="000000" w:themeColor="accent1" w:sz="4" w:space="0"/>
         </w:tcBorders>
       </w:tcPr>
@@ -24161,10 +24326,10 @@
       <w:tcPr>
         <w:shd w:val="clear" w:color="ffffff" w:themeColor="light1" w:fill="ffffff" w:themeFill="light1"/>
         <w:tcBorders>
-          <w:top w:val="none"/>
-          <w:left w:val="none"/>
+          <w:top w:val="none" w:color="000000" w:sz="4" w:space="0"/>
+          <w:left w:val="none" w:color="000000" w:sz="4" w:space="0"/>
           <w:bottom w:val="single" w:color="000000" w:themeColor="accent1" w:sz="4" w:space="0"/>
-          <w:right w:val="none"/>
+          <w:right w:val="none" w:color="000000" w:sz="4" w:space="0"/>
         </w:tcBorders>
       </w:tcPr>
     </w:tblStylePr>
@@ -24184,12 +24349,12 @@
         <w:tblBorders/>
       </w:tblPr>
       <w:tcPr>
-        <w:shd w:color="ffffff"/>
+        <w:shd w:val="clear" w:color="ffffff"/>
         <w:tcBorders>
-          <w:top w:val="none"/>
+          <w:top w:val="none" w:color="000000" w:sz="4" w:space="0"/>
           <w:left w:val="single" w:color="000000" w:themeColor="accent1" w:sz="4" w:space="0"/>
-          <w:bottom w:val="none"/>
-          <w:right w:val="none"/>
+          <w:bottom w:val="none" w:color="000000" w:sz="4" w:space="0"/>
+          <w:right w:val="none" w:color="000000" w:sz="4" w:space="0"/>
         </w:tcBorders>
       </w:tcPr>
     </w:tblStylePr>
@@ -24212,9 +24377,9 @@
         <w:shd w:val="clear" w:color="ffffff" w:themeColor="light1" w:fill="ffffff" w:themeFill="light1"/>
         <w:tcBorders>
           <w:top w:val="single" w:color="000000" w:themeColor="accent1" w:sz="4" w:space="0"/>
-          <w:left w:val="none"/>
-          <w:bottom w:val="none"/>
-          <w:right w:val="none"/>
+          <w:left w:val="none" w:color="000000" w:sz="4" w:space="0"/>
+          <w:bottom w:val="none" w:color="000000" w:sz="4" w:space="0"/>
+          <w:right w:val="none" w:color="000000" w:sz="4" w:space="0"/>
         </w:tcBorders>
       </w:tcPr>
     </w:tblStylePr>
@@ -24289,9 +24454,9 @@
       </w:tcPr>
     </w:tblStylePr>
   </w:style>
-  <w:style w:type="table" w:styleId="112">
+  <w:style w:type="table" w:styleId="801">
     <w:name w:val="List Table 7 Colorful - Accent 2"/>
-    <w:basedOn w:val="675"/>
+    <w:basedOn w:val="869"/>
     <w:uiPriority w:val="99"/>
     <w:pPr>
       <w:pBdr/>
@@ -24390,11 +24555,11 @@
         <w:tblBorders/>
       </w:tblPr>
       <w:tcPr>
-        <w:shd w:color="ffffff"/>
+        <w:shd w:val="clear" w:color="ffffff"/>
         <w:tcBorders>
-          <w:top w:val="none"/>
-          <w:left w:val="none"/>
-          <w:bottom w:val="none"/>
+          <w:top w:val="none" w:color="000000" w:sz="4" w:space="0"/>
+          <w:left w:val="none" w:color="000000" w:sz="4" w:space="0"/>
+          <w:bottom w:val="none" w:color="000000" w:sz="4" w:space="0"/>
           <w:right w:val="single" w:color="000000" w:themeColor="accent2" w:themeTint="97" w:sz="4" w:space="0"/>
         </w:tcBorders>
       </w:tcPr>
@@ -24417,10 +24582,10 @@
       <w:tcPr>
         <w:shd w:val="clear" w:color="ffffff" w:themeColor="light1" w:fill="ffffff" w:themeFill="light1"/>
         <w:tcBorders>
-          <w:top w:val="none"/>
-          <w:left w:val="none"/>
+          <w:top w:val="none" w:color="000000" w:sz="4" w:space="0"/>
+          <w:left w:val="none" w:color="000000" w:sz="4" w:space="0"/>
           <w:bottom w:val="single" w:color="000000" w:themeColor="accent2" w:themeTint="97" w:sz="4" w:space="0"/>
-          <w:right w:val="none"/>
+          <w:right w:val="none" w:color="000000" w:sz="4" w:space="0"/>
         </w:tcBorders>
       </w:tcPr>
     </w:tblStylePr>
@@ -24440,12 +24605,12 @@
         <w:tblBorders/>
       </w:tblPr>
       <w:tcPr>
-        <w:shd w:color="ffffff"/>
+        <w:shd w:val="clear" w:color="ffffff"/>
         <w:tcBorders>
-          <w:top w:val="none"/>
+          <w:top w:val="none" w:color="000000" w:sz="4" w:space="0"/>
           <w:left w:val="single" w:color="000000" w:themeColor="accent2" w:themeTint="97" w:sz="4" w:space="0"/>
-          <w:bottom w:val="none"/>
-          <w:right w:val="none"/>
+          <w:bottom w:val="none" w:color="000000" w:sz="4" w:space="0"/>
+          <w:right w:val="none" w:color="000000" w:sz="4" w:space="0"/>
         </w:tcBorders>
       </w:tcPr>
     </w:tblStylePr>
@@ -24468,9 +24633,9 @@
         <w:shd w:val="clear" w:color="ffffff" w:themeColor="light1" w:fill="ffffff" w:themeFill="light1"/>
         <w:tcBorders>
           <w:top w:val="single" w:color="000000" w:themeColor="accent2" w:themeTint="97" w:sz="4" w:space="0"/>
-          <w:left w:val="none"/>
-          <w:bottom w:val="none"/>
-          <w:right w:val="none"/>
+          <w:left w:val="none" w:color="000000" w:sz="4" w:space="0"/>
+          <w:bottom w:val="none" w:color="000000" w:sz="4" w:space="0"/>
+          <w:right w:val="none" w:color="000000" w:sz="4" w:space="0"/>
         </w:tcBorders>
       </w:tcPr>
     </w:tblStylePr>
@@ -24545,9 +24710,9 @@
       </w:tcPr>
     </w:tblStylePr>
   </w:style>
-  <w:style w:type="table" w:styleId="113">
+  <w:style w:type="table" w:styleId="802">
     <w:name w:val="List Table 7 Colorful - Accent 3"/>
-    <w:basedOn w:val="675"/>
+    <w:basedOn w:val="869"/>
     <w:uiPriority w:val="99"/>
     <w:pPr>
       <w:pBdr/>
@@ -24646,11 +24811,11 @@
         <w:tblBorders/>
       </w:tblPr>
       <w:tcPr>
-        <w:shd w:color="ffffff"/>
+        <w:shd w:val="clear" w:color="ffffff"/>
         <w:tcBorders>
-          <w:top w:val="none"/>
-          <w:left w:val="none"/>
-          <w:bottom w:val="none"/>
+          <w:top w:val="none" w:color="000000" w:sz="4" w:space="0"/>
+          <w:left w:val="none" w:color="000000" w:sz="4" w:space="0"/>
+          <w:bottom w:val="none" w:color="000000" w:sz="4" w:space="0"/>
           <w:right w:val="single" w:color="000000" w:themeColor="accent3" w:themeTint="98" w:sz="4" w:space="0"/>
         </w:tcBorders>
       </w:tcPr>
@@ -24673,10 +24838,10 @@
       <w:tcPr>
         <w:shd w:val="clear" w:color="ffffff" w:themeColor="light1" w:fill="ffffff" w:themeFill="light1"/>
         <w:tcBorders>
-          <w:top w:val="none"/>
-          <w:left w:val="none"/>
+          <w:top w:val="none" w:color="000000" w:sz="4" w:space="0"/>
+          <w:left w:val="none" w:color="000000" w:sz="4" w:space="0"/>
           <w:bottom w:val="single" w:color="000000" w:themeColor="accent3" w:themeTint="98" w:sz="4" w:space="0"/>
-          <w:right w:val="none"/>
+          <w:right w:val="none" w:color="000000" w:sz="4" w:space="0"/>
         </w:tcBorders>
       </w:tcPr>
     </w:tblStylePr>
@@ -24696,12 +24861,12 @@
         <w:tblBorders/>
       </w:tblPr>
       <w:tcPr>
-        <w:shd w:color="ffffff"/>
+        <w:shd w:val="clear" w:color="ffffff"/>
         <w:tcBorders>
-          <w:top w:val="none"/>
+          <w:top w:val="none" w:color="000000" w:sz="4" w:space="0"/>
           <w:left w:val="single" w:color="000000" w:themeColor="accent3" w:themeTint="98" w:sz="4" w:space="0"/>
-          <w:bottom w:val="none"/>
-          <w:right w:val="none"/>
+          <w:bottom w:val="none" w:color="000000" w:sz="4" w:space="0"/>
+          <w:right w:val="none" w:color="000000" w:sz="4" w:space="0"/>
         </w:tcBorders>
       </w:tcPr>
     </w:tblStylePr>
@@ -24724,9 +24889,9 @@
         <w:shd w:val="clear" w:color="ffffff" w:themeColor="light1" w:fill="ffffff" w:themeFill="light1"/>
         <w:tcBorders>
           <w:top w:val="single" w:color="000000" w:themeColor="accent3" w:themeTint="98" w:sz="4" w:space="0"/>
-          <w:left w:val="none"/>
-          <w:bottom w:val="none"/>
-          <w:right w:val="none"/>
+          <w:left w:val="none" w:color="000000" w:sz="4" w:space="0"/>
+          <w:bottom w:val="none" w:color="000000" w:sz="4" w:space="0"/>
+          <w:right w:val="none" w:color="000000" w:sz="4" w:space="0"/>
         </w:tcBorders>
       </w:tcPr>
     </w:tblStylePr>
@@ -24801,9 +24966,9 @@
       </w:tcPr>
     </w:tblStylePr>
   </w:style>
-  <w:style w:type="table" w:styleId="114">
+  <w:style w:type="table" w:styleId="803">
     <w:name w:val="List Table 7 Colorful - Accent 4"/>
-    <w:basedOn w:val="675"/>
+    <w:basedOn w:val="869"/>
     <w:uiPriority w:val="99"/>
     <w:pPr>
       <w:pBdr/>
@@ -24902,11 +25067,11 @@
         <w:tblBorders/>
       </w:tblPr>
       <w:tcPr>
-        <w:shd w:color="ffffff"/>
+        <w:shd w:val="clear" w:color="ffffff"/>
         <w:tcBorders>
-          <w:top w:val="none"/>
-          <w:left w:val="none"/>
-          <w:bottom w:val="none"/>
+          <w:top w:val="none" w:color="000000" w:sz="4" w:space="0"/>
+          <w:left w:val="none" w:color="000000" w:sz="4" w:space="0"/>
+          <w:bottom w:val="none" w:color="000000" w:sz="4" w:space="0"/>
           <w:right w:val="single" w:color="000000" w:themeColor="accent4" w:themeTint="9A" w:sz="4" w:space="0"/>
         </w:tcBorders>
       </w:tcPr>
@@ -24929,10 +25094,10 @@
       <w:tcPr>
         <w:shd w:val="clear" w:color="ffffff" w:themeColor="light1" w:fill="ffffff" w:themeFill="light1"/>
         <w:tcBorders>
-          <w:top w:val="none"/>
-          <w:left w:val="none"/>
+          <w:top w:val="none" w:color="000000" w:sz="4" w:space="0"/>
+          <w:left w:val="none" w:color="000000" w:sz="4" w:space="0"/>
           <w:bottom w:val="single" w:color="000000" w:themeColor="accent4" w:themeTint="9A" w:sz="4" w:space="0"/>
-          <w:right w:val="none"/>
+          <w:right w:val="none" w:color="000000" w:sz="4" w:space="0"/>
         </w:tcBorders>
       </w:tcPr>
     </w:tblStylePr>
@@ -24952,12 +25117,12 @@
         <w:tblBorders/>
       </w:tblPr>
       <w:tcPr>
-        <w:shd w:color="ffffff"/>
+        <w:shd w:val="clear" w:color="ffffff"/>
         <w:tcBorders>
-          <w:top w:val="none"/>
+          <w:top w:val="none" w:color="000000" w:sz="4" w:space="0"/>
           <w:left w:val="single" w:color="000000" w:themeColor="accent4" w:themeTint="9A" w:sz="4" w:space="0"/>
-          <w:bottom w:val="none"/>
-          <w:right w:val="none"/>
+          <w:bottom w:val="none" w:color="000000" w:sz="4" w:space="0"/>
+          <w:right w:val="none" w:color="000000" w:sz="4" w:space="0"/>
         </w:tcBorders>
       </w:tcPr>
     </w:tblStylePr>
@@ -24980,9 +25145,9 @@
         <w:shd w:val="clear" w:color="ffffff" w:themeColor="light1" w:fill="ffffff" w:themeFill="light1"/>
         <w:tcBorders>
           <w:top w:val="single" w:color="000000" w:themeColor="accent4" w:themeTint="9A" w:sz="4" w:space="0"/>
-          <w:left w:val="none"/>
-          <w:bottom w:val="none"/>
-          <w:right w:val="none"/>
+          <w:left w:val="none" w:color="000000" w:sz="4" w:space="0"/>
+          <w:bottom w:val="none" w:color="000000" w:sz="4" w:space="0"/>
+          <w:right w:val="none" w:color="000000" w:sz="4" w:space="0"/>
         </w:tcBorders>
       </w:tcPr>
     </w:tblStylePr>
@@ -25057,9 +25222,9 @@
       </w:tcPr>
     </w:tblStylePr>
   </w:style>
-  <w:style w:type="table" w:styleId="115">
+  <w:style w:type="table" w:styleId="804">
     <w:name w:val="List Table 7 Colorful - Accent 5"/>
-    <w:basedOn w:val="675"/>
+    <w:basedOn w:val="869"/>
     <w:uiPriority w:val="99"/>
     <w:pPr>
       <w:pBdr/>
@@ -25158,11 +25323,11 @@
         <w:tblBorders/>
       </w:tblPr>
       <w:tcPr>
-        <w:shd w:color="ffffff"/>
+        <w:shd w:val="clear" w:color="ffffff"/>
         <w:tcBorders>
-          <w:top w:val="none"/>
-          <w:left w:val="none"/>
-          <w:bottom w:val="none"/>
+          <w:top w:val="none" w:color="000000" w:sz="4" w:space="0"/>
+          <w:left w:val="none" w:color="000000" w:sz="4" w:space="0"/>
+          <w:bottom w:val="none" w:color="000000" w:sz="4" w:space="0"/>
           <w:right w:val="single" w:color="000000" w:themeColor="accent5" w:themeTint="9A" w:sz="4" w:space="0"/>
         </w:tcBorders>
       </w:tcPr>
@@ -25185,10 +25350,10 @@
       <w:tcPr>
         <w:shd w:val="clear" w:color="ffffff" w:themeColor="light1" w:fill="ffffff" w:themeFill="light1"/>
         <w:tcBorders>
-          <w:top w:val="none"/>
-          <w:left w:val="none"/>
+          <w:top w:val="none" w:color="000000" w:sz="4" w:space="0"/>
+          <w:left w:val="none" w:color="000000" w:sz="4" w:space="0"/>
           <w:bottom w:val="single" w:color="000000" w:themeColor="accent5" w:themeTint="9A" w:sz="4" w:space="0"/>
-          <w:right w:val="none"/>
+          <w:right w:val="none" w:color="000000" w:sz="4" w:space="0"/>
         </w:tcBorders>
       </w:tcPr>
     </w:tblStylePr>
@@ -25208,12 +25373,12 @@
         <w:tblBorders/>
       </w:tblPr>
       <w:tcPr>
-        <w:shd w:color="ffffff"/>
+        <w:shd w:val="clear" w:color="ffffff"/>
         <w:tcBorders>
-          <w:top w:val="none"/>
+          <w:top w:val="none" w:color="000000" w:sz="4" w:space="0"/>
           <w:left w:val="single" w:color="000000" w:themeColor="accent5" w:themeTint="9A" w:sz="4" w:space="0"/>
-          <w:bottom w:val="none"/>
-          <w:right w:val="none"/>
+          <w:bottom w:val="none" w:color="000000" w:sz="4" w:space="0"/>
+          <w:right w:val="none" w:color="000000" w:sz="4" w:space="0"/>
         </w:tcBorders>
       </w:tcPr>
     </w:tblStylePr>
@@ -25236,9 +25401,9 @@
         <w:shd w:val="clear" w:color="ffffff" w:themeColor="light1" w:fill="ffffff" w:themeFill="light1"/>
         <w:tcBorders>
           <w:top w:val="single" w:color="000000" w:themeColor="accent5" w:themeTint="9A" w:sz="4" w:space="0"/>
-          <w:left w:val="none"/>
-          <w:bottom w:val="none"/>
-          <w:right w:val="none"/>
+          <w:left w:val="none" w:color="000000" w:sz="4" w:space="0"/>
+          <w:bottom w:val="none" w:color="000000" w:sz="4" w:space="0"/>
+          <w:right w:val="none" w:color="000000" w:sz="4" w:space="0"/>
         </w:tcBorders>
       </w:tcPr>
     </w:tblStylePr>
@@ -25313,9 +25478,9 @@
       </w:tcPr>
     </w:tblStylePr>
   </w:style>
-  <w:style w:type="table" w:styleId="116">
+  <w:style w:type="table" w:styleId="805">
     <w:name w:val="List Table 7 Colorful - Accent 6"/>
-    <w:basedOn w:val="675"/>
+    <w:basedOn w:val="869"/>
     <w:uiPriority w:val="99"/>
     <w:pPr>
       <w:pBdr/>
@@ -25414,11 +25579,11 @@
         <w:tblBorders/>
       </w:tblPr>
       <w:tcPr>
-        <w:shd w:color="ffffff"/>
+        <w:shd w:val="clear" w:color="ffffff"/>
         <w:tcBorders>
-          <w:top w:val="none"/>
-          <w:left w:val="none"/>
-          <w:bottom w:val="none"/>
+          <w:top w:val="none" w:color="000000" w:sz="4" w:space="0"/>
+          <w:left w:val="none" w:color="000000" w:sz="4" w:space="0"/>
+          <w:bottom w:val="none" w:color="000000" w:sz="4" w:space="0"/>
           <w:right w:val="single" w:color="000000" w:themeColor="accent6" w:themeTint="98" w:sz="4" w:space="0"/>
         </w:tcBorders>
       </w:tcPr>
@@ -25441,10 +25606,10 @@
       <w:tcPr>
         <w:shd w:val="clear" w:color="ffffff" w:themeColor="light1" w:fill="ffffff" w:themeFill="light1"/>
         <w:tcBorders>
-          <w:top w:val="none"/>
-          <w:left w:val="none"/>
+          <w:top w:val="none" w:color="000000" w:sz="4" w:space="0"/>
+          <w:left w:val="none" w:color="000000" w:sz="4" w:space="0"/>
           <w:bottom w:val="single" w:color="000000" w:themeColor="accent6" w:themeTint="98" w:sz="4" w:space="0"/>
-          <w:right w:val="none"/>
+          <w:right w:val="none" w:color="000000" w:sz="4" w:space="0"/>
         </w:tcBorders>
       </w:tcPr>
     </w:tblStylePr>
@@ -25464,12 +25629,12 @@
         <w:tblBorders/>
       </w:tblPr>
       <w:tcPr>
-        <w:shd w:color="ffffff"/>
+        <w:shd w:val="clear" w:color="ffffff"/>
         <w:tcBorders>
-          <w:top w:val="none"/>
+          <w:top w:val="none" w:color="000000" w:sz="4" w:space="0"/>
           <w:left w:val="single" w:color="000000" w:themeColor="accent6" w:themeTint="98" w:sz="4" w:space="0"/>
-          <w:bottom w:val="none"/>
-          <w:right w:val="none"/>
+          <w:bottom w:val="none" w:color="000000" w:sz="4" w:space="0"/>
+          <w:right w:val="none" w:color="000000" w:sz="4" w:space="0"/>
         </w:tcBorders>
       </w:tcPr>
     </w:tblStylePr>
@@ -25492,9 +25657,9 @@
         <w:shd w:val="clear" w:color="ffffff" w:themeColor="light1" w:fill="ffffff" w:themeFill="light1"/>
         <w:tcBorders>
           <w:top w:val="single" w:color="000000" w:themeColor="accent6" w:themeTint="98" w:sz="4" w:space="0"/>
-          <w:left w:val="none"/>
-          <w:bottom w:val="none"/>
-          <w:right w:val="none"/>
+          <w:left w:val="none" w:color="000000" w:sz="4" w:space="0"/>
+          <w:bottom w:val="none" w:color="000000" w:sz="4" w:space="0"/>
+          <w:right w:val="none" w:color="000000" w:sz="4" w:space="0"/>
         </w:tcBorders>
       </w:tcPr>
     </w:tblStylePr>
@@ -25569,9 +25734,9 @@
       </w:tcPr>
     </w:tblStylePr>
   </w:style>
-  <w:style w:type="table" w:styleId="117">
+  <w:style w:type="table" w:styleId="806">
     <w:name w:val="Lined - Accent"/>
-    <w:basedOn w:val="675"/>
+    <w:basedOn w:val="869"/>
     <w:uiPriority w:val="99"/>
     <w:pPr>
       <w:pBdr/>
@@ -25806,9 +25971,9 @@
       </w:tcPr>
     </w:tblStylePr>
   </w:style>
-  <w:style w:type="table" w:styleId="118">
+  <w:style w:type="table" w:styleId="807">
     <w:name w:val="Lined - Accent 1"/>
-    <w:basedOn w:val="675"/>
+    <w:basedOn w:val="869"/>
     <w:uiPriority w:val="99"/>
     <w:pPr>
       <w:pBdr/>
@@ -26043,9 +26208,9 @@
       </w:tcPr>
     </w:tblStylePr>
   </w:style>
-  <w:style w:type="table" w:styleId="119">
+  <w:style w:type="table" w:styleId="808">
     <w:name w:val="Lined - Accent 2"/>
-    <w:basedOn w:val="675"/>
+    <w:basedOn w:val="869"/>
     <w:uiPriority w:val="99"/>
     <w:pPr>
       <w:pBdr/>
@@ -26280,9 +26445,9 @@
       </w:tcPr>
     </w:tblStylePr>
   </w:style>
-  <w:style w:type="table" w:styleId="120">
+  <w:style w:type="table" w:styleId="809">
     <w:name w:val="Lined - Accent 3"/>
-    <w:basedOn w:val="675"/>
+    <w:basedOn w:val="869"/>
     <w:uiPriority w:val="99"/>
     <w:pPr>
       <w:pBdr/>
@@ -26517,9 +26682,9 @@
       </w:tcPr>
     </w:tblStylePr>
   </w:style>
-  <w:style w:type="table" w:styleId="121">
+  <w:style w:type="table" w:styleId="810">
     <w:name w:val="Lined - Accent 4"/>
-    <w:basedOn w:val="675"/>
+    <w:basedOn w:val="869"/>
     <w:uiPriority w:val="99"/>
     <w:pPr>
       <w:pBdr/>
@@ -26754,9 +26919,9 @@
       </w:tcPr>
     </w:tblStylePr>
   </w:style>
-  <w:style w:type="table" w:styleId="122">
+  <w:style w:type="table" w:styleId="811">
     <w:name w:val="Lined - Accent 5"/>
-    <w:basedOn w:val="675"/>
+    <w:basedOn w:val="869"/>
     <w:uiPriority w:val="99"/>
     <w:pPr>
       <w:pBdr/>
@@ -26991,9 +27156,9 @@
       </w:tcPr>
     </w:tblStylePr>
   </w:style>
-  <w:style w:type="table" w:styleId="123">
+  <w:style w:type="table" w:styleId="812">
     <w:name w:val="Lined - Accent 6"/>
-    <w:basedOn w:val="675"/>
+    <w:basedOn w:val="869"/>
     <w:uiPriority w:val="99"/>
     <w:pPr>
       <w:pBdr/>
@@ -27228,9 +27393,9 @@
       </w:tcPr>
     </w:tblStylePr>
   </w:style>
-  <w:style w:type="table" w:styleId="124">
+  <w:style w:type="table" w:styleId="813">
     <w:name w:val="Bordered &amp; Lined - Accent"/>
-    <w:basedOn w:val="675"/>
+    <w:basedOn w:val="869"/>
     <w:uiPriority w:val="99"/>
     <w:pPr>
       <w:pBdr/>
@@ -27472,9 +27637,9 @@
       </w:tcPr>
     </w:tblStylePr>
   </w:style>
-  <w:style w:type="table" w:styleId="125">
+  <w:style w:type="table" w:styleId="814">
     <w:name w:val="Bordered &amp; Lined - Accent 1"/>
-    <w:basedOn w:val="675"/>
+    <w:basedOn w:val="869"/>
     <w:uiPriority w:val="99"/>
     <w:pPr>
       <w:pBdr/>
@@ -27716,9 +27881,9 @@
       </w:tcPr>
     </w:tblStylePr>
   </w:style>
-  <w:style w:type="table" w:styleId="126">
+  <w:style w:type="table" w:styleId="815">
     <w:name w:val="Bordered &amp; Lined - Accent 2"/>
-    <w:basedOn w:val="675"/>
+    <w:basedOn w:val="869"/>
     <w:uiPriority w:val="99"/>
     <w:pPr>
       <w:pBdr/>
@@ -27960,9 +28125,9 @@
       </w:tcPr>
     </w:tblStylePr>
   </w:style>
-  <w:style w:type="table" w:styleId="127">
+  <w:style w:type="table" w:styleId="816">
     <w:name w:val="Bordered &amp; Lined - Accent 3"/>
-    <w:basedOn w:val="675"/>
+    <w:basedOn w:val="869"/>
     <w:uiPriority w:val="99"/>
     <w:pPr>
       <w:pBdr/>
@@ -28204,9 +28369,9 @@
       </w:tcPr>
     </w:tblStylePr>
   </w:style>
-  <w:style w:type="table" w:styleId="128">
+  <w:style w:type="table" w:styleId="817">
     <w:name w:val="Bordered &amp; Lined - Accent 4"/>
-    <w:basedOn w:val="675"/>
+    <w:basedOn w:val="869"/>
     <w:uiPriority w:val="99"/>
     <w:pPr>
       <w:pBdr/>
@@ -28448,9 +28613,9 @@
       </w:tcPr>
     </w:tblStylePr>
   </w:style>
-  <w:style w:type="table" w:styleId="129">
+  <w:style w:type="table" w:styleId="818">
     <w:name w:val="Bordered &amp; Lined - Accent 5"/>
-    <w:basedOn w:val="675"/>
+    <w:basedOn w:val="869"/>
     <w:uiPriority w:val="99"/>
     <w:pPr>
       <w:pBdr/>
@@ -28692,9 +28857,9 @@
       </w:tcPr>
     </w:tblStylePr>
   </w:style>
-  <w:style w:type="table" w:styleId="130">
+  <w:style w:type="table" w:styleId="819">
     <w:name w:val="Bordered &amp; Lined - Accent 6"/>
-    <w:basedOn w:val="675"/>
+    <w:basedOn w:val="869"/>
     <w:uiPriority w:val="99"/>
     <w:pPr>
       <w:pBdr/>
@@ -28936,9 +29101,9 @@
       </w:tcPr>
     </w:tblStylePr>
   </w:style>
-  <w:style w:type="table" w:styleId="131">
+  <w:style w:type="table" w:styleId="820">
     <w:name w:val="Bordered"/>
-    <w:basedOn w:val="675"/>
+    <w:basedOn w:val="869"/>
     <w:uiPriority w:val="99"/>
     <w:pPr>
       <w:pBdr/>
@@ -29167,9 +29332,9 @@
       </w:tcPr>
     </w:tblStylePr>
   </w:style>
-  <w:style w:type="table" w:styleId="132">
+  <w:style w:type="table" w:styleId="821">
     <w:name w:val="Bordered - Accent 1"/>
-    <w:basedOn w:val="675"/>
+    <w:basedOn w:val="869"/>
     <w:uiPriority w:val="99"/>
     <w:pPr>
       <w:pBdr/>
@@ -29398,9 +29563,9 @@
       </w:tcPr>
     </w:tblStylePr>
   </w:style>
-  <w:style w:type="table" w:styleId="133">
+  <w:style w:type="table" w:styleId="822">
     <w:name w:val="Bordered - Accent 2"/>
-    <w:basedOn w:val="675"/>
+    <w:basedOn w:val="869"/>
     <w:uiPriority w:val="99"/>
     <w:pPr>
       <w:pBdr/>
@@ -29629,9 +29794,9 @@
       </w:tcPr>
     </w:tblStylePr>
   </w:style>
-  <w:style w:type="table" w:styleId="134">
+  <w:style w:type="table" w:styleId="823">
     <w:name w:val="Bordered - Accent 3"/>
-    <w:basedOn w:val="675"/>
+    <w:basedOn w:val="869"/>
     <w:uiPriority w:val="99"/>
     <w:pPr>
       <w:pBdr/>
@@ -29860,9 +30025,9 @@
       </w:tcPr>
     </w:tblStylePr>
   </w:style>
-  <w:style w:type="table" w:styleId="135">
+  <w:style w:type="table" w:styleId="824">
     <w:name w:val="Bordered - Accent 4"/>
-    <w:basedOn w:val="675"/>
+    <w:basedOn w:val="869"/>
     <w:uiPriority w:val="99"/>
     <w:pPr>
       <w:pBdr/>
@@ -30091,9 +30256,9 @@
       </w:tcPr>
     </w:tblStylePr>
   </w:style>
-  <w:style w:type="table" w:styleId="136">
+  <w:style w:type="table" w:styleId="825">
     <w:name w:val="Bordered - Accent 5"/>
-    <w:basedOn w:val="675"/>
+    <w:basedOn w:val="869"/>
     <w:uiPriority w:val="99"/>
     <w:pPr>
       <w:pBdr/>
@@ -30322,9 +30487,9 @@
       </w:tcPr>
     </w:tblStylePr>
   </w:style>
-  <w:style w:type="table" w:styleId="137">
+  <w:style w:type="table" w:styleId="826">
     <w:name w:val="Bordered - Accent 6"/>
-    <w:basedOn w:val="675"/>
+    <w:basedOn w:val="869"/>
     <w:uiPriority w:val="99"/>
     <w:pPr>
       <w:pBdr/>
@@ -30553,9 +30718,9 @@
       </w:tcPr>
     </w:tblStylePr>
   </w:style>
-  <w:style w:type="paragraph" w:styleId="170">
+  <w:style w:type="paragraph" w:styleId="827">
     <w:name w:val="No Spacing"/>
-    <w:basedOn w:val="664"/>
+    <w:basedOn w:val="858"/>
     <w:uiPriority w:val="1"/>
     <w:qFormat/>
     <w:pPr>
@@ -30564,9 +30729,9 @@
       <w:ind/>
     </w:pPr>
   </w:style>
-  <w:style w:type="character" w:styleId="171">
+  <w:style w:type="character" w:styleId="828">
     <w:name w:val="Subtle Emphasis"/>
-    <w:basedOn w:val="674"/>
+    <w:basedOn w:val="868"/>
     <w:uiPriority w:val="19"/>
     <w:qFormat/>
     <w:pPr>
@@ -30580,9 +30745,9 @@
       <w:color w:val="404040" w:themeColor="text1" w:themeTint="BF"/>
     </w:rPr>
   </w:style>
-  <w:style w:type="character" w:styleId="172">
+  <w:style w:type="character" w:styleId="829">
     <w:name w:val="Emphasis"/>
-    <w:basedOn w:val="674"/>
+    <w:basedOn w:val="868"/>
     <w:uiPriority w:val="20"/>
     <w:qFormat/>
     <w:pPr>
@@ -30595,9 +30760,9 @@
       <w:iCs/>
     </w:rPr>
   </w:style>
-  <w:style w:type="character" w:styleId="173">
+  <w:style w:type="character" w:styleId="830">
     <w:name w:val="Strong"/>
-    <w:basedOn w:val="674"/>
+    <w:basedOn w:val="868"/>
     <w:uiPriority w:val="22"/>
     <w:qFormat/>
     <w:pPr>
@@ -30610,9 +30775,9 @@
       <w:bCs/>
     </w:rPr>
   </w:style>
-  <w:style w:type="character" w:styleId="174">
+  <w:style w:type="character" w:styleId="831">
     <w:name w:val="Subtle Reference"/>
-    <w:basedOn w:val="674"/>
+    <w:basedOn w:val="868"/>
     <w:uiPriority w:val="31"/>
     <w:qFormat/>
     <w:pPr>
@@ -30625,9 +30790,9 @@
       <w:color w:val="5a5a5a" w:themeColor="text1" w:themeTint="A5"/>
     </w:rPr>
   </w:style>
-  <w:style w:type="character" w:styleId="175">
+  <w:style w:type="character" w:styleId="832">
     <w:name w:val="Book Title"/>
-    <w:basedOn w:val="674"/>
+    <w:basedOn w:val="868"/>
     <w:uiPriority w:val="33"/>
     <w:qFormat/>
     <w:pPr>
@@ -30643,10 +30808,10 @@
       <w:spacing w:val="5"/>
     </w:rPr>
   </w:style>
-  <w:style w:type="paragraph" w:styleId="176">
+  <w:style w:type="paragraph" w:styleId="833">
     <w:name w:val="Header"/>
-    <w:basedOn w:val="664"/>
-    <w:link w:val="177"/>
+    <w:basedOn w:val="858"/>
+    <w:link w:val="834"/>
     <w:uiPriority w:val="99"/>
     <w:unhideWhenUsed/>
     <w:pPr>
@@ -30659,10 +30824,10 @@
       <w:ind/>
     </w:pPr>
   </w:style>
-  <w:style w:type="character" w:styleId="177">
+  <w:style w:type="character" w:styleId="834">
     <w:name w:val="Header Char"/>
-    <w:basedOn w:val="674"/>
-    <w:link w:val="176"/>
+    <w:basedOn w:val="868"/>
+    <w:link w:val="833"/>
     <w:uiPriority w:val="99"/>
     <w:pPr>
       <w:pBdr/>
@@ -30670,10 +30835,10 @@
       <w:ind/>
     </w:pPr>
   </w:style>
-  <w:style w:type="paragraph" w:styleId="178">
+  <w:style w:type="paragraph" w:styleId="835">
     <w:name w:val="Footer"/>
-    <w:basedOn w:val="664"/>
-    <w:link w:val="179"/>
+    <w:basedOn w:val="858"/>
+    <w:link w:val="836"/>
     <w:uiPriority w:val="99"/>
     <w:unhideWhenUsed/>
     <w:pPr>
@@ -30686,10 +30851,10 @@
       <w:ind/>
     </w:pPr>
   </w:style>
-  <w:style w:type="character" w:styleId="179">
+  <w:style w:type="character" w:styleId="836">
     <w:name w:val="Footer Char"/>
-    <w:basedOn w:val="674"/>
-    <w:link w:val="178"/>
+    <w:basedOn w:val="868"/>
+    <w:link w:val="835"/>
     <w:uiPriority w:val="99"/>
     <w:pPr>
       <w:pBdr/>
@@ -30697,10 +30862,10 @@
       <w:ind/>
     </w:pPr>
   </w:style>
-  <w:style w:type="paragraph" w:styleId="180">
+  <w:style w:type="paragraph" w:styleId="837">
     <w:name w:val="Caption"/>
-    <w:basedOn w:val="664"/>
-    <w:next w:val="664"/>
+    <w:basedOn w:val="858"/>
+    <w:next w:val="858"/>
     <w:uiPriority w:val="35"/>
     <w:unhideWhenUsed/>
     <w:qFormat/>
@@ -30717,10 +30882,10 @@
       <w:szCs w:val="18"/>
     </w:rPr>
   </w:style>
-  <w:style w:type="paragraph" w:styleId="181">
+  <w:style w:type="paragraph" w:styleId="838">
     <w:name w:val="footnote text"/>
-    <w:basedOn w:val="664"/>
-    <w:link w:val="182"/>
+    <w:basedOn w:val="858"/>
+    <w:link w:val="839"/>
     <w:uiPriority w:val="99"/>
     <w:semiHidden/>
     <w:unhideWhenUsed/>
@@ -30734,10 +30899,10 @@
       <w:szCs w:val="20"/>
     </w:rPr>
   </w:style>
-  <w:style w:type="character" w:styleId="182">
+  <w:style w:type="character" w:styleId="839">
     <w:name w:val="Footnote Text Char"/>
-    <w:basedOn w:val="674"/>
-    <w:link w:val="181"/>
+    <w:basedOn w:val="868"/>
+    <w:link w:val="838"/>
     <w:uiPriority w:val="99"/>
     <w:semiHidden/>
     <w:pPr>
@@ -30750,9 +30915,9 @@
       <w:szCs w:val="20"/>
     </w:rPr>
   </w:style>
-  <w:style w:type="character" w:styleId="183">
+  <w:style w:type="character" w:styleId="840">
     <w:name w:val="footnote reference"/>
-    <w:basedOn w:val="674"/>
+    <w:basedOn w:val="868"/>
     <w:uiPriority w:val="99"/>
     <w:semiHidden/>
     <w:unhideWhenUsed/>
@@ -30765,10 +30930,10 @@
       <w:vertAlign w:val="superscript"/>
     </w:rPr>
   </w:style>
-  <w:style w:type="paragraph" w:styleId="184">
+  <w:style w:type="paragraph" w:styleId="841">
     <w:name w:val="endnote text"/>
-    <w:basedOn w:val="664"/>
-    <w:link w:val="185"/>
+    <w:basedOn w:val="858"/>
+    <w:link w:val="842"/>
     <w:uiPriority w:val="99"/>
     <w:semiHidden/>
     <w:unhideWhenUsed/>
@@ -30782,10 +30947,10 @@
       <w:szCs w:val="20"/>
     </w:rPr>
   </w:style>
-  <w:style w:type="character" w:styleId="185">
+  <w:style w:type="character" w:styleId="842">
     <w:name w:val="Endnote Text Char"/>
-    <w:basedOn w:val="674"/>
-    <w:link w:val="184"/>
+    <w:basedOn w:val="868"/>
+    <w:link w:val="841"/>
     <w:uiPriority w:val="99"/>
     <w:semiHidden/>
     <w:pPr>
@@ -30798,9 +30963,9 @@
       <w:szCs w:val="20"/>
     </w:rPr>
   </w:style>
-  <w:style w:type="character" w:styleId="186">
+  <w:style w:type="character" w:styleId="843">
     <w:name w:val="endnote reference"/>
-    <w:basedOn w:val="674"/>
+    <w:basedOn w:val="868"/>
     <w:uiPriority w:val="99"/>
     <w:semiHidden/>
     <w:unhideWhenUsed/>
@@ -30813,9 +30978,9 @@
       <w:vertAlign w:val="superscript"/>
     </w:rPr>
   </w:style>
-  <w:style w:type="character" w:styleId="187">
+  <w:style w:type="character" w:styleId="844">
     <w:name w:val="Hyperlink"/>
-    <w:basedOn w:val="674"/>
+    <w:basedOn w:val="868"/>
     <w:uiPriority w:val="99"/>
     <w:unhideWhenUsed/>
     <w:pPr>
@@ -30828,9 +30993,9 @@
       <w:u w:val="single"/>
     </w:rPr>
   </w:style>
-  <w:style w:type="character" w:styleId="188">
+  <w:style w:type="character" w:styleId="845">
     <w:name w:val="FollowedHyperlink"/>
-    <w:basedOn w:val="674"/>
+    <w:basedOn w:val="868"/>
     <w:uiPriority w:val="99"/>
     <w:semiHidden/>
     <w:unhideWhenUsed/>
@@ -30844,10 +31009,10 @@
       <w:u w:val="single"/>
     </w:rPr>
   </w:style>
-  <w:style w:type="paragraph" w:styleId="189">
+  <w:style w:type="paragraph" w:styleId="846">
     <w:name w:val="toc 1"/>
-    <w:basedOn w:val="664"/>
-    <w:next w:val="664"/>
+    <w:basedOn w:val="858"/>
+    <w:next w:val="858"/>
     <w:uiPriority w:val="39"/>
     <w:unhideWhenUsed/>
     <w:pPr>
@@ -30856,10 +31021,10 @@
       <w:ind/>
     </w:pPr>
   </w:style>
-  <w:style w:type="paragraph" w:styleId="190">
+  <w:style w:type="paragraph" w:styleId="847">
     <w:name w:val="toc 2"/>
-    <w:basedOn w:val="664"/>
-    <w:next w:val="664"/>
+    <w:basedOn w:val="858"/>
+    <w:next w:val="858"/>
     <w:uiPriority w:val="39"/>
     <w:unhideWhenUsed/>
     <w:pPr>
@@ -30868,10 +31033,10 @@
       <w:ind w:left="220"/>
     </w:pPr>
   </w:style>
-  <w:style w:type="paragraph" w:styleId="191">
+  <w:style w:type="paragraph" w:styleId="848">
     <w:name w:val="toc 3"/>
-    <w:basedOn w:val="664"/>
-    <w:next w:val="664"/>
+    <w:basedOn w:val="858"/>
+    <w:next w:val="858"/>
     <w:uiPriority w:val="39"/>
     <w:unhideWhenUsed/>
     <w:pPr>
@@ -30880,10 +31045,10 @@
       <w:ind w:left="440"/>
     </w:pPr>
   </w:style>
-  <w:style w:type="paragraph" w:styleId="192">
+  <w:style w:type="paragraph" w:styleId="849">
     <w:name w:val="toc 4"/>
-    <w:basedOn w:val="664"/>
-    <w:next w:val="664"/>
+    <w:basedOn w:val="858"/>
+    <w:next w:val="858"/>
     <w:uiPriority w:val="39"/>
     <w:unhideWhenUsed/>
     <w:pPr>
@@ -30892,10 +31057,10 @@
       <w:ind w:left="660"/>
     </w:pPr>
   </w:style>
-  <w:style w:type="paragraph" w:styleId="193">
+  <w:style w:type="paragraph" w:styleId="850">
     <w:name w:val="toc 5"/>
-    <w:basedOn w:val="664"/>
-    <w:next w:val="664"/>
+    <w:basedOn w:val="858"/>
+    <w:next w:val="858"/>
     <w:uiPriority w:val="39"/>
     <w:unhideWhenUsed/>
     <w:pPr>
@@ -30904,10 +31069,10 @@
       <w:ind w:left="880"/>
     </w:pPr>
   </w:style>
-  <w:style w:type="paragraph" w:styleId="194">
+  <w:style w:type="paragraph" w:styleId="851">
     <w:name w:val="toc 6"/>
-    <w:basedOn w:val="664"/>
-    <w:next w:val="664"/>
+    <w:basedOn w:val="858"/>
+    <w:next w:val="858"/>
     <w:uiPriority w:val="39"/>
     <w:unhideWhenUsed/>
     <w:pPr>
@@ -30916,10 +31081,10 @@
       <w:ind w:left="1100"/>
     </w:pPr>
   </w:style>
-  <w:style w:type="paragraph" w:styleId="195">
+  <w:style w:type="paragraph" w:styleId="852">
     <w:name w:val="toc 7"/>
-    <w:basedOn w:val="664"/>
-    <w:next w:val="664"/>
+    <w:basedOn w:val="858"/>
+    <w:next w:val="858"/>
     <w:uiPriority w:val="39"/>
     <w:unhideWhenUsed/>
     <w:pPr>
@@ -30928,10 +31093,10 @@
       <w:ind w:left="1320"/>
     </w:pPr>
   </w:style>
-  <w:style w:type="paragraph" w:styleId="196">
+  <w:style w:type="paragraph" w:styleId="853">
     <w:name w:val="toc 8"/>
-    <w:basedOn w:val="664"/>
-    <w:next w:val="664"/>
+    <w:basedOn w:val="858"/>
+    <w:next w:val="858"/>
     <w:uiPriority w:val="39"/>
     <w:unhideWhenUsed/>
     <w:pPr>
@@ -30940,10 +31105,10 @@
       <w:ind w:left="1540"/>
     </w:pPr>
   </w:style>
-  <w:style w:type="paragraph" w:styleId="197">
+  <w:style w:type="paragraph" w:styleId="854">
     <w:name w:val="toc 9"/>
-    <w:basedOn w:val="664"/>
-    <w:next w:val="664"/>
+    <w:basedOn w:val="858"/>
+    <w:next w:val="858"/>
     <w:uiPriority w:val="39"/>
     <w:unhideWhenUsed/>
     <w:pPr>
@@ -30952,9 +31117,9 @@
       <w:ind w:left="1760"/>
     </w:pPr>
   </w:style>
-  <w:style w:type="character" w:styleId="198">
+  <w:style w:type="character" w:styleId="855">
     <w:name w:val="Placeholder Text"/>
-    <w:basedOn w:val="674"/>
+    <w:basedOn w:val="868"/>
     <w:uiPriority w:val="99"/>
     <w:semiHidden/>
     <w:pPr>
@@ -30966,7 +31131,7 @@
       <w:color w:val="666666"/>
     </w:rPr>
   </w:style>
-  <w:style w:type="paragraph" w:styleId="208">
+  <w:style w:type="paragraph" w:styleId="856">
     <w:name w:val="TOC Heading"/>
     <w:uiPriority w:val="39"/>
     <w:unhideWhenUsed/>
@@ -30976,10 +31141,10 @@
       <w:ind/>
     </w:pPr>
   </w:style>
-  <w:style w:type="paragraph" w:styleId="209">
+  <w:style w:type="paragraph" w:styleId="857">
     <w:name w:val="table of figures"/>
-    <w:basedOn w:val="664"/>
-    <w:next w:val="664"/>
+    <w:basedOn w:val="858"/>
+    <w:next w:val="858"/>
     <w:uiPriority w:val="99"/>
     <w:unhideWhenUsed/>
     <w:pPr>
@@ -30988,7 +31153,7 @@
       <w:ind/>
     </w:pPr>
   </w:style>
-  <w:style w:type="paragraph" w:styleId="664" w:default="1">
+  <w:style w:type="paragraph" w:styleId="858" w:default="1">
     <w:name w:val="Normal"/>
     <w:qFormat/>
     <w:pPr>
@@ -30997,11 +31162,11 @@
       <w:ind/>
     </w:pPr>
   </w:style>
-  <w:style w:type="paragraph" w:styleId="665">
+  <w:style w:type="paragraph" w:styleId="859">
     <w:name w:val="Heading 1"/>
-    <w:basedOn w:val="664"/>
-    <w:next w:val="664"/>
-    <w:link w:val="677"/>
+    <w:basedOn w:val="858"/>
+    <w:next w:val="858"/>
+    <w:link w:val="871"/>
     <w:uiPriority w:val="9"/>
     <w:qFormat/>
     <w:pPr>
@@ -31019,11 +31184,11 @@
       <w:szCs w:val="40"/>
     </w:rPr>
   </w:style>
-  <w:style w:type="paragraph" w:styleId="666">
+  <w:style w:type="paragraph" w:styleId="860">
     <w:name w:val="Heading 2"/>
-    <w:basedOn w:val="664"/>
-    <w:next w:val="664"/>
-    <w:link w:val="678"/>
+    <w:basedOn w:val="858"/>
+    <w:next w:val="858"/>
+    <w:link w:val="872"/>
     <w:uiPriority w:val="9"/>
     <w:semiHidden/>
     <w:unhideWhenUsed/>
@@ -31043,11 +31208,11 @@
       <w:szCs w:val="32"/>
     </w:rPr>
   </w:style>
-  <w:style w:type="paragraph" w:styleId="667">
+  <w:style w:type="paragraph" w:styleId="861">
     <w:name w:val="Heading 3"/>
-    <w:basedOn w:val="664"/>
-    <w:next w:val="664"/>
-    <w:link w:val="679"/>
+    <w:basedOn w:val="858"/>
+    <w:next w:val="858"/>
+    <w:link w:val="873"/>
     <w:uiPriority w:val="9"/>
     <w:semiHidden/>
     <w:unhideWhenUsed/>
@@ -31067,11 +31232,11 @@
       <w:szCs w:val="28"/>
     </w:rPr>
   </w:style>
-  <w:style w:type="paragraph" w:styleId="668">
+  <w:style w:type="paragraph" w:styleId="862">
     <w:name w:val="Heading 4"/>
-    <w:basedOn w:val="664"/>
-    <w:next w:val="664"/>
-    <w:link w:val="680"/>
+    <w:basedOn w:val="858"/>
+    <w:next w:val="858"/>
+    <w:link w:val="874"/>
     <w:uiPriority w:val="9"/>
     <w:semiHidden/>
     <w:unhideWhenUsed/>
@@ -31091,11 +31256,11 @@
       <w:color w:val="0f4761" w:themeColor="accent1" w:themeShade="BF"/>
     </w:rPr>
   </w:style>
-  <w:style w:type="paragraph" w:styleId="669">
+  <w:style w:type="paragraph" w:styleId="863">
     <w:name w:val="Heading 5"/>
-    <w:basedOn w:val="664"/>
-    <w:next w:val="664"/>
-    <w:link w:val="681"/>
+    <w:basedOn w:val="858"/>
+    <w:next w:val="858"/>
+    <w:link w:val="875"/>
     <w:uiPriority w:val="9"/>
     <w:semiHidden/>
     <w:unhideWhenUsed/>
@@ -31113,11 +31278,11 @@
       <w:color w:val="0f4761" w:themeColor="accent1" w:themeShade="BF"/>
     </w:rPr>
   </w:style>
-  <w:style w:type="paragraph" w:styleId="670">
+  <w:style w:type="paragraph" w:styleId="864">
     <w:name w:val="Heading 6"/>
-    <w:basedOn w:val="664"/>
-    <w:next w:val="664"/>
-    <w:link w:val="682"/>
+    <w:basedOn w:val="858"/>
+    <w:next w:val="858"/>
+    <w:link w:val="876"/>
     <w:uiPriority w:val="9"/>
     <w:semiHidden/>
     <w:unhideWhenUsed/>
@@ -31137,11 +31302,11 @@
       <w:color w:val="595959" w:themeColor="text1" w:themeTint="A6"/>
     </w:rPr>
   </w:style>
-  <w:style w:type="paragraph" w:styleId="671">
+  <w:style w:type="paragraph" w:styleId="865">
     <w:name w:val="Heading 7"/>
-    <w:basedOn w:val="664"/>
-    <w:next w:val="664"/>
-    <w:link w:val="683"/>
+    <w:basedOn w:val="858"/>
+    <w:next w:val="858"/>
+    <w:link w:val="877"/>
     <w:uiPriority w:val="9"/>
     <w:semiHidden/>
     <w:unhideWhenUsed/>
@@ -31159,11 +31324,11 @@
       <w:color w:val="595959" w:themeColor="text1" w:themeTint="A6"/>
     </w:rPr>
   </w:style>
-  <w:style w:type="paragraph" w:styleId="672">
+  <w:style w:type="paragraph" w:styleId="866">
     <w:name w:val="Heading 8"/>
-    <w:basedOn w:val="664"/>
-    <w:next w:val="664"/>
-    <w:link w:val="684"/>
+    <w:basedOn w:val="858"/>
+    <w:next w:val="858"/>
+    <w:link w:val="878"/>
     <w:uiPriority w:val="9"/>
     <w:semiHidden/>
     <w:unhideWhenUsed/>
@@ -31183,11 +31348,11 @@
       <w:color w:val="272727" w:themeColor="text1" w:themeTint="D8"/>
     </w:rPr>
   </w:style>
-  <w:style w:type="paragraph" w:styleId="673">
+  <w:style w:type="paragraph" w:styleId="867">
     <w:name w:val="Heading 9"/>
-    <w:basedOn w:val="664"/>
-    <w:next w:val="664"/>
-    <w:link w:val="685"/>
+    <w:basedOn w:val="858"/>
+    <w:next w:val="858"/>
+    <w:link w:val="879"/>
     <w:uiPriority w:val="9"/>
     <w:semiHidden/>
     <w:unhideWhenUsed/>
@@ -31205,7 +31370,7 @@
       <w:color w:val="272727" w:themeColor="text1" w:themeTint="D8"/>
     </w:rPr>
   </w:style>
-  <w:style w:type="character" w:styleId="674" w:default="1">
+  <w:style w:type="character" w:styleId="868" w:default="1">
     <w:name w:val="Default Paragraph Font"/>
     <w:uiPriority w:val="1"/>
     <w:semiHidden/>
@@ -31216,7 +31381,7 @@
       <w:ind/>
     </w:pPr>
   </w:style>
-  <w:style w:type="table" w:styleId="675" w:default="1">
+  <w:style w:type="table" w:styleId="869" w:default="1">
     <w:name w:val="Normal Table"/>
     <w:uiPriority w:val="99"/>
     <w:semiHidden/>
@@ -31409,7 +31574,7 @@
       </w:tcPr>
     </w:tblStylePr>
   </w:style>
-  <w:style w:type="numbering" w:styleId="676" w:default="1">
+  <w:style w:type="numbering" w:styleId="870" w:default="1">
     <w:name w:val="No List"/>
     <w:uiPriority w:val="99"/>
     <w:semiHidden/>
@@ -31420,10 +31585,10 @@
       <w:ind/>
     </w:pPr>
   </w:style>
-  <w:style w:type="character" w:styleId="677" w:customStyle="1">
+  <w:style w:type="character" w:styleId="871" w:customStyle="1">
     <w:name w:val="Heading 1 Char"/>
-    <w:basedOn w:val="674"/>
-    <w:link w:val="665"/>
+    <w:basedOn w:val="868"/>
+    <w:link w:val="859"/>
     <w:uiPriority w:val="9"/>
     <w:pPr>
       <w:pBdr/>
@@ -31437,10 +31602,10 @@
       <w:szCs w:val="40"/>
     </w:rPr>
   </w:style>
-  <w:style w:type="character" w:styleId="678" w:customStyle="1">
+  <w:style w:type="character" w:styleId="872" w:customStyle="1">
     <w:name w:val="Heading 2 Char"/>
-    <w:basedOn w:val="674"/>
-    <w:link w:val="666"/>
+    <w:basedOn w:val="868"/>
+    <w:link w:val="860"/>
     <w:uiPriority w:val="9"/>
     <w:semiHidden/>
     <w:pPr>
@@ -31455,10 +31620,10 @@
       <w:szCs w:val="32"/>
     </w:rPr>
   </w:style>
-  <w:style w:type="character" w:styleId="679" w:customStyle="1">
+  <w:style w:type="character" w:styleId="873" w:customStyle="1">
     <w:name w:val="Heading 3 Char"/>
-    <w:basedOn w:val="674"/>
-    <w:link w:val="667"/>
+    <w:basedOn w:val="868"/>
+    <w:link w:val="861"/>
     <w:uiPriority w:val="9"/>
     <w:semiHidden/>
     <w:pPr>
@@ -31473,10 +31638,10 @@
       <w:szCs w:val="28"/>
     </w:rPr>
   </w:style>
-  <w:style w:type="character" w:styleId="680" w:customStyle="1">
+  <w:style w:type="character" w:styleId="874" w:customStyle="1">
     <w:name w:val="Heading 4 Char"/>
-    <w:basedOn w:val="674"/>
-    <w:link w:val="668"/>
+    <w:basedOn w:val="868"/>
+    <w:link w:val="862"/>
     <w:uiPriority w:val="9"/>
     <w:semiHidden/>
     <w:pPr>
@@ -31491,10 +31656,10 @@
       <w:color w:val="0f4761" w:themeColor="accent1" w:themeShade="BF"/>
     </w:rPr>
   </w:style>
-  <w:style w:type="character" w:styleId="681" w:customStyle="1">
+  <w:style w:type="character" w:styleId="875" w:customStyle="1">
     <w:name w:val="Heading 5 Char"/>
-    <w:basedOn w:val="674"/>
-    <w:link w:val="669"/>
+    <w:basedOn w:val="868"/>
+    <w:link w:val="863"/>
     <w:uiPriority w:val="9"/>
     <w:semiHidden/>
     <w:pPr>
@@ -31507,10 +31672,10 @@
       <w:color w:val="0f4761" w:themeColor="accent1" w:themeShade="BF"/>
     </w:rPr>
   </w:style>
-  <w:style w:type="character" w:styleId="682" w:customStyle="1">
+  <w:style w:type="character" w:styleId="876" w:customStyle="1">
     <w:name w:val="Heading 6 Char"/>
-    <w:basedOn w:val="674"/>
-    <w:link w:val="670"/>
+    <w:basedOn w:val="868"/>
+    <w:link w:val="864"/>
     <w:uiPriority w:val="9"/>
     <w:semiHidden/>
     <w:pPr>
@@ -31525,10 +31690,10 @@
       <w:color w:val="595959" w:themeColor="text1" w:themeTint="A6"/>
     </w:rPr>
   </w:style>
-  <w:style w:type="character" w:styleId="683" w:customStyle="1">
+  <w:style w:type="character" w:styleId="877" w:customStyle="1">
     <w:name w:val="Heading 7 Char"/>
-    <w:basedOn w:val="674"/>
-    <w:link w:val="671"/>
+    <w:basedOn w:val="868"/>
+    <w:link w:val="865"/>
     <w:uiPriority w:val="9"/>
     <w:semiHidden/>
     <w:pPr>
@@ -31541,10 +31706,10 @@
       <w:color w:val="595959" w:themeColor="text1" w:themeTint="A6"/>
     </w:rPr>
   </w:style>
-  <w:style w:type="character" w:styleId="684" w:customStyle="1">
+  <w:style w:type="character" w:styleId="878" w:customStyle="1">
     <w:name w:val="Heading 8 Char"/>
-    <w:basedOn w:val="674"/>
-    <w:link w:val="672"/>
+    <w:basedOn w:val="868"/>
+    <w:link w:val="866"/>
     <w:uiPriority w:val="9"/>
     <w:semiHidden/>
     <w:pPr>
@@ -31559,10 +31724,10 @@
       <w:color w:val="272727" w:themeColor="text1" w:themeTint="D8"/>
     </w:rPr>
   </w:style>
-  <w:style w:type="character" w:styleId="685" w:customStyle="1">
+  <w:style w:type="character" w:styleId="879" w:customStyle="1">
     <w:name w:val="Heading 9 Char"/>
-    <w:basedOn w:val="674"/>
-    <w:link w:val="673"/>
+    <w:basedOn w:val="868"/>
+    <w:link w:val="867"/>
     <w:uiPriority w:val="9"/>
     <w:semiHidden/>
     <w:pPr>
@@ -31575,11 +31740,11 @@
       <w:color w:val="272727" w:themeColor="text1" w:themeTint="D8"/>
     </w:rPr>
   </w:style>
-  <w:style w:type="paragraph" w:styleId="686">
+  <w:style w:type="paragraph" w:styleId="880">
     <w:name w:val="Title"/>
-    <w:basedOn w:val="664"/>
-    <w:next w:val="664"/>
-    <w:link w:val="687"/>
+    <w:basedOn w:val="858"/>
+    <w:next w:val="858"/>
+    <w:link w:val="881"/>
     <w:uiPriority w:val="10"/>
     <w:qFormat/>
     <w:pPr>
@@ -31595,10 +31760,10 @@
       <w:szCs w:val="56"/>
     </w:rPr>
   </w:style>
-  <w:style w:type="character" w:styleId="687" w:customStyle="1">
+  <w:style w:type="character" w:styleId="881" w:customStyle="1">
     <w:name w:val="Title Char"/>
-    <w:basedOn w:val="674"/>
-    <w:link w:val="686"/>
+    <w:basedOn w:val="868"/>
+    <w:link w:val="880"/>
     <w:uiPriority w:val="10"/>
     <w:pPr>
       <w:pBdr/>
@@ -31612,11 +31777,11 @@
       <w:szCs w:val="56"/>
     </w:rPr>
   </w:style>
-  <w:style w:type="paragraph" w:styleId="688">
+  <w:style w:type="paragraph" w:styleId="882">
     <w:name w:val="Subtitle"/>
-    <w:basedOn w:val="664"/>
-    <w:next w:val="664"/>
-    <w:link w:val="689"/>
+    <w:basedOn w:val="858"/>
+    <w:next w:val="858"/>
+    <w:link w:val="883"/>
     <w:uiPriority w:val="11"/>
     <w:qFormat/>
     <w:pPr>
@@ -31635,10 +31800,10 @@
       <w:szCs w:val="28"/>
     </w:rPr>
   </w:style>
-  <w:style w:type="character" w:styleId="689" w:customStyle="1">
+  <w:style w:type="character" w:styleId="883" w:customStyle="1">
     <w:name w:val="Subtitle Char"/>
-    <w:basedOn w:val="674"/>
-    <w:link w:val="688"/>
+    <w:basedOn w:val="868"/>
+    <w:link w:val="882"/>
     <w:uiPriority w:val="11"/>
     <w:pPr>
       <w:pBdr/>
@@ -31653,11 +31818,11 @@
       <w:szCs w:val="28"/>
     </w:rPr>
   </w:style>
-  <w:style w:type="paragraph" w:styleId="690">
+  <w:style w:type="paragraph" w:styleId="884">
     <w:name w:val="Quote"/>
-    <w:basedOn w:val="664"/>
-    <w:next w:val="664"/>
-    <w:link w:val="691"/>
+    <w:basedOn w:val="858"/>
+    <w:next w:val="858"/>
+    <w:link w:val="885"/>
     <w:uiPriority w:val="29"/>
     <w:qFormat/>
     <w:pPr>
@@ -31672,10 +31837,10 @@
       <w:color w:val="404040" w:themeColor="text1" w:themeTint="BF"/>
     </w:rPr>
   </w:style>
-  <w:style w:type="character" w:styleId="691" w:customStyle="1">
+  <w:style w:type="character" w:styleId="885" w:customStyle="1">
     <w:name w:val="Quote Char"/>
-    <w:basedOn w:val="674"/>
-    <w:link w:val="690"/>
+    <w:basedOn w:val="868"/>
+    <w:link w:val="884"/>
     <w:uiPriority w:val="29"/>
     <w:pPr>
       <w:pBdr/>
@@ -31688,9 +31853,9 @@
       <w:color w:val="404040" w:themeColor="text1" w:themeTint="BF"/>
     </w:rPr>
   </w:style>
-  <w:style w:type="paragraph" w:styleId="692">
+  <w:style w:type="paragraph" w:styleId="886">
     <w:name w:val="List Paragraph"/>
-    <w:basedOn w:val="664"/>
+    <w:basedOn w:val="858"/>
     <w:uiPriority w:val="34"/>
     <w:qFormat/>
     <w:pPr>
@@ -31700,9 +31865,9 @@
       <w:contextualSpacing w:val="true"/>
     </w:pPr>
   </w:style>
-  <w:style w:type="character" w:styleId="693">
+  <w:style w:type="character" w:styleId="887">
     <w:name w:val="Intense Emphasis"/>
-    <w:basedOn w:val="674"/>
+    <w:basedOn w:val="868"/>
     <w:uiPriority w:val="21"/>
     <w:qFormat/>
     <w:pPr>
@@ -31716,11 +31881,11 @@
       <w:color w:val="0f4761" w:themeColor="accent1" w:themeShade="BF"/>
     </w:rPr>
   </w:style>
-  <w:style w:type="paragraph" w:styleId="694">
+  <w:style w:type="paragraph" w:styleId="888">
     <w:name w:val="Intense Quote"/>
-    <w:basedOn w:val="664"/>
-    <w:next w:val="664"/>
-    <w:link w:val="695"/>
+    <w:basedOn w:val="858"/>
+    <w:next w:val="858"/>
+    <w:link w:val="889"/>
     <w:uiPriority w:val="30"/>
     <w:qFormat/>
     <w:pPr>
@@ -31738,10 +31903,10 @@
       <w:color w:val="0f4761" w:themeColor="accent1" w:themeShade="BF"/>
     </w:rPr>
   </w:style>
-  <w:style w:type="character" w:styleId="695" w:customStyle="1">
+  <w:style w:type="character" w:styleId="889" w:customStyle="1">
     <w:name w:val="Intense Quote Char"/>
-    <w:basedOn w:val="674"/>
-    <w:link w:val="694"/>
+    <w:basedOn w:val="868"/>
+    <w:link w:val="888"/>
     <w:uiPriority w:val="30"/>
     <w:pPr>
       <w:pBdr/>
@@ -31754,9 +31919,9 @@
       <w:color w:val="0f4761" w:themeColor="accent1" w:themeShade="BF"/>
     </w:rPr>
   </w:style>
-  <w:style w:type="character" w:styleId="696">
+  <w:style w:type="character" w:styleId="890">
     <w:name w:val="Intense Reference"/>
-    <w:basedOn w:val="674"/>
+    <w:basedOn w:val="868"/>
     <w:uiPriority w:val="32"/>
     <w:qFormat/>
     <w:pPr>

</xml_diff>

<commit_message>
add slightly modified script for better error information
</commit_message>
<xml_diff>
--- a/churaa1_checkpoint1_s22026.docx
+++ b/churaa1_checkpoint1_s22026.docx
@@ -767,6 +767,8 @@
       <w:r>
         <w:rPr>
           <w:rFonts w:ascii="Arial" w:hAnsi="Arial" w:cs="Arial"/>
+          <w:highlight w:val="none"/>
+          <w:lang w:val="en-US"/>
         </w:rPr>
       </w:r>
       <w:r>
@@ -798,7 +800,7 @@
           <mc:Choice Requires="wpg">
             <w:drawing>
               <wp:inline xmlns:wp="http://schemas.openxmlformats.org/drawingml/2006/wordprocessingDrawing" distT="0" distB="0" distL="0" distR="0">
-                <wp:extent cx="5731510" cy="2091379"/>
+                <wp:extent cx="5731510" cy="2043794"/>
                 <wp:effectExtent l="0" t="0" r="0" b="0"/>
                 <wp:docPr id="6" name=""/>
                 <wp:cNvGraphicFramePr>
@@ -808,7 +810,7 @@
                   <a:graphicData uri="http://schemas.openxmlformats.org/drawingml/2006/picture">
                     <pic:pic xmlns:pic="http://schemas.openxmlformats.org/drawingml/2006/picture">
                       <pic:nvPicPr>
-                        <pic:cNvPr id="1156601596" name=""/>
+                        <pic:cNvPr id="1767708222" name=""/>
                         <pic:cNvPicPr>
                           <a:picLocks noChangeAspect="1"/>
                         </pic:cNvPicPr>
@@ -821,7 +823,7 @@
                       <pic:spPr bwMode="auto">
                         <a:xfrm>
                           <a:off x="0" y="0"/>
-                          <a:ext cx="5731509" cy="2091379"/>
+                          <a:ext cx="5731509" cy="2043794"/>
                         </a:xfrm>
                         <a:prstGeom prst="rect">
                           <a:avLst/>
@@ -854,7 +856,7 @@
                 <v:path o:extrusionok="f" gradientshapeok="t" o:connecttype="rect"/>
                 <o:lock v:ext="edit" aspectratio="t"/>
               </v:shapetype>
-              <v:shape id="_x0000_i5" o:spid="_x0000_s5" type="#_x0000_t75" style="width:451.30pt;height:164.68pt;mso-wrap-distance-left:0.00pt;mso-wrap-distance-top:0.00pt;mso-wrap-distance-right:0.00pt;mso-wrap-distance-bottom:0.00pt;z-index:1;" stroked="false">
+              <v:shape id="_x0000_i5" o:spid="_x0000_s5" type="#_x0000_t75" style="width:451.30pt;height:160.93pt;mso-wrap-distance-left:0.00pt;mso-wrap-distance-top:0.00pt;mso-wrap-distance-right:0.00pt;mso-wrap-distance-bottom:0.00pt;z-index:1;" stroked="false">
                 <v:imagedata r:id="rId13" o:title=""/>
                 <o:lock v:ext="edit" rotation="t"/>
               </v:shape>
@@ -867,6 +869,12 @@
           <w:rFonts w:ascii="Arial" w:hAnsi="Arial" w:cs="Arial"/>
           <w:highlight w:val="none"/>
           <w:lang w:val="en-US"/>
+        </w:rPr>
+      </w:r>
+      <w:r/>
+      <w:r>
+        <w:rPr>
+          <w:rFonts w:ascii="Arial" w:hAnsi="Arial" w:cs="Arial"/>
         </w:rPr>
       </w:r>
       <w:r>
@@ -901,21 +909,21 @@
           <w:rFonts w:ascii="Arial" w:hAnsi="Arial" w:cs="Arial"/>
         </w:rPr>
       </w:r>
-    </w:p>
-    <w:p>
-      <w:pPr>
-        <w:pBdr/>
-        <w:spacing/>
-        <w:ind/>
-        <w:rPr>
-          <w:rFonts w:ascii="Arial" w:hAnsi="Arial" w:cs="Arial"/>
-        </w:rPr>
-      </w:pPr>
       <w:r>
         <w:rPr>
           <w:rFonts w:ascii="Arial" w:hAnsi="Arial" w:cs="Arial"/>
         </w:rPr>
       </w:r>
+    </w:p>
+    <w:p>
+      <w:pPr>
+        <w:pBdr/>
+        <w:spacing/>
+        <w:ind/>
+        <w:rPr>
+          <w:rFonts w:ascii="Arial" w:hAnsi="Arial" w:cs="Arial"/>
+        </w:rPr>
+      </w:pPr>
       <w:r>
         <w:rPr>
           <w:rFonts w:ascii="Arial" w:hAnsi="Arial" w:cs="Arial"/>
@@ -926,7 +934,7 @@
           <mc:Choice Requires="wpg">
             <w:drawing>
               <wp:inline xmlns:wp="http://schemas.openxmlformats.org/drawingml/2006/wordprocessingDrawing" distT="0" distB="0" distL="0" distR="0">
-                <wp:extent cx="5731510" cy="1391601"/>
+                <wp:extent cx="5731510" cy="2309885"/>
                 <wp:effectExtent l="0" t="0" r="0" b="0"/>
                 <wp:docPr id="7" name=""/>
                 <wp:cNvGraphicFramePr>
@@ -936,7 +944,7 @@
                   <a:graphicData uri="http://schemas.openxmlformats.org/drawingml/2006/picture">
                     <pic:pic xmlns:pic="http://schemas.openxmlformats.org/drawingml/2006/picture">
                       <pic:nvPicPr>
-                        <pic:cNvPr id="1674246120" name=""/>
+                        <pic:cNvPr id="553961804" name=""/>
                         <pic:cNvPicPr>
                           <a:picLocks noChangeAspect="1"/>
                         </pic:cNvPicPr>
@@ -949,7 +957,7 @@
                       <pic:spPr bwMode="auto">
                         <a:xfrm>
                           <a:off x="0" y="0"/>
-                          <a:ext cx="5731509" cy="1391600"/>
+                          <a:ext cx="5731509" cy="2309884"/>
                         </a:xfrm>
                         <a:prstGeom prst="rect">
                           <a:avLst/>
@@ -982,7 +990,7 @@
                 <v:path o:extrusionok="f" gradientshapeok="t" o:connecttype="rect"/>
                 <o:lock v:ext="edit" aspectratio="t"/>
               </v:shapetype>
-              <v:shape id="_x0000_i6" o:spid="_x0000_s6" type="#_x0000_t75" style="width:451.30pt;height:109.57pt;mso-wrap-distance-left:0.00pt;mso-wrap-distance-top:0.00pt;mso-wrap-distance-right:0.00pt;mso-wrap-distance-bottom:0.00pt;z-index:1;" stroked="false">
+              <v:shape id="_x0000_i6" o:spid="_x0000_s6" type="#_x0000_t75" style="width:451.30pt;height:181.88pt;mso-wrap-distance-left:0.00pt;mso-wrap-distance-top:0.00pt;mso-wrap-distance-right:0.00pt;mso-wrap-distance-bottom:0.00pt;z-index:1;" stroked="false">
                 <v:imagedata r:id="rId14" o:title=""/>
                 <o:lock v:ext="edit" rotation="t"/>
               </v:shape>
@@ -990,6 +998,12 @@
           </mc:Fallback>
         </mc:AlternateContent>
       </w:r>
+      <w:r>
+        <w:rPr>
+          <w:rFonts w:ascii="Arial" w:hAnsi="Arial" w:cs="Arial"/>
+        </w:rPr>
+      </w:r>
+      <w:r/>
       <w:r>
         <w:rPr>
           <w:rFonts w:ascii="Arial" w:hAnsi="Arial" w:cs="Arial"/>

</xml_diff>

<commit_message>
adjustment to docx not saved uploaded
</commit_message>
<xml_diff>
--- a/churaa1_checkpoint1_s22026.docx
+++ b/churaa1_checkpoint1_s22026.docx
@@ -1027,6 +1027,84 @@
       <w:r>
         <w:rPr>
           <w:rFonts w:ascii="Arial" w:hAnsi="Arial" w:cs="Arial"/>
+          <w:lang w:val="en-US"/>
+        </w:rPr>
+        <w:t xml:space="preserve">After deliberate error:</w:t>
+        <w:br/>
+      </w:r>
+      <w:r>
+        <mc:AlternateContent>
+          <mc:Choice Requires="wpg">
+            <w:drawing>
+              <wp:inline xmlns:wp="http://schemas.openxmlformats.org/drawingml/2006/wordprocessingDrawing" distT="0" distB="0" distL="0" distR="0">
+                <wp:extent cx="5162550" cy="1676400"/>
+                <wp:effectExtent l="0" t="0" r="0" b="0"/>
+                <wp:docPr id="8" name=""/>
+                <wp:cNvGraphicFramePr>
+                  <a:graphicFrameLocks xmlns:a="http://schemas.openxmlformats.org/drawingml/2006/main" noChangeAspect="1"/>
+                </wp:cNvGraphicFramePr>
+                <a:graphic xmlns:a="http://schemas.openxmlformats.org/drawingml/2006/main">
+                  <a:graphicData uri="http://schemas.openxmlformats.org/drawingml/2006/picture">
+                    <pic:pic xmlns:pic="http://schemas.openxmlformats.org/drawingml/2006/picture">
+                      <pic:nvPicPr>
+                        <pic:cNvPr id="1389590106" name=""/>
+                        <pic:cNvPicPr>
+                          <a:picLocks noChangeAspect="1"/>
+                        </pic:cNvPicPr>
+                        <pic:nvPr/>
+                      </pic:nvPicPr>
+                      <pic:blipFill rotWithShape="1">
+                        <a:blip r:embed="rId15"/>
+                        <a:stretch/>
+                      </pic:blipFill>
+                      <pic:spPr bwMode="auto">
+                        <a:xfrm>
+                          <a:off x="0" y="0"/>
+                          <a:ext cx="5162549" cy="1676399"/>
+                        </a:xfrm>
+                        <a:prstGeom prst="rect">
+                          <a:avLst/>
+                        </a:prstGeom>
+                      </pic:spPr>
+                    </pic:pic>
+                  </a:graphicData>
+                </a:graphic>
+              </wp:inline>
+            </w:drawing>
+          </mc:Choice>
+          <mc:Fallback>
+            <w:pict>
+              <v:shapetype id="_x0000_t75" coordsize="21600,21600" o:spt="75" o:preferrelative="t" path="m@4@5l@4@11@9@11@9@5xe" filled="f" stroked="f">
+                <v:stroke joinstyle="miter"/>
+                <v:formulas>
+                  <v:f eqn="if lineDrawn pixelLineWidth 0"/>
+                  <v:f eqn="sum @0 1 0"/>
+                  <v:f eqn="sum 0 0 @1"/>
+                  <v:f eqn="prod @2 1 2"/>
+                  <v:f eqn="prod @3 21600 pixelWidth"/>
+                  <v:f eqn="prod @3 21600 pixelHeight"/>
+                  <v:f eqn="sum @0 0 1"/>
+                  <v:f eqn="prod @6 1 2"/>
+                  <v:f eqn="prod @7 21600 pixelWidth"/>
+                  <v:f eqn="sum @8 21600 0"/>
+                  <v:f eqn="prod @7 21600 pixelHeight"/>
+                  <v:f eqn="sum @10 21600 0"/>
+                </v:formulas>
+                <v:path o:extrusionok="f" gradientshapeok="t" o:connecttype="rect"/>
+                <o:lock v:ext="edit" aspectratio="t"/>
+              </v:shapetype>
+              <v:shape id="_x0000_i7" o:spid="_x0000_s7" type="#_x0000_t75" style="width:406.50pt;height:132.00pt;mso-wrap-distance-left:0.00pt;mso-wrap-distance-top:0.00pt;mso-wrap-distance-right:0.00pt;mso-wrap-distance-bottom:0.00pt;z-index:1;" stroked="false">
+                <v:imagedata r:id="rId15" o:title=""/>
+                <o:lock v:ext="edit" rotation="t"/>
+              </v:shape>
+            </w:pict>
+          </mc:Fallback>
+        </mc:AlternateContent>
+      </w:r>
+      <w:r>
+        <w:rPr>
+          <w:rFonts w:ascii="Arial" w:hAnsi="Arial" w:cs="Arial"/>
+          <w:lang w:val="en-US"/>
         </w:rPr>
       </w:r>
       <w:r>

</xml_diff>